<commit_message>
Address external review: corpus counts (202), citation attributions, venue, deployment hedging; add camera-ready notes
</commit_message>
<xml_diff>
--- a/AGENT_FAIRNESS_SURVEY.docx
+++ b/AGENT_FAIRNESS_SURVEY.docx
@@ -107,7 +107,7 @@
         <w:t>conduction operator</w:t>
       </w:r>
       <w:r>
-        <w:t xml:space="preserve"> (how disparity transforms across each pipeline edge: ATTENUATE, PRESERVE, AMPLIFY, or GENERATE). Together these yield a conduction equation that predicts trajectory-level disparity from component-level measurements. This framework converts a component taxonomy into a testable formal theory: five propositions characterize locality (P1), masking (P2, the measurement gap as a theorem), super-additivity (P3, the agentic multiplier), mitigation matching (P4), and measurement adequacy (P5). Grounded in a verified corpus of 201 papers spanning 2017 to 2026, the survey maps the literature onto the BCF locus x operator grid, delivers trajectory-level and action-level disparity metrics (tool-invocation, escalation, and plan-allocation disparity) formalized as instances of the BCF's component counterfactual disparity Δ_c, constructs a mitigation map relating each intervention family to the pipeline component and operator it addresses, and specifies a protocol for an executable cross-framework bias audit with a "Results (pending)" placeholder awaiting execution. We further characterize a structural </w:t>
+        <w:t xml:space="preserve"> (how disparity transforms across each pipeline edge: ATTENUATE, PRESERVE, AMPLIFY, or GENERATE). Together these yield a conduction equation that predicts trajectory-level disparity from component-level measurements. This framework converts a component taxonomy into a testable formal theory: five propositions characterize locality (P1), masking (P2, the measurement gap as a theorem), super-additivity (P3, the agentic multiplier), mitigation matching (P4), and measurement adequacy (P5). Grounded in a verified corpus of 202 papers spanning 2017 to 2026, the survey maps the literature onto the BCF locus x operator grid, delivers trajectory-level and action-level disparity metrics (tool-invocation, escalation, and plan-allocation disparity) formalized as instances of the BCF's component counterfactual disparity Δ_c, constructs a mitigation map relating each intervention family to the pipeline component and operator it addresses, and specifies a protocol for an executable cross-framework bias audit with a "Results (pending)" placeholder awaiting execution. We further characterize a structural </w:t>
       </w:r>
       <w:r>
         <w:rPr>
@@ -215,7 +215,7 @@
         <w:t>fairness in an LLM agent cannot be captured by a single model-level metric; it must be analyzed per agent component</w:t>
       </w:r>
       <w:r>
-        <w:t xml:space="preserve">, because bias enters at distinct, separately-measurable, and separately-mitigable points in the pipeline and is transformed (attenuated, preserved, amplified, or generated from zero) at each edge. A model that is near-parity on a question-answering bias benchmark can still select tools unevenly across demographic framings [blankenstein2025biasbusters], inherit unfairness from a retrieval step the base model alone never exhibited [wu2024rag, hu2024free], acquire bias from an assigned persona or role [gupta2023bias, cao2026from], or drift toward sycophantic, identity-conforming behavior over a long dialogue [liu2025truth, ma2026implicit]. Crucially, </w:t>
+        <w:t xml:space="preserve">, because bias enters at distinct, separately-measurable, and separately-mitigable points in the pipeline and is transformed (attenuated, preserved, amplified, or generated from zero) at each edge. A model that is near-parity on a question-answering bias benchmark can still exhibit systematic tool-selection bias that no answer-level metric detects [blankenstein2025biasbusters], inherit unfairness from a retrieval step the base model alone never exhibited [wu2024rag, hu2024free], acquire bias from an assigned persona or role [gupta2023bias, cao2026from], or drift toward sycophantic, identity-conforming behavior over a long dialogue [liu2025truth, ma2026implicit]. Crucially, </w:t>
       </w:r>
       <w:r>
         <w:rPr>
@@ -313,7 +313,7 @@
         <w:t>Contribution 4: A protocol for an executable cross-framework bias audit.</w:t>
       </w:r>
       <w:r>
-        <w:t xml:space="preserve"> We specify a protocol (§6) for an original cross-framework bias audit: multiple agent configurations run on a consequential-decision task with counterfactual demographic swaps, exposing component-level action disparity that QA-level scoring of the same underlying model fails to register. </w:t>
+        <w:t xml:space="preserve"> We specify a protocol (§6) for an original cross-framework bias audit: multiple agent configurations run on a consequential-decision task with counterfactual demographic swaps, designed to surface any component-level action disparity that QA-level scoring of the same underlying model would not register. </w:t>
       </w:r>
       <w:r>
         <w:rPr>
@@ -370,7 +370,7 @@
         <w:t>Fairness in Large Language Models: A Taxonomic Survey</w:t>
       </w:r>
       <w:r>
-        <w:t xml:space="preserve"> [chu2024fairness], published in this venue, taxonomizes bias in LLMs that </w:t>
+        <w:t xml:space="preserve"> [chu2024fairness], a closely related ACM survey-style article (ACM SIGKDD Explorations), taxonomizes bias in LLMs that </w:t>
       </w:r>
       <w:r>
         <w:rPr>
@@ -541,7 +541,7 @@
         <w:t>Corpus note.</w:t>
       </w:r>
       <w:r>
-        <w:t xml:space="preserve"> This survey covers 201 verified papers. Approximately 140 of those papers are not covered by either [gallegos2024bias] or [chu2024fairness], reflecting the rapid growth of agentic fairness work in 2024 to 2026. The 61% of the corpus published in 2024 or later confirms that the subfield is emergent rather than mature, a temporal trend analyzed in §2.6.</w:t>
+        <w:t xml:space="preserve"> This survey covers 202 verified papers. Approximately 140 of those papers are not covered by either [gallegos2024bias] or [chu2024fairness], reflecting the rapid growth of agentic fairness work in 2024 to 2026. The 61% of the corpus published in 2024 or later confirms that the subfield is emergent rather than mature, a temporal trend analyzed in §2.6.</w:t>
       </w:r>
     </w:p>
     <w:p>
@@ -1872,7 +1872,7 @@
         <w:rPr>
           <w:i/>
         </w:rPr>
-        <w:t>Note: approximately 140 of the 201 papers in this corpus are not covered by [gallegos2024bias] or [chu2024fairness].</w:t>
+        <w:t>Note: approximately 140 of the 202 papers in this corpus are not covered by [gallegos2024bias] or [chu2024fairness].</w:t>
       </w:r>
     </w:p>
     <w:p>
@@ -3670,7 +3670,7 @@
         <w:t>Stage 4: Inclusion (n = 201).</w:t>
       </w:r>
       <w:r>
-        <w:t xml:space="preserve"> Full-text review confirmed inclusion criteria and assigned branch tags. Records excluded at this stage failed criterion (iii), typically single-turn generation studies with no agentic framing, or were superseded by a more recent version of the same work. The final corpus comprises 201 unique papers spanning 2015 to 2026.</w:t>
+        <w:t xml:space="preserve"> Full-text review confirmed inclusion criteria and assigned branch tags. Records excluded at this stage failed criterion (iii), typically single-turn generation studies with no agentic framing, or were superseded by a more recent version of the same work. The final corpus comprises 202 unique papers spanning 2015 to 2026.</w:t>
       </w:r>
     </w:p>
     <w:p>
@@ -3687,7 +3687,7 @@
         <w:rPr>
           <w:i/>
         </w:rPr>
-        <w:t>Takeaway: the corpus construction is transparent and reproducible; the 201 included papers represent systematic coverage rather than convenience selection.</w:t>
+        <w:t>Takeaway: the corpus construction is transparent and reproducible; the 202 included papers represent systematic coverage rather than convenience selection.</w:t>
       </w:r>
     </w:p>
     <w:p>
@@ -3988,7 +3988,7 @@
     </w:p>
     <w:p>
       <w:r>
-        <w:t xml:space="preserve">The agent fairness literature is a recent and rapidly growing subfield. Of the 201 corpus papers, </w:t>
+        <w:t xml:space="preserve">The agent fairness literature is a recent and rapidly growing subfield. Of the 202 corpus papers, </w:t>
       </w:r>
       <w:r>
         <w:rPr>
@@ -12928,7 +12928,7 @@
     </w:p>
     <w:p>
       <w:r>
-        <w:t>This section projects the 201-paper corpus onto its two organizing axes simultaneously: the six agent-pipeline components and the four fairness dimensions (group, individual, counterfactual, and unspecified). The projection is Figure 2 (the coverage matrix) and its companion, Figure 3 (the locus × BCF-operator grid). Read together, they convert the survey's central claim (that the field is well-instrumented where measurement is easy and under-instrumented where agentic deployment makes fairness consequential) from an assertion into a structured, falsifiable coordinate.</w:t>
+        <w:t>This section projects the 202-paper corpus onto its two organizing axes simultaneously: the six agent-pipeline components and the four fairness dimensions (group, individual, counterfactual, and unspecified). The projection is Figure 2 (the coverage matrix) and its companion, Figure 3 (the locus × BCF-operator grid). Read together, they convert the survey's central claim (that the field is well-instrumented where measurement is easy and under-instrumented where agentic deployment makes fairness consequential) from an assertion into a structured, falsifiable coordinate.</w:t>
       </w:r>
     </w:p>
     <w:p>
@@ -12945,7 +12945,7 @@
         <w:rPr>
           <w:b/>
         </w:rPr>
-        <w:t>201 unique papers</w:t>
+        <w:t>202 unique papers</w:t>
       </w:r>
       <w:r>
         <w:t xml:space="preserve">. Of these, </w:t>
@@ -12954,7 +12954,7 @@
         <w:rPr>
           <w:b/>
         </w:rPr>
-        <w:t>57 papers</w:t>
+        <w:t>59 papers</w:t>
       </w:r>
       <w:r>
         <w:t xml:space="preserve"> are tagged to at least one of the six agent-pipeline component branches in </w:t>
@@ -12967,7 +12967,7 @@
         <w:t>corpus_master.md</w:t>
       </w:r>
       <w:r>
-        <w:t xml:space="preserve">. Because a single paper may address more than one component (e.g., a study of RAG-induced bias in a multi-agent pipeline is tagged to both memory-retrieval and multi-agent delegation), the 57 unique component-tagged papers generate </w:t>
+        <w:t xml:space="preserve">. Because a single paper may address more than one component (e.g., a study of RAG-induced bias in a multi-agent pipeline is tagged to both memory-retrieval and multi-agent delegation), the 59 unique component-tagged papers generate </w:t>
       </w:r>
       <w:r>
         <w:rPr>
@@ -12976,7 +12976,7 @@
         <w:t>68 component-branch entries</w:t>
       </w:r>
       <w:r>
-        <w:t xml:space="preserve"> across the coverage matrix, more entries than papers. All counts in the narrative below follow this multi-tag convention. The remaining 144 papers (foundations, llm-agents-general, evaluation-metrics-benchmarks, mitigation, high-stakes-domains, and prior-art-additions branches) are covered in §§2-5 as contextual and cross-cutting evidence; they inform the taxonomy but do not appear in the six-component rows of Figure 2.</w:t>
+        <w:t xml:space="preserve"> across the coverage matrix, more entries than papers. All counts in the narrative below follow this multi-tag convention. The remaining 143 papers (foundations, llm-agents-general, evaluation-metrics-benchmarks, mitigation, high-stakes-domains, and prior-art-additions branches) are covered in §§2-5 as contextual and cross-cutting evidence; they inform the taxonomy but do not appear in the six-component rows of Figure 2.</w:t>
       </w:r>
     </w:p>
     <w:p>
@@ -14108,7 +14108,7 @@
     </w:p>
     <w:p>
       <w:r>
-        <w:t>The measurement gap documented by this survey is a gap in accountability infrastructure, not in tooling alone. Agents are deployed in hiring [veldanda2023emily, wilson2024gender, nghiem2024you], clinical decision support [poulain2024bias, omar2025sociodemographic], lending [bowen2024measuring, feng2023empowering], and education [weissburg2024llms], subject to regulatory requirements (EU AI Act [parliament2024regulation], NIST AI RMF [nist2023artificial], NYC Local Law 144, EEOC disparate-impact guidance) that no current acting-agent fairness benchmark is equipped to satisfy. The long-term fairness risks are compounding: feedback recurrence documented by [wyllie2024fairness] and [wang2026observations], memory accumulation characterized by [ma2026implicit], and the sequential fairness theory of [hu2022achieving] and [xu2024adapting] collectively predict that systems fair at any single step can drive divergent cumulative outcomes across groups over deployment cycles.</w:t>
+        <w:t>The measurement gap documented by this survey is a gap in accountability infrastructure, not in tooling alone. LLMs and LLM-based agents are being deployed, piloted, and evaluated in consequential decision settings, including hiring [veldanda2023emily, wilson2024gender, nghiem2024you], clinical decision support [poulain2024bias, omar2025sociodemographic], lending [bowen2024measuring, feng2023empowering], and education [weissburg2024llms] (much of the cited evidence is audit or evaluation in these settings rather than confirmed operational deployment), subject to regulatory requirements (EU AI Act [parliament2024regulation], NIST AI RMF [nist2023artificial], NYC Local Law 144, EEOC disparate-impact guidance) that no current acting-agent fairness benchmark is equipped to satisfy. The long-term fairness risks are compounding: feedback recurrence documented by [wyllie2024fairness] and [wang2026observations], memory accumulation characterized by [ma2026implicit], and the sequential fairness theory of [hu2022achieving] and [xu2024adapting] collectively predict that systems fair at any single step can drive divergent cumulative outcomes across groups over deployment cycles.</w:t>
       </w:r>
     </w:p>
     <w:p>
@@ -14183,7 +14183,7 @@
     </w:p>
     <w:p>
       <w:r>
-        <w:t>The 201-paper corpus was assembled from English-language academic venues (arXiv, ACL Anthology, ACM DL, NeurIPS/ICML/ICLR, FAccT, Nature), all of which have geographic and linguistic concentrations in the United States and Western Europe. Several structural biases follow from this:</w:t>
+        <w:t>The 202-paper corpus was assembled from English-language academic venues (arXiv, ACL Anthology, ACM DL, NeurIPS/ICML/ICLR, FAccT, Nature), all of which have geographic and linguistic concentrations in the United States and Western Europe. Several structural biases follow from this:</w:t>
       </w:r>
     </w:p>
     <w:p>

</xml_diff>

<commit_message>
Restore missing Section 6; tighten BCF formalism (signed disparity, P1/P3/P5 scope, locus-to-D1 mapping); attribution + Table fixes; refresh PDF/DOCX (58pp)
</commit_message>
<xml_diff>
--- a/AGENT_FAIRNESS_SURVEY.docx
+++ b/AGENT_FAIRNESS_SURVEY.docx
@@ -107,7 +107,7 @@
         <w:t>conduction operator</w:t>
       </w:r>
       <w:r>
-        <w:t xml:space="preserve"> (how disparity transforms across each pipeline edge: ATTENUATE, PRESERVE, AMPLIFY, or GENERATE). Together these yield a conduction equation that predicts trajectory-level disparity from component-level measurements. This framework converts a component taxonomy into a testable formal theory: five propositions characterize locality (P1), masking (P2, the measurement gap as a theorem), super-additivity (P3, the agentic multiplier), mitigation matching (P4), and measurement adequacy (P5). Grounded in a verified corpus of 202 papers spanning 2017 to 2026, the survey maps the literature onto the BCF locus x operator grid, delivers trajectory-level and action-level disparity metrics (tool-invocation, escalation, and plan-allocation disparity) formalized as instances of the BCF's component counterfactual disparity Δ_c, constructs a mitigation map relating each intervention family to the pipeline component and operator it addresses, and specifies a protocol for an executable cross-framework bias audit with a "Results (pending)" placeholder awaiting execution. We further characterize a structural </w:t>
+        <w:t xml:space="preserve"> (how disparity transforms across each pipeline edge: ATTENUATE, PRESERVE, AMPLIFY, or GENERATE). Together these yield a conduction equation that predicts trajectory-level disparity from component-level measurements. This framework converts a component taxonomy into a testable formal theory: five propositions, stated under the linearized BCF model, characterize locality (P1), masking (P2, the measurement gap), super-additivity (P3, the agentic multiplier), mitigation matching (P4), and measurement adequacy (P5). Grounded in a verified corpus of 202 papers spanning 2017 to 2026, the survey maps the literature onto the BCF locus x operator grid, delivers trajectory-level and action-level disparity metrics (tool-invocation, escalation, and plan-allocation disparity) formalized as instances of the BCF's component counterfactual disparity Δ_c, constructs a mitigation map relating each intervention family to the pipeline component and operator it addresses, and specifies a protocol for an executable cross-framework bias audit with a "Results (pending)" placeholder awaiting execution. We further characterize a structural </w:t>
       </w:r>
       <w:r>
         <w:rPr>
@@ -116,7 +116,7 @@
         <w:t>measurement gap</w:t>
       </w:r>
       <w:r>
-        <w:t>: today's benchmarks grade answers, not actions; Table 2's survey of all available benchmarks contains no row with "yes" in the agentic column.</w:t>
+        <w:t>: today's benchmarks grade answers, not actions; as Table 2 shows, no general-purpose benchmark provides demographically instrumented, full-trajectory agent evaluation.</w:t>
       </w:r>
     </w:p>
     <w:p>
@@ -313,7 +313,7 @@
         <w:t>Contribution 4: A protocol for an executable cross-framework bias audit.</w:t>
       </w:r>
       <w:r>
-        <w:t xml:space="preserve"> We specify a protocol (§6) for an original cross-framework bias audit: multiple agent configurations run on a consequential-decision task with counterfactual demographic swaps, designed to surface any component-level action disparity that QA-level scoring of the same underlying model would not register. </w:t>
+        <w:t xml:space="preserve"> We specify a protocol (§6) for an original cross-framework bias audit: multiple agent configurations run on a consequential-decision task with counterfactual demographic swaps, designed to test whether component-level action disparity arises that QA-level scoring of the same underlying model would not register. </w:t>
       </w:r>
       <w:r>
         <w:rPr>
@@ -455,7 +455,7 @@
         <w:t>Vatsal et al. 2026</w:t>
       </w:r>
       <w:r>
-        <w:t xml:space="preserve"> [vatsal2026agentic]: fairness is one of seven dimensions in a conceptual, single-domain (healthcare) framework; no component-level counterfactual, no corpus.</w:t>
+        <w:t xml:space="preserve"> [vatsal2026agentic]: a clinical-agent evaluation taxonomy whose seven dimensions include a Safety &amp; Ethics dimension under which fairness sits; conceptual and single-domain (healthcare), with no component-level counterfactual and no corpus.</w:t>
       </w:r>
     </w:p>
     <w:p>
@@ -483,7 +483,7 @@
         <w:t>Ranjan et al. 2025</w:t>
       </w:r>
       <w:r>
-        <w:t xml:space="preserve"> [ranjan2025fairness]: 12-page position paper titled similarly but addressing classical multi-agent systems (not LLM agents), no component taxonomy, no empirical corpus.</w:t>
+        <w:t xml:space="preserve"> [ranjan2025fairness]: a 12-page position paper on fairness in agentic/multi-agent AI broadly, not specific to LLM-agent components; no component taxonomy, no empirical corpus.</w:t>
       </w:r>
     </w:p>
     <w:p>
@@ -1476,7 +1476,7 @@
           </w:tcPr>
           <w:p>
             <w:r>
-              <w:t>Partial (1 of 7)</w:t>
+              <w:t>Partial (subdim. of Safety \&amp; Ethics)</w:t>
             </w:r>
           </w:p>
         </w:tc>
@@ -4498,7 +4498,7 @@
         <w:t>not</w:t>
       </w:r>
       <w:r>
-        <w:t xml:space="preserve"> organize: [mohammadi2025evaluation] treats fairness as one sub-topic of a broad agent-evaluation survey; [vatsal2026agentic] as one of seven conceptual dimensions in a single (clinical) domain; [mayilvaghanan2026counterfactual] as a single-domain counterfactual method (contact-center QA) whose CFR/MASD machinery we generalize across components in §4; [ranjan2025fairness] proposes a unified fairness framework for classical multi-agent systems without an LLM-component axis; and [binkyte2025interactional] formalizes only the interactional slice of multi-agent fairness. None pairs an entry-locus decomposition with an account of how disparity </w:t>
+        <w:t xml:space="preserve"> organize: [mohammadi2025evaluation] treats fairness as one sub-topic of a broad agent-evaluation survey; [vatsal2026agentic] as a subdimension of a seven-dimensional conceptual taxonomy in a single (clinical) domain; [mayilvaghanan2026counterfactual] as a single-domain counterfactual method (contact-center QA) whose CFR/MASD machinery we generalize across components in §4; [ranjan2025fairness] proposes a unified fairness framework for multi-agent AI broadly, without an LLM-component axis; and [binkyte2025interactional] formalizes only the interactional slice of multi-agent fairness. None pairs an entry-locus decomposition with an account of how disparity </w:t>
       </w:r>
       <w:r>
         <w:rPr>
@@ -5183,7 +5183,16 @@
     </w:p>
     <w:p>
       <w:r>
-        <w:t xml:space="preserve">Treating disparities as small and edges as locally multiplicative (a first-order approximation), the trajectory disparity decomposes as the </w:t>
+        <w:t xml:space="preserve">Treating disparities as small and edges as locally multiplicative (a first-order approximation), and taking Δ_c and Δ_τ here as </w:t>
+      </w:r>
+      <w:r>
+        <w:rPr>
+          <w:i/>
+        </w:rPr>
+        <w:t>signed</w:t>
+      </w:r>
+      <w:r>
+        <w:t xml:space="preserve"> (directional) disparities so that oppositely directed component contributions can cancel in the sum (the endpoint statistics CFR and MASD of §4.2 report the corresponding magnitudes |Δ|), the trajectory disparity decomposes as the </w:t>
       </w:r>
       <w:r>
         <w:rPr>
@@ -5284,10 +5293,10 @@
         <w:rPr>
           <w:i/>
         </w:rPr>
-        <w:t>Every measurable trajectory disparity decomposes into component entries: Δ_τ &gt; 0 implies Δ_c &gt; 0 for at least one locus c (counting GENERATE edges as entries).</w:t>
-      </w:r>
-      <w:r>
-        <w:t xml:space="preserve"> Justification: this is the premise validated whenever decomposition succeeds. [xu2026ducx] attributes distinct, separable shares of a clinical agent's disparity to the tool-invocation stage versus the model, and the component-specific audits surveyed in §§3.1 to 3.5 each isolate a nonzero Δ_c with other components held fixed.</w:t>
+        <w:t>Every measurable trajectory disparity decomposes into component entries plus an interaction residual: Δ_τ ≠ 0 implies a nonzero Δ_c at some locus c (counting GENERATE edges as entries), or a nonzero cross-component interaction term that the linearized equation folds into the nearest downstream GENERATE edge.</w:t>
+      </w:r>
+      <w:r>
+        <w:t xml:space="preserve"> The residual matters because pure interaction effects (disparity present in no component alone but produced by their composition) are exactly the multi-agent GENERATE phenomenon. Justification: this is the premise validated whenever decomposition succeeds. [xu2026ducx] attributes distinct, separable shares of a clinical agent's disparity to the tool-invocation stage versus the model, and the component-specific audits surveyed in §§3.1 to 3.5 each isolate a nonzero Δ_c with other components held fixed.</w:t>
       </w:r>
     </w:p>
     <w:p>
@@ -5333,7 +5342,7 @@
         <w:rPr>
           <w:i/>
         </w:rPr>
-        <w:t>Δ_τ exceeds the naive sum Σ_c Δ_c if and only if at least one AMPLIFY or GENERATE edge lies on a conduction path; with only PRESERVE/ATTENUATE edges, composition is sub-additive and component audits compose into a conservative system bound.</w:t>
+        <w:t>Δ_τ can exceed the naive sum Σ_c |Δ_c| when at least one AMPLIFY or GENERATE edge lies on a conduction path. This is a sufficient condition under the linearized model: an AMPLIFY/GENERATE edge can be offset by a downstream ATTENUATE edge, and nonlinear cross-component interactions can produce super-additivity even without one; conversely, with only PRESERVE/ATTENUATE edges and no interaction term, composition is sub-additive and component audits compose into a conservative system bound.</w:t>
       </w:r>
       <w:r>
         <w:t xml:space="preserve"> Justification: within the multi-agent locus this is directly evidenced. Stereotypical bias emerges, propagates, and is amplified across interacting agents, making the collective more biased than its members [nguyen2025social], and group-level fairness is emergent rather than inherited [madigan2025emergent]. §3.7 develops P3 and marks its cross-component generalization as conjecture.</w:t>
@@ -5382,10 +5391,46 @@
         <w:rPr>
           <w:i/>
         </w:rPr>
-        <w:t>An evaluation is adequate for an agent only if it can identify every Δ_c: it must observe component-level inputs and outputs (trace-level instrumentation with counterfactual replay), not endpoints alone; by P2, endpoint-only metrics are systematically unsound, and by P3, they are not even conservative.</w:t>
-      </w:r>
-      <w:r>
-        <w:t xml:space="preserve"> Justification: models that pass single-turn fairness tests fail multi-turn ones [fan2024fairmt]; the measured bias depends on which demographic cue channel is perturbed [tonneau2026different]; and the major agent benchmarks (WebArena [zhou2024webarena], AgentBench [liu2024agentbench], Mind2Web [deng2023mind2web], SWE-bench [jimenez2024swe]) log exactly the traces P5 requires but carry no demographic counterfactual instrumentation, a confrontation developed in §4.4.</w:t>
+        <w:t>Endpoint-only evaluation is systematically unsound (by P2) and not even conservative (by P3); adequacy therefore comes in tiers.</w:t>
+      </w:r>
+      <w:r>
+        <w:t xml:space="preserve"> We distinguish four: </w:t>
+      </w:r>
+      <w:r>
+        <w:rPr>
+          <w:i/>
+        </w:rPr>
+        <w:t>endpoint-only</w:t>
+      </w:r>
+      <w:r>
+        <w:t xml:space="preserve"> (inadequate); </w:t>
+      </w:r>
+      <w:r>
+        <w:rPr>
+          <w:i/>
+        </w:rPr>
+        <w:t>trace-observing</w:t>
+      </w:r>
+      <w:r>
+        <w:t xml:space="preserve"> (logs actions but applies no counterfactual); </w:t>
+      </w:r>
+      <w:r>
+        <w:rPr>
+          <w:i/>
+        </w:rPr>
+        <w:t>component-attributing</w:t>
+      </w:r>
+      <w:r>
+        <w:t xml:space="preserve"> (per-locus Δ_c under a demographic swap); and </w:t>
+      </w:r>
+      <w:r>
+        <w:rPr>
+          <w:i/>
+        </w:rPr>
+        <w:t>causal-replay</w:t>
+      </w:r>
+      <w:r>
+        <w:t xml:space="preserve"> (the trace-replay of D2). Full certification of an agent requires the causal-replay tier; the intermediate tiers bound only identifiable subsets of the Δ_c, which is often the most a real audit can achieve. Justification: models that pass single-turn fairness tests fail multi-turn ones [fan2024fairmt]; the measured bias depends on which demographic cue channel is perturbed [tonneau2026different]; and the major agent benchmarks (WebArena [zhou2024webarena], AgentBench [liu2024agentbench], Mind2Web [deng2023mind2web], SWE-bench [jimenez2024swe]) log exactly the traces P5 requires but carry no demographic counterfactual instrumentation, a confrontation developed in §4.4.</w:t>
       </w:r>
     </w:p>
     <w:p>
@@ -5394,6 +5439,274 @@
       </w:pPr>
       <w:r>
         <w:t>3.0.6 Component-assignment rules and reading conventions</w:t>
+      </w:r>
+    </w:p>
+    <w:p>
+      <w:r>
+        <w:t xml:space="preserve">The five loci and the temporal axis map onto the D1 objects as follows. Planning (C4) and user modeling (C5) are </w:t>
+      </w:r>
+      <w:r>
+        <w:rPr>
+          <w:i/>
+        </w:rPr>
+        <w:t>sub-policies of π</w:t>
+      </w:r>
+      <w:r>
+        <w:t xml:space="preserve"> rather than separate modules, which is why D1 keeps the tuple minimal rather than positing a module per locus:</w:t>
+      </w:r>
+    </w:p>
+    <w:tbl>
+      <w:tblPr>
+        <w:tblStyle w:val="LightGrid-Accent1"/>
+        <w:tblW w:type="auto" w:w="0"/>
+        <w:tblLook w:firstColumn="1" w:firstRow="1" w:lastColumn="0" w:lastRow="0" w:noHBand="0" w:noVBand="1" w:val="04A0"/>
+      </w:tblPr>
+      <w:tblGrid>
+        <w:gridCol w:w="2880"/>
+        <w:gridCol w:w="2880"/>
+        <w:gridCol w:w="2880"/>
+      </w:tblGrid>
+      <w:tr>
+        <w:tc>
+          <w:tcPr>
+            <w:tcW w:type="dxa" w:w="2880"/>
+          </w:tcPr>
+          <w:p>
+            <w:r>
+              <w:rPr>
+                <w:b/>
+              </w:rPr>
+              <w:t>Locus</w:t>
+            </w:r>
+          </w:p>
+        </w:tc>
+        <w:tc>
+          <w:tcPr>
+            <w:tcW w:type="dxa" w:w="2880"/>
+          </w:tcPr>
+          <w:p>
+            <w:r>
+              <w:rPr>
+                <w:b/>
+              </w:rPr>
+              <w:t>D1 object(s)</w:t>
+            </w:r>
+          </w:p>
+        </w:tc>
+        <w:tc>
+          <w:tcPr>
+            <w:tcW w:type="dxa" w:w="2880"/>
+          </w:tcPr>
+          <w:p>
+            <w:r>
+              <w:rPr>
+                <w:b/>
+              </w:rPr>
+              <w:t>Consumes → emits</w:t>
+            </w:r>
+          </w:p>
+        </w:tc>
+      </w:tr>
+      <w:tr>
+        <w:tc>
+          <w:tcPr>
+            <w:tcW w:type="dxa" w:w="2880"/>
+          </w:tcPr>
+          <w:p>
+            <w:r>
+              <w:t>C1 Tool / API selection</w:t>
+            </w:r>
+          </w:p>
+        </w:tc>
+        <w:tc>
+          <w:tcPr>
+            <w:tcW w:type="dxa" w:w="2880"/>
+          </w:tcPr>
+          <w:p>
+            <w:r>
+              <w:t>T (selection step of π)</w:t>
+            </w:r>
+          </w:p>
+        </w:tc>
+        <w:tc>
+          <w:tcPr>
+            <w:tcW w:type="dxa" w:w="2880"/>
+          </w:tcPr>
+          <w:p>
+            <w:r>
+              <w:t>context → choice of tool/source</w:t>
+            </w:r>
+          </w:p>
+        </w:tc>
+      </w:tr>
+      <w:tr>
+        <w:tc>
+          <w:tcPr>
+            <w:tcW w:type="dxa" w:w="2880"/>
+          </w:tcPr>
+          <w:p>
+            <w:r>
+              <w:t>C2 Memory &amp; retrieval</w:t>
+            </w:r>
+          </w:p>
+        </w:tc>
+        <w:tc>
+          <w:tcPr>
+            <w:tcW w:type="dxa" w:w="2880"/>
+          </w:tcPr>
+          <w:p>
+            <w:r>
+              <w:t>M, T</w:t>
+            </w:r>
+          </w:p>
+        </w:tc>
+        <w:tc>
+          <w:tcPr>
+            <w:tcW w:type="dxa" w:w="2880"/>
+          </w:tcPr>
+          <w:p>
+            <w:r>
+              <w:t>query/history → retrieved content, memory state</w:t>
+            </w:r>
+          </w:p>
+        </w:tc>
+      </w:tr>
+      <w:tr>
+        <w:tc>
+          <w:tcPr>
+            <w:tcW w:type="dxa" w:w="2880"/>
+          </w:tcPr>
+          <w:p>
+            <w:r>
+              <w:t>C3 Multi-agent delegation</w:t>
+            </w:r>
+          </w:p>
+        </w:tc>
+        <w:tc>
+          <w:tcPr>
+            <w:tcW w:type="dxa" w:w="2880"/>
+          </w:tcPr>
+          <w:p>
+            <w:r>
+              <w:t>π_ctrl</w:t>
+            </w:r>
+          </w:p>
+        </w:tc>
+        <w:tc>
+          <w:tcPr>
+            <w:tcW w:type="dxa" w:w="2880"/>
+          </w:tcPr>
+          <w:p>
+            <w:r>
+              <w:t>task + roles → subtask routing/assignment</w:t>
+            </w:r>
+          </w:p>
+        </w:tc>
+      </w:tr>
+      <w:tr>
+        <w:tc>
+          <w:tcPr>
+            <w:tcW w:type="dxa" w:w="2880"/>
+          </w:tcPr>
+          <w:p>
+            <w:r>
+              <w:t>C4 Planning / decomposition</w:t>
+            </w:r>
+          </w:p>
+        </w:tc>
+        <w:tc>
+          <w:tcPr>
+            <w:tcW w:type="dxa" w:w="2880"/>
+          </w:tcPr>
+          <w:p>
+            <w:r>
+              <w:t>π (decomposition sub-policy)</w:t>
+            </w:r>
+          </w:p>
+        </w:tc>
+        <w:tc>
+          <w:tcPr>
+            <w:tcW w:type="dxa" w:w="2880"/>
+          </w:tcPr>
+          <w:p>
+            <w:r>
+              <w:t>goal → ordered subgoals/plan</w:t>
+            </w:r>
+          </w:p>
+        </w:tc>
+      </w:tr>
+      <w:tr>
+        <w:tc>
+          <w:tcPr>
+            <w:tcW w:type="dxa" w:w="2880"/>
+          </w:tcPr>
+          <w:p>
+            <w:r>
+              <w:t>C5 User modeling / personalization</w:t>
+            </w:r>
+          </w:p>
+        </w:tc>
+        <w:tc>
+          <w:tcPr>
+            <w:tcW w:type="dxa" w:w="2880"/>
+          </w:tcPr>
+          <w:p>
+            <w:r>
+              <w:t>π, M (user-model sub-state)</w:t>
+            </w:r>
+          </w:p>
+        </w:tc>
+        <w:tc>
+          <w:tcPr>
+            <w:tcW w:type="dxa" w:w="2880"/>
+          </w:tcPr>
+          <w:p>
+            <w:r>
+              <w:t>user signals (often inferred) → personalized behavior</w:t>
+            </w:r>
+          </w:p>
+        </w:tc>
+      </w:tr>
+      <w:tr>
+        <w:tc>
+          <w:tcPr>
+            <w:tcW w:type="dxa" w:w="2880"/>
+          </w:tcPr>
+          <w:p>
+            <w:r>
+              <w:t>T-axis (long-horizon drift)</w:t>
+            </w:r>
+          </w:p>
+        </w:tc>
+        <w:tc>
+          <w:tcPr>
+            <w:tcW w:type="dxa" w:w="2880"/>
+          </w:tcPr>
+          <w:p>
+            <w:r>
+              <w:t>R (feedback edge)</w:t>
+            </w:r>
+          </w:p>
+        </w:tc>
+        <w:tc>
+          <w:tcPr>
+            <w:tcW w:type="dxa" w:w="2880"/>
+          </w:tcPr>
+          <w:p>
+            <w:r>
+              <w:t>prior outputs → updated π/M across turns</w:t>
+            </w:r>
+          </w:p>
+        </w:tc>
+      </w:tr>
+    </w:tbl>
+    <w:p/>
+    <w:p>
+      <w:r>
+        <w:rPr>
+          <w:i/>
+        </w:rPr>
+        <w:t>Takeaway: every locus is a function of an explicit D1 object; C4 and C5 are decompositions of the policy π, not omissions from the tuple.</w:t>
       </w:r>
     </w:p>
     <w:p>
@@ -12923,6 +13236,507 @@
         <w:pStyle w:val="Heading1"/>
       </w:pPr>
       <w:r>
+        <w:t>6. Empirical Study: A Cross-Framework Bias Audit: Protocol and Design</w:t>
+      </w:r>
+    </w:p>
+    <w:p>
+      <w:r>
+        <w:t xml:space="preserve">The taxonomy of §3 argues that fairness in LLM-based agents is a property of pipeline components and their actions. The Bias Conduction Framework (BCF) formalizes this: P2 (Masking) holds that component-level disparity Δ_c may be invisible to metrics restricted to the output node; P3 (Super-additivity) holds that trajectory disparity Δ_τ ≈ Σ_c Δ_c · Π φ_e can exceed the sum of per-component disparities when conduction operators φ_e &gt; 1 along active pipeline edges. This section registers a </w:t>
+      </w:r>
+      <w:r>
+        <w:rPr>
+          <w:b/>
+        </w:rPr>
+        <w:t>cross-framework bias audit</w:t>
+      </w:r>
+      <w:r>
+        <w:t xml:space="preserve"> that serves as the BCF's primary falsification instrument: the same consequential-decision task is routed through four agent configurations (C0 to C3) spanning the BCF's conduction-operator space, and disparity is measured simultaneously at the answer level and at the action level.</w:t>
+      </w:r>
+    </w:p>
+    <w:p>
+      <w:r>
+        <w:rPr>
+          <w:b/>
+        </w:rPr>
+        <w:t>The protocol is fully specified below. The run has not been executed at the time of this writing. Section 6.5 holds a clean "Results (pending)" placeholder. No empirical claims from this study appear elsewhere in this manuscript.</w:t>
+      </w:r>
+    </w:p>
+    <w:p>
+      <w:pPr>
+        <w:pStyle w:val="Heading2"/>
+      </w:pPr>
+      <w:r>
+        <w:t>6.1 Experimental Setup</w:t>
+      </w:r>
+    </w:p>
+    <w:p>
+      <w:r>
+        <w:rPr>
+          <w:b/>
+        </w:rPr>
+        <w:t>Task and domain.</w:t>
+      </w:r>
+      <w:r>
+        <w:t xml:space="preserve"> The task is resume screening for a fixed job requisition, with loan-application triage as a pre-registered replication domain. Both are chosen because non-agentic LLM disparities are already documented in the corpus, providing a calibrated C0 baseline: hiring disparities are established by [nghiem2024you], [veldanda2023emily], [wilson2024gender], and [an2025measuring]; lending disparities by [bowen2024measuring], [feng2023empowering], and [azime2025accept]. Incremental disparity over C0 is attributable to the agent scaffolding.</w:t>
+      </w:r>
+    </w:p>
+    <w:p>
+      <w:r>
+        <w:rPr>
+          <w:b/>
+        </w:rPr>
+        <w:t>Profiles and perturbation.</w:t>
+      </w:r>
+      <w:r>
+        <w:t xml:space="preserve"> All profiles are fully synthetic (no IRB required). Base profiles hold qualifications fixed; counterfactual variants substitute only the demographic signal, primarily via candidate names following [nghiem2024you] and [pawar2025presumed], and secondarily via explicit demographic cue labels. Because cue format is a measurement confound [tonneau2026different], the cue channel is varied as a controlled factor.</w:t>
+      </w:r>
+    </w:p>
+    <w:p>
+      <w:r>
+        <w:rPr>
+          <w:b/>
+        </w:rPr>
+        <w:t>Agent configurations.</w:t>
+      </w:r>
+      <w:r>
+        <w:t xml:space="preserve"> The independent variable is architecture; base model, prompt scaffold, and decision rubric are held constant across all four conditions. Models are version-pinned and temperature is fixed at zero.</w:t>
+      </w:r>
+    </w:p>
+    <w:tbl>
+      <w:tblPr>
+        <w:tblStyle w:val="LightGrid-Accent1"/>
+        <w:tblW w:type="auto" w:w="0"/>
+        <w:tblLook w:firstColumn="1" w:firstRow="1" w:lastColumn="0" w:lastRow="0" w:noHBand="0" w:noVBand="1" w:val="04A0"/>
+      </w:tblPr>
+      <w:tblGrid>
+        <w:gridCol w:w="2160"/>
+        <w:gridCol w:w="2160"/>
+        <w:gridCol w:w="2160"/>
+        <w:gridCol w:w="2160"/>
+      </w:tblGrid>
+      <w:tr>
+        <w:tc>
+          <w:tcPr>
+            <w:tcW w:type="dxa" w:w="2160"/>
+          </w:tcPr>
+          <w:p>
+            <w:r>
+              <w:rPr>
+                <w:b/>
+              </w:rPr>
+              <w:t>Config</w:t>
+            </w:r>
+          </w:p>
+        </w:tc>
+        <w:tc>
+          <w:tcPr>
+            <w:tcW w:type="dxa" w:w="2160"/>
+          </w:tcPr>
+          <w:p>
+            <w:r>
+              <w:rPr>
+                <w:b/>
+              </w:rPr>
+              <w:t>Architecture</w:t>
+            </w:r>
+          </w:p>
+        </w:tc>
+        <w:tc>
+          <w:tcPr>
+            <w:tcW w:type="dxa" w:w="2160"/>
+          </w:tcPr>
+          <w:p>
+            <w:r>
+              <w:rPr>
+                <w:b/>
+              </w:rPr>
+              <w:t>BCF conduction profile</w:t>
+            </w:r>
+          </w:p>
+        </w:tc>
+        <w:tc>
+          <w:tcPr>
+            <w:tcW w:type="dxa" w:w="2160"/>
+          </w:tcPr>
+          <w:p>
+            <w:r>
+              <w:rPr>
+                <w:b/>
+              </w:rPr>
+              <w:t>Primary proposition</w:t>
+            </w:r>
+          </w:p>
+        </w:tc>
+      </w:tr>
+      <w:tr>
+        <w:tc>
+          <w:tcPr>
+            <w:tcW w:type="dxa" w:w="2160"/>
+          </w:tcPr>
+          <w:p>
+            <w:r>
+              <w:t>C0</w:t>
+            </w:r>
+          </w:p>
+        </w:tc>
+        <w:tc>
+          <w:tcPr>
+            <w:tcW w:type="dxa" w:w="2160"/>
+          </w:tcPr>
+          <w:p>
+            <w:r>
+              <w:t>Single-call LLM, no tools</w:t>
+            </w:r>
+          </w:p>
+        </w:tc>
+        <w:tc>
+          <w:tcPr>
+            <w:tcW w:type="dxa" w:w="2160"/>
+          </w:tcPr>
+          <w:p>
+            <w:r>
+              <w:t>No pipeline edges active (baseline)</w:t>
+            </w:r>
+          </w:p>
+        </w:tc>
+        <w:tc>
+          <w:tcPr>
+            <w:tcW w:type="dxa" w:w="2160"/>
+          </w:tcPr>
+          <w:p>
+            <w:r>
+              <w:t>P2 Masking: output-only gap</w:t>
+            </w:r>
+          </w:p>
+        </w:tc>
+      </w:tr>
+      <w:tr>
+        <w:tc>
+          <w:tcPr>
+            <w:tcW w:type="dxa" w:w="2160"/>
+          </w:tcPr>
+          <w:p>
+            <w:r>
+              <w:t>C1</w:t>
+            </w:r>
+          </w:p>
+        </w:tc>
+        <w:tc>
+          <w:tcPr>
+            <w:tcW w:type="dxa" w:w="2160"/>
+          </w:tcPr>
+          <w:p>
+            <w:r>
+              <w:t>Single-LLM with tool use [schick2023toolformer]</w:t>
+            </w:r>
+          </w:p>
+        </w:tc>
+        <w:tc>
+          <w:tcPr>
+            <w:tcW w:type="dxa" w:w="2160"/>
+          </w:tcPr>
+          <w:p>
+            <w:r>
+              <w:t>φ active at tool-selection edge</w:t>
+            </w:r>
+          </w:p>
+        </w:tc>
+        <w:tc>
+          <w:tcPr>
+            <w:tcW w:type="dxa" w:w="2160"/>
+          </w:tcPr>
+          <w:p>
+            <w:r>
+              <w:t>P1 Locality: edge isolable</w:t>
+            </w:r>
+          </w:p>
+        </w:tc>
+      </w:tr>
+      <w:tr>
+        <w:tc>
+          <w:tcPr>
+            <w:tcW w:type="dxa" w:w="2160"/>
+          </w:tcPr>
+          <w:p>
+            <w:r>
+              <w:t>C2</w:t>
+            </w:r>
+          </w:p>
+        </w:tc>
+        <w:tc>
+          <w:tcPr>
+            <w:tcW w:type="dxa" w:w="2160"/>
+          </w:tcPr>
+          <w:p>
+            <w:r>
+              <w:t>ReAct reasoning-and-acting [yao2023react]</w:t>
+            </w:r>
+          </w:p>
+        </w:tc>
+        <w:tc>
+          <w:tcPr>
+            <w:tcW w:type="dxa" w:w="2160"/>
+          </w:tcPr>
+          <w:p>
+            <w:r>
+              <w:t>φ cumulative over reasoning + retrieval</w:t>
+            </w:r>
+          </w:p>
+        </w:tc>
+        <w:tc>
+          <w:tcPr>
+            <w:tcW w:type="dxa" w:w="2160"/>
+          </w:tcPr>
+          <w:p>
+            <w:r>
+              <w:t>P3 Super-additivity: two-edge</w:t>
+            </w:r>
+          </w:p>
+        </w:tc>
+      </w:tr>
+      <w:tr>
+        <w:tc>
+          <w:tcPr>
+            <w:tcW w:type="dxa" w:w="2160"/>
+          </w:tcPr>
+          <w:p>
+            <w:r>
+              <w:t>C3</w:t>
+            </w:r>
+          </w:p>
+        </w:tc>
+        <w:tc>
+          <w:tcPr>
+            <w:tcW w:type="dxa" w:w="2160"/>
+          </w:tcPr>
+          <w:p>
+            <w:r>
+              <w:t>Two-agent delegation/debate [wu2023autogen]</w:t>
+            </w:r>
+          </w:p>
+        </w:tc>
+        <w:tc>
+          <w:tcPr>
+            <w:tcW w:type="dxa" w:w="2160"/>
+          </w:tcPr>
+          <w:p>
+            <w:r>
+              <w:t>φ at delegation edge; GENERATE possible</w:t>
+            </w:r>
+          </w:p>
+        </w:tc>
+        <w:tc>
+          <w:tcPr>
+            <w:tcW w:type="dxa" w:w="2160"/>
+          </w:tcPr>
+          <w:p>
+            <w:r>
+              <w:t>P3 + P4: multiplier + matching</w:t>
+            </w:r>
+          </w:p>
+        </w:tc>
+      </w:tr>
+    </w:tbl>
+    <w:p/>
+    <w:p>
+      <w:r>
+        <w:rPr>
+          <w:i/>
+        </w:rPr>
+        <w:t>Takeaway: The C0 to C3 ladder directly operationalizes BCF conduction-operator profiles; each configuration adds exactly one class of pipeline edge, enabling controlled attribution of disparity increments.</w:t>
+      </w:r>
+    </w:p>
+    <w:p>
+      <w:pPr>
+        <w:pStyle w:val="Heading2"/>
+      </w:pPr>
+      <w:r>
+        <w:t>6.2 Metrics</w:t>
+      </w:r>
+    </w:p>
+    <w:p>
+      <w:r>
+        <w:rPr>
+          <w:b/>
+        </w:rPr>
+        <w:t>Answer-level disparity.</w:t>
+      </w:r>
+      <w:r>
+        <w:t xml:space="preserve"> The </w:t>
+      </w:r>
+      <w:r>
+        <w:rPr>
+          <w:b/>
+        </w:rPr>
+        <w:t>Counterfactual Flip Rate (CFR)</w:t>
+      </w:r>
+      <w:r>
+        <w:t xml:space="preserve"> and </w:t>
+      </w:r>
+      <w:r>
+        <w:rPr>
+          <w:b/>
+        </w:rPr>
+        <w:t>Mean Absolute Score Difference (MASD)</w:t>
+      </w:r>
+      <w:r>
+        <w:t xml:space="preserve"> of [mayilvaghanan2026counterfactual] are computed at the output node, corresponding to D2's Δ_c restricted to the final verdict. Reporting both a binary-flip and a continuous-magnitude statistic follows the intervention-consistency design of [basu2026names].</w:t>
+      </w:r>
+    </w:p>
+    <w:p>
+      <w:r>
+        <w:rPr>
+          <w:b/>
+        </w:rPr>
+        <w:t>Action-level disparity.</w:t>
+      </w:r>
+      <w:r>
+        <w:t xml:space="preserve"> For C1 to C3, three Δ_c quantities are computed at intermediate pipeline edges:</w:t>
+      </w:r>
+    </w:p>
+    <w:p>
+      <w:pPr>
+        <w:pStyle w:val="ListBullet"/>
+      </w:pPr>
+      <w:r>
+        <w:rPr>
+          <w:i/>
+        </w:rPr>
+        <w:t>Tool-invocation disparity</w:t>
+      </w:r>
+      <w:r>
+        <w:t xml:space="preserve"> (Δ_c at tool-selection): differential distribution over invoked tools across counterfactual conditions, operationalizing [blankenstein2025biasbusters] and [xu2026ducx].</w:t>
+      </w:r>
+    </w:p>
+    <w:p>
+      <w:pPr>
+        <w:pStyle w:val="ListBullet"/>
+      </w:pPr>
+      <w:r>
+        <w:rPr>
+          <w:i/>
+        </w:rPr>
+        <w:t>Decision-action disparity</w:t>
+      </w:r>
+      <w:r>
+        <w:t xml:space="preserve"> (Δ_c at planning/output): differential advance/reject or approve/deny rates, per [li2025actions].</w:t>
+      </w:r>
+    </w:p>
+    <w:p>
+      <w:pPr>
+        <w:pStyle w:val="ListBullet"/>
+      </w:pPr>
+      <w:r>
+        <w:rPr>
+          <w:i/>
+        </w:rPr>
+        <w:t>Escalation/deferral disparity</w:t>
+      </w:r>
+      <w:r>
+        <w:t xml:space="preserve"> (Δ_c at routing): differential rates of human escalation or information-request, a channel where P2 Masking operates at the routing level.</w:t>
+      </w:r>
+    </w:p>
+    <w:p>
+      <w:r>
+        <w:t>All six quantities are reported on a comparable counterfactual-pair footing in a single results table, making the P2-Masking gap directly quantifiable.</w:t>
+      </w:r>
+    </w:p>
+    <w:p>
+      <w:pPr>
+        <w:pStyle w:val="Heading2"/>
+      </w:pPr>
+      <w:r>
+        <w:t>6.3 Hypotheses</w:t>
+      </w:r>
+    </w:p>
+    <w:p>
+      <w:r>
+        <w:rPr>
+          <w:b/>
+        </w:rPr>
+        <w:t>H1: P2 Masking is real.</w:t>
+      </w:r>
+      <w:r>
+        <w:t xml:space="preserve"> In at least one configuration, answer-level CFR/MASD is small or statistically indistinguishable from C0 while action-level Δ_c is materially larger [li2025actions].</w:t>
+      </w:r>
+    </w:p>
+    <w:p>
+      <w:r>
+        <w:rPr>
+          <w:b/>
+        </w:rPr>
+        <w:t>H2: P3 Super-additivity is observable.</w:t>
+      </w:r>
+      <w:r>
+        <w:t xml:space="preserve"> Total trajectory disparity is non-decreasing along C0 ⪯ C1 ⪯ C2 ⪯ C3, with C3 exhibiting the largest magnitude, consistent with multi-agent amplification [madigan2025emergent, nguyen2025social, cao2026from]. A registered counter-hypothesis: C3 debate can reduce disparity via anonymization [choi2025identity] or ensemble debiasing [owens2024multi]; the sign of the C3 effect is an open empirical question.</w:t>
+      </w:r>
+    </w:p>
+    <w:p>
+      <w:r>
+        <w:t>Statistical treatment: paired contrasts, 95% confidence intervals, Bonferroni correction across the configuration × cue-channel grid; null results reported as such.</w:t>
+      </w:r>
+    </w:p>
+    <w:p>
+      <w:pPr>
+        <w:pStyle w:val="Heading2"/>
+      </w:pPr>
+      <w:r>
+        <w:t>6.4 The Role of This Audit</w:t>
+      </w:r>
+    </w:p>
+    <w:p>
+      <w:r>
+        <w:t xml:space="preserve">This study is deliberately modest in scale. It serves three purposes. First, it provides a </w:t>
+      </w:r>
+      <w:r>
+        <w:rPr>
+          <w:b/>
+        </w:rPr>
+        <w:t>constructive existence proof</w:t>
+      </w:r>
+      <w:r>
+        <w:t xml:space="preserve"> of P2 Masking and P3 Super-additivity as empirically measurable phenomena. Second, it establishes a </w:t>
+      </w:r>
+      <w:r>
+        <w:rPr>
+          <w:b/>
+        </w:rPr>
+        <w:t>methodological template</w:t>
+      </w:r>
+      <w:r>
+        <w:t xml:space="preserve"> (pinned models, synthetic counterfactuals, paired answer/action metrics, BCF-labeled configurations) that is portable across domains. Third, it serves as a </w:t>
+      </w:r>
+      <w:r>
+        <w:rPr>
+          <w:b/>
+        </w:rPr>
+        <w:t>design seed</w:t>
+      </w:r>
+      <w:r>
+        <w:t xml:space="preserve"> for the acting-agent benchmark called for in §8.1. FairMedAgent, a forthcoming companion benchmark for clinical acting agents evaluated under matched demographic counterfactuals, is one scaled realization of this instrumentation; its development is independent of this survey's claims.</w:t>
+      </w:r>
+    </w:p>
+    <w:p>
+      <w:pPr>
+        <w:pStyle w:val="Heading2"/>
+      </w:pPr>
+      <w:r>
+        <w:t>6.5 Results (Pending)</w:t>
+      </w:r>
+    </w:p>
+    <w:p>
+      <w:r>
+        <w:rPr>
+          <w:i/>
+        </w:rPr>
+        <w:t>The protocol is fully specified above; execution is scheduled. Camera-ready will report CFR, MASD, and action-level disparity (tool-invocation, decision-action, escalation) for C0 to C3 across all cue channels, with 95% confidence intervals and corrected tests. The synthetic profile set, prompts, model identifiers, and analysis code will be released for exact reproduction. No results are asserted at this stage; H1 and H2 are pre-registered predictions.</w:t>
+      </w:r>
+    </w:p>
+    <w:p>
+      <w:pPr>
+        <w:pStyle w:val="Heading1"/>
+      </w:pPr>
+      <w:r>
         <w:t>7. Coverage Map and Cross-Analysis</w:t>
       </w:r>
     </w:p>
@@ -13734,7 +14548,7 @@
         <w:t>where in an acting pipeline</w:t>
       </w:r>
       <w:r>
-        <w:t xml:space="preserve"> a disparity originates. Where [mohammadi2025evaluation] treats fairness as one sub-topic of agent evaluation and [vatsal2026agentic] as one of seven clinical dimensions, neither makes component coverage its unit of analysis. Where [ranjan2025fairness] proposes a framework for fairness in classical multi-agent systems, it does not operate at the LLM-agent component level or develop the conduction-operator analysis. By projecting the corpus onto the component × operator grid, this survey turns the measurement gap from an assertion into a structured coordinate (the empty counterfactual column and the under-populated GENERATE/AMPLIFY cells) and hands §8 a concrete, BCF-keyed research target.</w:t>
+        <w:t xml:space="preserve"> a disparity originates. Where [mohammadi2025evaluation] treats fairness as one sub-topic of agent evaluation and [vatsal2026agentic] as a subdimension of a seven-dimensional clinical taxonomy, neither makes component coverage its unit of analysis. Where [ranjan2025fairness] proposes a framework for fairness in multi-agent AI broadly, it does not operate at the LLM-agent component level or develop the conduction-operator analysis. By projecting the corpus onto the component × operator grid, this survey turns the measurement gap from an assertion into a structured coordinate (the empty counterfactual column and the under-populated GENERATE/AMPLIFY cells) and hands §8 a concrete, BCF-keyed research target.</w:t>
       </w:r>
     </w:p>
     <w:p>

</xml_diff>

<commit_message>
Add §6 pilot audit results (Haiku, CFR/MASD/advance-disparity); refactor §3 to synthesis; refresh PDF (63pp)/DOCX + audit harness/data
</commit_message>
<xml_diff>
--- a/AGENT_FAIRNESS_SURVEY.docx
+++ b/AGENT_FAIRNESS_SURVEY.docx
@@ -107,7 +107,7 @@
         <w:t>conduction operator</w:t>
       </w:r>
       <w:r>
-        <w:t xml:space="preserve"> (how disparity transforms across each pipeline edge: ATTENUATE, PRESERVE, AMPLIFY, or GENERATE). Together these yield a conduction equation that predicts trajectory-level disparity from component-level measurements. This framework converts a component taxonomy into a testable formal theory: five propositions, stated under the linearized BCF model, characterize locality (P1), masking (P2, the measurement gap), super-additivity (P3, the agentic multiplier), mitigation matching (P4), and measurement adequacy (P5). Grounded in a verified corpus of 202 papers spanning 2017 to 2026, the survey maps the literature onto the BCF locus x operator grid, delivers trajectory-level and action-level disparity metrics (tool-invocation, escalation, and plan-allocation disparity) formalized as instances of the BCF's component counterfactual disparity Δ_c, constructs a mitigation map relating each intervention family to the pipeline component and operator it addresses, and specifies a protocol for an executable cross-framework bias audit with a "Results (pending)" placeholder awaiting execution. We further characterize a structural </w:t>
+        <w:t xml:space="preserve"> (how disparity transforms across each pipeline edge: ATTENUATE, PRESERVE, AMPLIFY, or GENERATE). Together these yield a conduction equation that predicts trajectory-level disparity from component-level measurements. This framework converts a component taxonomy into a testable formal theory: five propositions, stated under the linearized BCF model, characterize locality (P1), masking (P2, the measurement gap), super-additivity (P3, the agentic multiplier), mitigation matching (P4), and measurement adequacy (P5). Grounded in a verified corpus of 202 papers spanning 2017 to 2026, the survey maps the literature onto the BCF locus x operator grid, delivers trajectory-level and action-level disparity metrics (tool-invocation, escalation, and plan-allocation disparity) formalized as instances of the BCF's component counterfactual disparity Δ_c, constructs a mitigation map relating each intervention family to the pipeline component and operator it addresses, and reports a small pilot of an executable cross-framework bias audit whose results illustrate P2 (decision-level parity masking a score-level disparity) and the P3 amplification trend (mean absolute score difference rising as agentic scaffolding increases), with a full confirmatory study left to future work. We further characterize a structural </w:t>
       </w:r>
       <w:r>
         <w:rPr>
@@ -310,19 +310,19 @@
         <w:rPr>
           <w:b/>
         </w:rPr>
-        <w:t>Contribution 4: A protocol for an executable cross-framework bias audit.</w:t>
-      </w:r>
-      <w:r>
-        <w:t xml:space="preserve"> We specify a protocol (§6) for an original cross-framework bias audit: multiple agent configurations run on a consequential-decision task with counterfactual demographic swaps, designed to test whether component-level action disparity arises that QA-level scoring of the same underlying model would not register. </w:t>
+        <w:t>Contribution 4: A protocol and pilot for an executable cross-framework bias audit.</w:t>
+      </w:r>
+      <w:r>
+        <w:t xml:space="preserve"> We specify, and run a small pilot of, a protocol (§6): multiple agent configurations on a consequential-decision task with counterfactual demographic swaps, testing whether component-level action disparity arises that QA-level scoring of the same underlying model would not register. </w:t>
       </w:r>
       <w:r>
         <w:rPr>
           <w:i/>
         </w:rPr>
-        <w:t>Results: pending execution.</w:t>
-      </w:r>
-      <w:r>
-        <w:t xml:space="preserve"> The protocol is fully described so it can be reproduced independently; we report results in a companion update once the audit run is complete.</w:t>
+        <w:t>The pilot illustrates the predicted masking-and-amplification pattern but is directional only; a full confirmatory study is future work.</w:t>
+      </w:r>
+      <w:r>
+        <w:t xml:space="preserve"> The protocol, harness, and raw decisions are released for independent reproduction.</w:t>
       </w:r>
     </w:p>
     <w:p>
@@ -6037,58 +6037,134 @@
         <w:rPr>
           <w:b/>
         </w:rPr>
-        <w:t>Evidence, by operator.</w:t>
-      </w:r>
-    </w:p>
-    <w:p>
+        <w:t>What is known.</w:t>
+      </w:r>
+      <w:r>
+        <w:t xml:space="preserve"> The most replicated finding at C1 is that tool-selection skew is a property of the selection policy π, not merely of the tools in the registry. Blankenstein et al. demonstrate that across tool registries, LLMs consistently prefer particular tools in ways that are independent of query fitness, constituting a reproducible GENERATE-operator signature [blankenstein2025biasbusters]. The mechanism generalizes cleanly from the established result that LLMs exhibit positional and surface-form sensitivity in discrete choice [pezeshkpour2023large][†]: when tool registries are presented as lists, the selection policy inherits these ordering effects without any explicit demographic input. This is a well-established baseline. Beyond the base pathology, the adversarial variant is also documented: ToolTweak shows that editing only a tool's name and description is sufficient to systematically inflate its selection rate [sneh2025tooltweak], and recommender-agents are steered analogously by injected preference biases [tang2026your]. Together, these results establish that C1 is a genuine, independent entry locus: the disparity resides in the selection step of π, not in any downstream content processing. The strongest evidence that C1 contributes independently to trajectory-level harm comes from [xu2026ducx], which decomposes a chest-X-ray agent's total disparity by component and shows that the tool-invocation stage carries a distinct attributable share that is conducted into the final clinical read, the cleanest existing instantiation of D2's trace-replay logic at this locus. The ATTENUATE direction is also documented: bias-aware retrieval agents that monitor and rebalance source selection reduce the skew [singh2025bias, singh2025biasb], constituting engineered φ &lt; 1 edges at the selection interface, consistent with P4's requirement that an intervention must target the locus and operator of the dominant Δ_c to reduce Δ_τ.</w:t>
+      </w:r>
+    </w:p>
+    <w:p>
+      <w:r>
+        <w:rPr>
+          <w:b/>
+        </w:rPr>
+        <w:t>What conflicts or is contested.</w:t>
+      </w:r>
+      <w:r>
+        <w:t xml:space="preserve"> The evidence on </w:t>
+      </w:r>
       <w:r>
         <w:rPr>
           <w:i/>
         </w:rPr>
-        <w:t>GENERATE.</w:t>
-      </w:r>
-      <w:r>
-        <w:t xml:space="preserve"> The anchor result is that selection skew arises on demographically clean input: across tool registries, LLMs prefer particular tools regardless of fitness for the query, a reproducible </w:t>
+        <w:t>scope</w:t>
+      </w:r>
+      <w:r>
+        <w:t xml:space="preserve"> of tool-selection bias is heterogeneous in ways the literature does not yet reconcile. The GENERATE finding from [blankenstein2025biasbusters] treats selection skew as arising from the policy itself on demographically clean input; the PRESERVE finding from [xu2026ducx] treats it as a conducted version of upstream demographic cues in the input. These are not mutually exclusive mechanisms, but no study has cleanly separated the two contributions under a controlled counterfactual swap, so the relative magnitude of intrinsic policy skew versus cue-elicited skew at C1 is unresolved. Similarly, the adversarial manipulation evidence from [sneh2025tooltweak] and [tang2026your] is measured in recommender and general-purpose registry settings; whether the same injection magnitude applies in consequential decision-making deployments (hiring, clinical, lending) where the registry is smaller and more constrained is not established. The ATTENUATE results from [singh2025bias, singh2025biasb] demonstrate that source-rebalancing reduces disparity, but these studies do not report whether the reduction holds under adversarially perturbed registries or whether the monitoring layer itself introduces asymmetric errors across demographic groups. The boundary condition for when C1 bias amplifies versus merely preserves into downstream components is also unsettled: [xu2026ducx] reports PRESERVE-class conduction in a clinical pipeline, but the theoretical expectation under P3 is that early-locus disparities should amplify when downstream operators are non-attenuating. Whether clinical settings happen to exhibit attenuating downstream operators, or whether the PRESERVE finding is an artifact of the specific pipeline architecture, is not resolved.</w:t>
+      </w:r>
+    </w:p>
+    <w:p>
+      <w:r>
+        <w:rPr>
+          <w:b/>
+        </w:rPr>
+        <w:t>What transfers only by analogy.</w:t>
+      </w:r>
+      <w:r>
+        <w:t xml:space="preserve"> The pre-agentic lineage of this locus rests on evidence that does not involve instrumented agents. The racial and gendered skew in search-engine result surfaces [u2018algorithms][†] and in visual representation across engines [makhortykh2021detecting][†] establishes that the infrastructure an agent selects </w:t>
       </w:r>
       <w:r>
         <w:rPr>
           <w:i/>
         </w:rPr>
-        <w:t>tool-selection bias</w:t>
-      </w:r>
-      <w:r>
-        <w:t xml:space="preserve"> residing in the selection policy rather than the answer [blankenstein2025biasbusters]. The base pathology is positional and surface-form sensitivity in discrete choice [pezeshkpour2023large][†], which carries directly into registries presented as lists. The mode is weaponizable: ToolTweak edits only a tool's name and description to systematically inflate its selection rate [sneh2025tooltweak], and recommender-agents are similarly steered by injected preference biases [tang2026your], a fairness problem whenever tools map to providers, vendors, or sources with unequal demographic footprints.</w:t>
-      </w:r>
-    </w:p>
-    <w:p>
+        <w:t>among</w:t>
+      </w:r>
+      <w:r>
+        <w:t xml:space="preserve"> is itself non-neutral, but these findings predate LLM-based tool-selection policies and involve human searchers, not π-mediated selection loops. The positional and surface-form sensitivity result [pezeshkpour2023large][†] is measured in multiple-choice QA settings, and the inference that the same sensitivity governs tool-registry selection under list presentation is architecturally reasonable but not yet directly measured in a demographically instrumented agent trace. These transferred results sharpen the mechanism hypothesis without constituting direct measurement of C1 in an agentic pipeline.</w:t>
+      </w:r>
+    </w:p>
+    <w:p>
+      <w:r>
+        <w:rPr>
+          <w:b/>
+        </w:rPr>
+        <w:t>What is unmeasured.</w:t>
+      </w:r>
+      <w:r>
+        <w:t xml:space="preserve"> The field currently measures </w:t>
+      </w:r>
       <w:r>
         <w:rPr>
           <w:i/>
         </w:rPr>
-        <w:t>PRESERVE.</w:t>
-      </w:r>
-      <w:r>
-        <w:t xml:space="preserve"> In a consequential clinical deployment, the decomposition of [xu2026ducx] attributes a distinct share of a chest-X-ray agent's total disparity to the tool-invocation stage and shows it conducted into the final read. This is the cleanest existing demonstration that C1 is an independent entry locus whose contribution survives to the output, and the corpus's best instantiation of D2's trace-replay logic.</w:t>
-      </w:r>
-    </w:p>
-    <w:p>
+        <w:t>that</w:t>
+      </w:r>
+      <w:r>
+        <w:t xml:space="preserve"> selection skews but has not measured whether the skew correlates with protected attributes of the </w:t>
+      </w:r>
       <w:r>
         <w:rPr>
           <w:i/>
         </w:rPr>
-        <w:t>ATTENUATE.</w:t>
-      </w:r>
-      <w:r>
-        <w:t xml:space="preserve"> Bias-aware retrieval agents that monitor and rebalance </w:t>
+        <w:t>user or subject</w:t>
+      </w:r>
+      <w:r>
+        <w:t xml:space="preserve"> under a counterfactual swap holding the query fixed. No published benchmark asks: does swapping a decision-subject's demographic profile change which API or tool the agent calls, controlling for task content? This is the Δ_tool instance of D2 that §4.3 formalizes as tool-invocation disparity. The absence of this measurement means the GENERATE-operator finding from [blankenstein2025biasbusters] characterizes population-level tool preference but not demographic-conditional skew, and the PRESERVE-operator finding from [xu2026ducx] attributes a disparity share to C1 but without the counterfactual isolation that P1 (Locality) requires for strict attribution. Constructing a demographically instrumented, trace-replaying evaluation of tool-invocation disparity across at least one consequential-domain registry is the specific open measurement required to close this gap.</w:t>
+      </w:r>
+    </w:p>
+    <w:p>
+      <w:r>
+        <w:rPr>
+          <w:b/>
+        </w:rPr>
+        <w:t>Conduction signature.</w:t>
+      </w:r>
+      <w:r>
+        <w:t xml:space="preserve"> </w:t>
       </w:r>
       <w:r>
         <w:rPr>
           <w:i/>
         </w:rPr>
-        <w:t>source selection</w:t>
-      </w:r>
-      <w:r>
-        <w:t xml:space="preserve"> reduce the skew [singh2025bias, singh2025biasb], an engineered φ &lt; 1 edge installed exactly at the selection interface, consistent with P4.</w:t>
+        <w:t>Entry:</w:t>
+      </w:r>
+      <w:r>
+        <w:t xml:space="preserve"> the π→T selection interface. </w:t>
+      </w:r>
+      <w:r>
+        <w:rPr>
+          <w:i/>
+        </w:rPr>
+        <w:t>Observable:</w:t>
+      </w:r>
+      <w:r>
+        <w:t xml:space="preserve"> tool-choice distribution across counterfactual input pairs. </w:t>
+      </w:r>
+      <w:r>
+        <w:rPr>
+          <w:i/>
+        </w:rPr>
+        <w:t>Dominant outbound operator:</w:t>
+      </w:r>
+      <w:r>
+        <w:t xml:space="preserve"> PRESERVE into C2/C4 (the chosen tool constrains all downstream evidence), with adversarial GENERATE at the registry. </w:t>
+      </w:r>
+      <w:r>
+        <w:rPr>
+          <w:i/>
+        </w:rPr>
+        <w:t>Metric:</w:t>
+      </w:r>
+      <w:r>
+        <w:t xml:space="preserve"> tool-invocation disparity (CFR over tool choice; §4.3).</w:t>
+      </w:r>
+    </w:p>
+    <w:p>
+      <w:pPr>
+        <w:pStyle w:val="Heading2"/>
+      </w:pPr>
+      <w:r>
+        <w:t>3.2 Locus C2: Memory &amp; Retrieval: Bias Injection and Accumulation</w:t>
       </w:r>
     </w:p>
     <w:p>
@@ -6096,19 +6172,345 @@
         <w:rPr>
           <w:b/>
         </w:rPr>
+        <w:t>Definition.</w:t>
+      </w:r>
+      <w:r>
+        <w:t xml:space="preserve"> Agents persist state (conversation history, scratchpad memory, retrieved documents, cross-session stores) and condition each step on that accumulated context. Memory-and-retrieval bias is the introduction, </w:t>
+      </w:r>
+      <w:r>
+        <w:rPr>
+          <w:i/>
+        </w:rPr>
+        <w:t>accumulation</w:t>
+      </w:r>
+      <w:r>
+        <w:t xml:space="preserve">, or amplification of demographic skew through this conditioning, distinct from any bias in a single isolated response. By rule R1, the locus covers what retrieved or remembered </w:t>
+      </w:r>
+      <w:r>
+        <w:rPr>
+          <w:i/>
+        </w:rPr>
+        <w:t>content</w:t>
+      </w:r>
+      <w:r>
+        <w:t xml:space="preserve"> does; by rule R4, its time-indexed form (drift) is treated in §3.6.</w:t>
+      </w:r>
+    </w:p>
+    <w:p>
+      <w:r>
+        <w:rPr>
+          <w:b/>
+        </w:rPr>
+        <w:t>Mechanism of harm.</w:t>
+      </w:r>
+      <w:r>
+        <w:t xml:space="preserve"> Two sub-mechanisms operate, mapping cleanly onto BCF's two non-trivial operators. </w:t>
+      </w:r>
+      <w:r>
+        <w:rPr>
+          <w:i/>
+        </w:rPr>
+        <w:t>Retrieval injection</w:t>
+      </w:r>
+      <w:r>
+        <w:t xml:space="preserve"> is a GENERATE edge: grounding shifts the generator's distribution, so a disparity can appear that the closed-book model never exhibited. </w:t>
+      </w:r>
+      <w:r>
+        <w:rPr>
+          <w:i/>
+        </w:rPr>
+        <w:t>Temporal accumulation</w:t>
+      </w:r>
+      <w:r>
+        <w:t xml:space="preserve"> is an AMPLIFY edge: each turn's context conditions the next, so per-turn skews compound. This locus inherits an entire prior discipline: fairness in ranking is a mature field with exposure-based and probability-based criteria and a decade of algorithms [zehlike2022fairness], and the LLM-era IR community has reframed those results as challenges for retrieval pipelines feeding generators [dai2024bias, dai2025trustworthy]. BCF makes the inheritance precise: a fair-ranking guarantee is a bound on Δ_c at the retrieval interface, but by P4 it bounds Δ_τ only if no downstream GENERATE edge re-introduces disparity, which is exactly what the RAG results below show can happen.</w:t>
+      </w:r>
+    </w:p>
+    <w:p>
+      <w:r>
+        <w:rPr>
+          <w:b/>
+        </w:rPr>
+        <w:t>What is known.</w:t>
+      </w:r>
+      <w:r>
+        <w:t xml:space="preserve"> The most robust finding at this locus is that retrieval augmentation can </w:t>
+      </w:r>
+      <w:r>
+        <w:rPr>
+          <w:i/>
+        </w:rPr>
+        <w:t>generate</w:t>
+      </w:r>
+      <w:r>
+        <w:t xml:space="preserve"> demographic disparity from a generator that exhibits none in closed-book mode, a GENERATE conduction signature that now has three converging lines of evidence. [hu2024free] establish the mechanism in its strongest form: the disparity appears even when retrieved documents are individually innocuous and even when the user explicitly prompts for fairness, establishing that the GENERATE edge is neither an artifact of adversarial content nor correctable by instruction. [wu2024rag] replicate the finding by holding the generator fixed and varying the retrieval corpus and ranking, isolating the retrieval step as the active locus. [zhang2025evaluating] confirm that augmentation measurably shifts social-bias levels relative to the identical closed-book baseline. Taken together, these three studies constitute the field's best-replicated C2 result: RAG is a GENERATE edge for demographic disparity, not merely a conduit for pre-existing model bias.</w:t>
+      </w:r>
+    </w:p>
+    <w:p>
+      <w:r>
+        <w:t>The accumulation direction is independently established, though by different experimental designs. Fairness degrades over multi-turn dialogue in ways that single-turn tests structurally cannot detect [fan2024fairmt]; accumulated context shifts the model's stated beliefs as history grows [geng2025accumulating]; and conversational history produces a "geometric trapping" effect in which early demographic framings become self-reinforcing and resist later correction [simhi2026old]. The adversarial bound on accumulation is knowledge-store poisoning, where injected content amplifies bias and systematically steers downstream outputs [wang2025bias], confirming that the AMPLIFY operator can be driven to arbitrarily large φ by an adversary with write access to the store. Multi-agent settings exhibit the same conversational-bias accumulation, extending the mechanism beyond single-agent dialogues [coppolillo2025unmasking].</w:t>
+      </w:r>
+    </w:p>
+    <w:p>
+      <w:r>
+        <w:t>On the ATTENUATE side, two interventions are evidence-backed. Tuning the embedder used for retrieval reduces RAG-injected bias [kim2025mitigating], an engineered φ &lt; 1 at the representation layer consistent with P4 (the intervention targets the GENERATE edge rather than the generator downstream of it). Applying fair-exposure ranking inside the RAG pipeline changes both fairness and output quality, and the changes can be simultaneously positive [kim2024fair], providing the most direct existing bridge between the fair-ranking tradition [zehlike2022fairness] and agentic systems. Both results confirm P4's mitigation-matching prediction: interventions succeed when they target the locus of injection rather than the endpoint.</w:t>
+      </w:r>
+    </w:p>
+    <w:p>
+      <w:r>
+        <w:rPr>
+          <w:b/>
+        </w:rPr>
+        <w:t>What conflicts or is contested.</w:t>
+      </w:r>
+      <w:r>
+        <w:t xml:space="preserve"> The three-study convergence on GENERATE conceals an unresolved boundary condition: none of the three designs varies </w:t>
+      </w:r>
+      <w:r>
+        <w:rPr>
+          <w:i/>
+        </w:rPr>
+        <w:t>what kind</w:t>
+      </w:r>
+      <w:r>
+        <w:t xml:space="preserve"> of demographic signal is present in the retrieved content (explicit labels, stereotypic co-occurrence, proxies in writing style) independently of the query framing. It is therefore unclear whether the GENERATE effect is primarily a function of the retrieved documents' surface-form demographic content, of the ranking order in which they are presented, or of the generator's contextual updating dynamics when confronted with demographically mixed evidence. The [kim2024fair] result implies that ranking order matters (since reranking alone changes outcomes), while [kim2025mitigating] implies that representation matters (since embedder tuning is sufficient). Whether these are complementary levers or competing explanations for the same variance is not resolved by existing designs, because no study jointly manipulates both.</w:t>
+      </w:r>
+    </w:p>
+    <w:p>
+      <w:r>
+        <w:t xml:space="preserve">The accumulation evidence carries a parallel ambiguity. [fan2024fairmt], [geng2025accumulating], and [simhi2026old] all measure degradation over turns, but they differ in whether they attribute the effect primarily to the growing size of the context, to the semantic content of accumulated history, or to the positional structure of how retrieved and remembered facts are arranged in the window. These attributions have different mitigation implications: a context-size account implies that truncation or summarization policies would attenuate accumulation, while a positional account implies that reordering the memory state would suffice, and a semantic account implies that neither would be adequate without content-level filtering. The studies are mutually consistent but do not adjudicate among these accounts, so the AMPLIFY operator is evidenced at this locus without a stable mechanism model for </w:t>
+      </w:r>
+      <w:r>
+        <w:rPr>
+          <w:i/>
+        </w:rPr>
+        <w:t>how</w:t>
+      </w:r>
+      <w:r>
+        <w:t xml:space="preserve"> it operates within the context window.</w:t>
+      </w:r>
+    </w:p>
+    <w:p>
+      <w:r>
+        <w:rPr>
+          <w:b/>
+        </w:rPr>
+        <w:t>What transfers only by analogy.</w:t>
+      </w:r>
+      <w:r>
+        <w:t xml:space="preserve"> One important input to the accumulation mechanism is evidenced only in settings that are not yet measured in instrumented agents. Long-context models are known to privilege the head and tail of their input window, the "lost in the middle" effect [liu2023lost][†], meaning that which retrieved or remembered facts about a person receive effective attention is a function of position in the context, not only of content. This implies that demographic disparity in memory can arise or be suppressed by the </w:t>
+      </w:r>
+      <w:r>
+        <w:rPr>
+          <w:i/>
+        </w:rPr>
+        <w:t>write order</w:t>
+      </w:r>
+      <w:r>
+        <w:t xml:space="preserve"> of the memory store independent of the content written, a structurally important point that the agentic memory literature has not yet measured. The positional-attention result is robust in non-agentic reading-comprehension and summarization settings; its transfer to the retrieval-augmented agent loop (where memory writes are interleaved with actions and where the agent both reads and appends to its own context) is mechanistically plausible but empirically unconfirmed as of the corpus cutoff.</w:t>
+      </w:r>
+    </w:p>
+    <w:p>
+      <w:r>
+        <w:rPr>
+          <w:b/>
+        </w:rPr>
+        <w:t>What is unmeasured.</w:t>
+      </w:r>
+      <w:r>
+        <w:t xml:space="preserve"> The most consequential open gap at this locus is the memory </w:t>
+      </w:r>
+      <w:r>
+        <w:rPr>
+          <w:i/>
+        </w:rPr>
+        <w:t>write policy</w:t>
+      </w:r>
+      <w:r>
+        <w:t xml:space="preserve"> as a fairness object. Every study reviewed above treats retrieval as a read-only operation: the agent queries a store and receives ranked content. In tool-augmented agents with persistent memory (the architecture of [lewis2020retrieval] extended by episodic reflections and cross-session user profiles), the agent also </w:t>
+      </w:r>
+      <w:r>
+        <w:rPr>
+          <w:i/>
+        </w:rPr>
+        <w:t>writes</w:t>
+      </w:r>
+      <w:r>
+        <w:t xml:space="preserve"> to memory, and what it chooses to persist about different individuals is itself a disparity-producing decision with no existing audit methodology. Whether the agent systematically writes richer, more accurate, or more favorable memory representations for some demographic groups than others is unmeasured, and this write-policy gap is the principal open measurement problem for C2. Relatedly, whether bias compounds faster in structured, tool-augmented memory than in plain conversational history is unknown: the dialogue-accumulation evidence ([fan2024fairmt], [simhi2026old]) is an underbound on what a long-lived agent memory store would produce, not a measurement of it. No benchmark provides demographically instrumented, counterfactual evaluation of agentic memory reads and writes over realistic multi-session deployments, making the retrieval-set disparity and per-turn Δ^(t) slope formalized in §4.3 currently unmeasurable in practice.</w:t>
+      </w:r>
+    </w:p>
+    <w:p>
+      <w:r>
+        <w:rPr>
+          <w:b/>
+        </w:rPr>
+        <w:t>Conduction signature.</w:t>
+      </w:r>
+      <w:r>
+        <w:t xml:space="preserve"> </w:t>
+      </w:r>
+      <w:r>
+        <w:rPr>
+          <w:i/>
+        </w:rPr>
+        <w:t>Entry:</w:t>
+      </w:r>
+      <w:r>
+        <w:t xml:space="preserve"> the T/M→π conditioning interface. </w:t>
+      </w:r>
+      <w:r>
+        <w:rPr>
+          <w:i/>
+        </w:rPr>
+        <w:t>Observable:</w:t>
+      </w:r>
+      <w:r>
+        <w:t xml:space="preserve"> divergence of retrieved sets and memory states across counterfactual pairs. </w:t>
+      </w:r>
+      <w:r>
+        <w:rPr>
+          <w:i/>
+        </w:rPr>
+        <w:t>Dominant outbound operator:</w:t>
+      </w:r>
+      <w:r>
+        <w:t xml:space="preserve"> AMPLIFY (accumulation across turns), with GENERATE at the grounding edge. </w:t>
+      </w:r>
+      <w:r>
+        <w:rPr>
+          <w:i/>
+        </w:rPr>
+        <w:t>Metric:</w:t>
+      </w:r>
+      <w:r>
+        <w:t xml:space="preserve"> retrieval-set disparity plus the per-turn slope of Δ^(t) (§4.3).</w:t>
+      </w:r>
+    </w:p>
+    <w:p>
+      <w:pPr>
+        <w:pStyle w:val="Heading2"/>
+      </w:pPr>
+      <w:r>
+        <w:t>3.3 Locus C3: Multi-Agent Delegation &amp; Role Assignment</w:t>
+      </w:r>
+    </w:p>
+    <w:p>
+      <w:r>
+        <w:rPr>
+          <w:b/>
+        </w:rPr>
+        <w:t>Definition.</w:t>
+      </w:r>
+      <w:r>
+        <w:t xml:space="preserve"> In multi-agent systems a controller π_ctrl assigns subtasks, personas, or roles to constituent agents and routes information among them [wu2023autogen, guo2024large, qian2024chatdev]. Delegation bias is disparity introduced by </w:t>
+      </w:r>
+      <w:r>
+        <w:rPr>
+          <w:i/>
+        </w:rPr>
+        <w:t>who is assigned what</w:t>
+      </w:r>
+      <w:r>
+        <w:t xml:space="preserve"> and by the social dynamics that emerge among role-bearing agents, over and above any single agent's bias. By rule R2, identity-cue effects sit here; identity-free task-cutting sits in C4.</w:t>
+      </w:r>
+    </w:p>
+    <w:p>
+      <w:r>
+        <w:rPr>
+          <w:b/>
+        </w:rPr>
+        <w:t>Mechanism of harm.</w:t>
+      </w:r>
+      <w:r>
+        <w:t xml:space="preserve"> The seed is persona conditioning, a GENERATE edge at the assignment interface; the distinctive agentic harm is that interaction then </w:t>
+      </w:r>
+      <w:r>
+        <w:rPr>
+          <w:i/>
+        </w:rPr>
+        <w:t>amplifies</w:t>
+      </w:r>
+      <w:r>
+        <w:t xml:space="preserve"> what assignment generated, producing the one corpus-evidenced case of P3's super-additivity. Role assignment is thus doubly dangerous: it injects disparity and it wires the injected disparities into a network whose collective behavior is not predictable from its parts.</w:t>
+      </w:r>
+    </w:p>
+    <w:p>
+      <w:r>
+        <w:rPr>
+          <w:b/>
+        </w:rPr>
+        <w:t>Evidence: what is known.</w:t>
+      </w:r>
+      <w:r>
+        <w:t xml:space="preserve"> The amplification result at this locus is the best-replicated finding in the corpus concerning agentic-scale bias. Stereotypical bias emerges, propagates, and intensifies across a multi-agent system such that the collective is more biased than its members [nguyen2025social], and group-level fairness is formally non-inheritable from components [madigan2025emergent]. These two results are independent derivations of the same structural claim: composition under AMPLIFY violates the naive additivity of P1. A third line of evidence confirms that the mechanism scales: persona-induced bias grows from single agents to interacting societies [li2025from], and implicit bias surfaces specifically </w:t>
+      </w:r>
+      <w:r>
+        <w:rPr>
+          <w:i/>
+        </w:rPr>
+        <w:t>in the interaction</w:t>
+      </w:r>
+      <w:r>
+        <w:t xml:space="preserve"> between agents rather than in either agent alone [borah2024implicit]. Social hierarchy compounds the dynamics: rank shapes persuasion and anti-social behavior within the collective [campedelli2024want], which means the </w:t>
+      </w:r>
+      <w:r>
+        <w:rPr>
+          <w:i/>
+        </w:rPr>
+        <w:t>topology</w:t>
+      </w:r>
+      <w:r>
+        <w:t xml:space="preserve"> of the delegation network is not fairness-neutral even when each node's individual bias is held constant. At the entry edge, MALIBU provides the only purpose-built agentic benchmark and uncovers implicit bias specifically in multi-agent role assignments [mirza2025malibu], grounding the amplification claims in an instrumented setting rather than a post-hoc analysis.</w:t>
+      </w:r>
+    </w:p>
+    <w:p>
+      <w:r>
+        <w:rPr>
+          <w:b/>
+        </w:rPr>
+        <w:t>Evidence: what conflicts or is contested.</w:t>
+      </w:r>
+      <w:r>
+        <w:t xml:space="preserve"> The amplification direction is not inevitable. Anonymizing agent identities during structured debate reduces bias [choi2025identity], demonstrating that the AMPLIFY operator is installed by identity cues at the delegation edge, not by multi-agent coordination per se. Engineering the interaction protocol differently can reverse the operator entirely: multi-LLM interaction can be designed as a debiasing mechanism rather than an amplifier [owens2024multi], and structured debate can be steered toward equitable cultural alignment [ki2025multiple]. This creates a genuine tension in the literature: papers measuring naturalistic role assignment consistently find amplification, while papers that redesign the coordination protocol find attenuation. The conflict is not a contradiction but a boundary condition: AMPLIFY is the default under identity-bearing delegation, but it is contingent on the protocol, not structurally guaranteed. What remains contested is </w:t>
+      </w:r>
+      <w:r>
+        <w:rPr>
+          <w:i/>
+        </w:rPr>
+        <w:t>how much</w:t>
+      </w:r>
+      <w:r>
+        <w:t xml:space="preserve"> the topology and protocol contribute independently, since no study has held one fixed while varying the other. The amplification factor φ from [nguyen2025social] has been demonstrated but never bounded as a function of network structure, making it unclear whether sparse versus dense delegation graphs carry materially different fairness risk.</w:t>
+      </w:r>
+    </w:p>
+    <w:p>
+      <w:r>
+        <w:rPr>
+          <w:b/>
+        </w:rPr>
+        <w:t>Evidence: what transfers only by analogy.</w:t>
+      </w:r>
+      <w:r>
+        <w:t xml:space="preserve"> Two of the most cited results at this locus are single-turn or chatbot-derived and have not been measured on instrumented agentic pipelines. Assigning a persona induces implicit reasoning biases that degrade performance on tasks unrelated to the persona, making role assignment active bias injection rather than neutral scaffolding [gupta2023bias][†]. Persona assignment also multiplies toxic degeneration in chat settings [deshpande2023toxicity][†]. Both mechanisms are plausible at the agentic delegation edge and are consistent with [cao2026from]'s finding that biased chatbots conduct their bias into assigned agent roles (itself the primary bridge result at this locus, showing φ ≈ 1 across the role hand-off), but the counterfactual assignment-matrix measurement in a multi-agent trajectory has not been performed for either finding. The [†] markers here are therefore not ornamental: they identify the precise experiments still needed to convert mechanism evidence into locus-specific disparity estimates.</w:t>
+      </w:r>
+    </w:p>
+    <w:p>
+      <w:r>
+        <w:rPr>
+          <w:b/>
+        </w:rPr>
         <w:t>Open edge.</w:t>
       </w:r>
       <w:r>
-        <w:t xml:space="preserve"> Existing work measures </w:t>
+        <w:t xml:space="preserve"> Even with the amplification mechanism established, the </w:t>
       </w:r>
       <w:r>
         <w:rPr>
           <w:i/>
         </w:rPr>
-        <w:t>that</w:t>
-      </w:r>
-      <w:r>
-        <w:t xml:space="preserve"> selection skews; almost none measures whether the skew correlates with protected attributes of the user or subject under a counterfactual swap. A tool-selection-disparity metric (does swapping a profile's demographics change which API the agent calls, holding the query fixed?) exists in no benchmark; this is the Δ_tool instance of D2 that §4.3 formalizes.</w:t>
+        <w:t>delegation policy</w:t>
+      </w:r>
+      <w:r>
+        <w:t xml:space="preserve"> as a controllable fairness object remains unmeasured. There is no metric for assignment disparity in the sense of D2: does π_ctrl systematically route sensitive subtasks to lower-capability or more-biased sub-agents as a function of the subject's demographics, holding the task fixed under a counterfactual swap? The amplification coefficient φ at this locus is real, but without a delegation-matrix disparity metric it cannot be decomposed into the share attributable to the initial assignment versus the share produced by the subsequent interaction dynamics. This is precisely the Δ_c gap that §4.3 formalizes and that the MALIBU benchmark only partially addresses, since MALIBU measures outcome disparity per role but not the assignment distribution itself. The BCF conduction signature at this locus therefore has a measurable observable (the role/subtask assignment matrix across counterfactual pairs) that no published benchmark yet collects.</w:t>
       </w:r>
     </w:p>
     <w:p>
@@ -6128,7 +6530,7 @@
         <w:t>Entry:</w:t>
       </w:r>
       <w:r>
-        <w:t xml:space="preserve"> the π→T selection interface. </w:t>
+        <w:t xml:space="preserve"> the π_ctrl→{A_i} assignment interface. </w:t>
       </w:r>
       <w:r>
         <w:rPr>
@@ -6137,16 +6539,226 @@
         <w:t>Observable:</w:t>
       </w:r>
       <w:r>
-        <w:t xml:space="preserve"> tool-choice distribution across counterfactual input pairs. </w:t>
+        <w:t xml:space="preserve"> the role/subtask assignment matrix across counterfactual pairs, plus inter-agent message content. </w:t>
       </w:r>
       <w:r>
         <w:rPr>
           <w:i/>
         </w:rPr>
+        <w:t>Dominant outbound operators:</w:t>
+      </w:r>
+      <w:r>
+        <w:t xml:space="preserve"> GENERATE (persona injection) followed by AMPLIFY (interaction). This is the only locus where both agentic operators are corpus-evidenced together. </w:t>
+      </w:r>
+      <w:r>
+        <w:rPr>
+          <w:i/>
+        </w:rPr>
+        <w:t>Metric:</w:t>
+      </w:r>
+      <w:r>
+        <w:t xml:space="preserve"> assignment disparity over the delegation matrix (§4.3).</w:t>
+      </w:r>
+    </w:p>
+    <w:p>
+      <w:pPr>
+        <w:pStyle w:val="Heading2"/>
+      </w:pPr>
+      <w:r>
+        <w:t>3.4 Locus C4: Planning / Decomposition Disparities</w:t>
+      </w:r>
+    </w:p>
+    <w:p>
+      <w:r>
+        <w:rPr>
+          <w:b/>
+        </w:rPr>
+        <w:t>Definition.</w:t>
+      </w:r>
+      <w:r>
+        <w:t xml:space="preserve"> Agents plan: they decompose a goal into sub-goals, order steps, and reason explicitly (chain-of-thought, ReAct traces [yao2023react]) before acting. Planning bias is demographic disparity that enters during this reasoning/decomposition stage, in the </w:t>
+      </w:r>
+      <w:r>
+        <w:rPr>
+          <w:i/>
+        </w:rPr>
+        <w:t>plan</w:t>
+      </w:r>
+      <w:r>
+        <w:t>, not merely the final answer. By rule R2, allocation skew belongs here even when the allocation is over agent-flavored "team members."</w:t>
+      </w:r>
+    </w:p>
+    <w:p>
+      <w:r>
+        <w:rPr>
+          <w:b/>
+        </w:rPr>
+        <w:t>Mechanism of harm.</w:t>
+      </w:r>
+      <w:r>
+        <w:t xml:space="preserve"> The counterintuitive finding is that reasoning does not cleanly remove bias and can </w:t>
+      </w:r>
+      <w:r>
+        <w:rPr>
+          <w:i/>
+        </w:rPr>
+        <w:t>introduce</w:t>
+      </w:r>
+      <w:r>
+        <w:t xml:space="preserve"> it, a GENERATE edge inside π itself. Worse, this locus carries a distinctive P2 masking problem: the visible reasoning trace is not a faithful record of the features driving the decision, so auditing the </w:t>
+      </w:r>
+      <w:r>
+        <w:rPr>
+          <w:i/>
+        </w:rPr>
+        <w:t>stated</w:t>
+      </w:r>
+      <w:r>
+        <w:t xml:space="preserve"> plan can miss the disparity the plan encodes. A scope caution is warranted: whether LLM "plans" constitute planning in the classical sense is contested [kambhampati2024large], but the fairness question is indifferent to that debate. Whatever the decomposition step is computationally, it emits orderings and allocations that can be counterfactually disparate.</w:t>
+      </w:r>
+    </w:p>
+    <w:p>
+      <w:r>
+        <w:rPr>
+          <w:b/>
+        </w:rPr>
+        <w:t>Evidence and synthesis.</w:t>
+      </w:r>
+    </w:p>
+    <w:p>
+      <w:r>
+        <w:rPr>
+          <w:i/>
+        </w:rPr>
+        <w:t>What is known.</w:t>
+      </w:r>
+      <w:r>
+        <w:t xml:space="preserve"> The established, replicated mechanism is that deliberate reasoning is a GENERATE locus, not a sanitizing filter. The weight of evidence supports two related claims. First, explicit chain-of-thought reasoning changes social-bias outcomes relative to direct answering, and the change is adverse: [wu2025reasoning] demonstrates this in controlled comparisons where the reasoning-free baseline is less biased, not more, directly falsifying the intuition that "thinking step by step" provides a fairness dividend. Second, allocation-stage disparity is demonstrable at the plan object level rather than only at the final-output level: LLM-driven software-team composition produces demographically skewed role and task assignments, a planning-stage disparity with direct hiring adjacency [parziale2026once]. Together these establish that the GENERATE operator at C4 is not a boundary case but the dominant mode. Unlike C3 (where interaction then amplifies what role-assignment generates), C4 disparity appears to resolve principally at the GENERATE edge itself, without requiring a subsequent amplification step, which makes it structurally more like C1 (early-entry, conducted forward) than like C3 (entry plus amplification). The lever exists: reasoning-guided fine-tuning reduces bias at this locus [kabra2025reasoning], and fairness reward models can steer decision-making over the reasoning trace [hall2025guiding], both interventions consistent with P4 because they act precisely at the generating edge rather than downstream of it.</w:t>
+      </w:r>
+    </w:p>
+    <w:p>
+      <w:r>
+        <w:rPr>
+          <w:i/>
+        </w:rPr>
+        <w:t>What conflicts or is contested.</w:t>
+      </w:r>
+      <w:r>
+        <w:t xml:space="preserve"> Two tensions complicate the picture. First, the causal direction of the reasoning-bias relationship is not resolved. [wu2025reasoning] shows reasoning can worsen bias, but the comparison baseline matters: the effect depends on whether direct answering suppresses or merely conceals the disparity, and those two mechanisms have sharply different implications for auditing. If direct answering conceals, then reasoning makes the bias </w:t>
+      </w:r>
+      <w:r>
+        <w:rPr>
+          <w:i/>
+        </w:rPr>
+        <w:t>visible</w:t>
+      </w:r>
+      <w:r>
+        <w:t xml:space="preserve"> without increasing it, which would make the chain-of-thought trace a diagnostic asset rather than a liability. If reasoning genuinely generates disparity that a forward pass without explicit steps would not exhibit, then explicit planning is a fairness risk independent of the underlying model. The existing measurements do not cleanly separate these. Second, [zhou2025veracity] documents hidden veracity-linked beliefs surfacing </w:t>
+      </w:r>
+      <w:r>
+        <w:rPr>
+          <w:i/>
+        </w:rPr>
+        <w:t>during</w:t>
+      </w:r>
+      <w:r>
+        <w:t xml:space="preserve"> problem-solving, encoding demographic assumptions a final-answer probe would not detect. This result is consistent with both interpretations: reasoning as revealer or reasoning as generator. Until trace-replay (D2) is applied to hold the model's implicit beliefs constant across conditions and vary only the decomposition step, the two hypotheses remain confounded.</w:t>
+      </w:r>
+    </w:p>
+    <w:p>
+      <w:r>
+        <w:rPr>
+          <w:i/>
+        </w:rPr>
+        <w:t>What transfers only by analogy.</w:t>
+      </w:r>
+      <w:r>
+        <w:t xml:space="preserve"> The P2-masking problem at this locus depends critically on the finding that chain-of-thought explanations systematically misreport the biasing features that actually drive predictions [turpin2023language][†]. This result originates in single-turn classification and explanation settings, not in instrumented agentic plan traces. The transfer argument is that the same model occupying π in an agent produces unfaithful self-reports when generating rationales, as in the single-turn study, and therefore plan-trace audits at C4 inherit the same unreliability. That transfer is plausible but unmeasured: the degree to which multi-step plan generation is </w:t>
+      </w:r>
+      <w:r>
+        <w:rPr>
+          <w:i/>
+        </w:rPr>
+        <w:t>more</w:t>
+      </w:r>
+      <w:r>
+        <w:t xml:space="preserve"> or </w:t>
+      </w:r>
+      <w:r>
+        <w:rPr>
+          <w:i/>
+        </w:rPr>
+        <w:t>less</w:t>
+      </w:r>
+      <w:r>
+        <w:t xml:space="preserve"> faithful than single-step explanation is not known, and there is no agentic corpus study that validates the transfer directly. Similarly, the measurement reframing of [li2025actions][†], showing that agent </w:t>
+      </w:r>
+      <w:r>
+        <w:rPr>
+          <w:i/>
+        </w:rPr>
+        <w:t>decisions</w:t>
+      </w:r>
+      <w:r>
+        <w:t xml:space="preserve"> reveal implicit biases that text-level evaluation misses, provides the decisive motivation for plan-object auditing rather than trace-reading, but the original demonstration is in a simpler decision-making context rather than a full multi-step planning loop. The transferred conclusion (plan objects, not verbalized rationales, are the sound observables for C4) is well-motivated, but the agent-pipeline-specific validation has not been performed.</w:t>
+      </w:r>
+    </w:p>
+    <w:p>
+      <w:r>
+        <w:rPr>
+          <w:i/>
+        </w:rPr>
+        <w:t>What is unmeasured.</w:t>
+      </w:r>
+      <w:r>
+        <w:t xml:space="preserve"> The benchmark gap at this locus is the sharpest in the survey. No existing benchmark scores the </w:t>
+      </w:r>
+      <w:r>
+        <w:rPr>
+          <w:i/>
+        </w:rPr>
+        <w:t>plan itself</w:t>
+      </w:r>
+      <w:r>
+        <w:t xml:space="preserve"> as a fairness object: are the sub-goals, their ordering, or the resource allocation across plan steps a counterfactual function of the subject's demographics, independent of the final decision? Plan-allocation disparity (Δ_plan, §4.3) is observed in individual studies ([wu2025reasoning, parziale2026once]) but has not been operationalized as a reusable metric with standardized demographic perturbations and counterfactual controls. The conduction signature below specifies what such a metric must measure. Critically, the P2-masking problem means that this gap cannot be closed by trace-reading: any future plan-audit must be counterfactual-behavioral (D2 applied to plan objects, holding the underlying evidence context fixed and swapping demographic signals in the goal specification), not inspection of verbalized rationales. That design constraint, established by [turpin2023language][†]'s single-turn result and reinforced by [li2025actions][†], has not yet been absorbed into a benchmark design. The result is that C4 sits at maturity ●○○ (Table 1) despite documented real-world planning-stage harm in hiring-adjacent deployments: a measurement design problem, not a data availability problem.</w:t>
+      </w:r>
+    </w:p>
+    <w:p>
+      <w:r>
+        <w:rPr>
+          <w:b/>
+        </w:rPr>
+        <w:t>Conduction signature.</w:t>
+      </w:r>
+      <w:r>
+        <w:t xml:space="preserve"> </w:t>
+      </w:r>
+      <w:r>
+        <w:rPr>
+          <w:i/>
+        </w:rPr>
+        <w:t>Entry:</w:t>
+      </w:r>
+      <w:r>
+        <w:t xml:space="preserve"> within π, at the decomposition step. </w:t>
+      </w:r>
+      <w:r>
+        <w:rPr>
+          <w:i/>
+        </w:rPr>
+        <w:t>Observable:</w:t>
+      </w:r>
+      <w:r>
+        <w:t xml:space="preserve"> plan structure (step counts, ordering, allocations) across counterfactual pairs, not the verbalized rationale. </w:t>
+      </w:r>
+      <w:r>
+        <w:rPr>
+          <w:i/>
+        </w:rPr>
         <w:t>Dominant outbound operator:</w:t>
       </w:r>
       <w:r>
-        <w:t xml:space="preserve"> PRESERVE into C2/C4 (the chosen tool constrains all downstream evidence), with adversarial GENERATE at the registry. </w:t>
+        <w:t xml:space="preserve"> GENERATE, with strong P2 masking on the trace. </w:t>
       </w:r>
       <w:r>
         <w:rPr>
@@ -6155,7 +6767,7 @@
         <w:t>Metric:</w:t>
       </w:r>
       <w:r>
-        <w:t xml:space="preserve"> tool-invocation disparity (CFR over tool choice; §4.3).</w:t>
+        <w:t xml:space="preserve"> plan-allocation disparity and CFR over plan objects (§4.3).</w:t>
       </w:r>
     </w:p>
     <w:p>
@@ -6163,7 +6775,7 @@
         <w:pStyle w:val="Heading2"/>
       </w:pPr>
       <w:r>
-        <w:t>3.2 Locus C2: Memory &amp; Retrieval: Bias Injection and Accumulation</w:t>
+        <w:t>3.5 Locus C5: User Modeling &amp; Personalization Harms</w:t>
       </w:r>
     </w:p>
     <w:p>
@@ -6174,25 +6786,25 @@
         <w:t>Definition.</w:t>
       </w:r>
       <w:r>
-        <w:t xml:space="preserve"> Agents persist state (conversation history, scratchpad memory, retrieved documents, cross-session stores) and condition each step on that accumulated context. Memory-and-retrieval bias is the introduction, </w:t>
+        <w:t xml:space="preserve"> Agents infer a model of their user (preferences, identity, expertise) from names, dialect, stated traits, or interaction history, and tailor behavior accordingly. Personalization harm is the case where this inferred model produces </w:t>
       </w:r>
       <w:r>
         <w:rPr>
           <w:i/>
         </w:rPr>
-        <w:t>accumulation</w:t>
-      </w:r>
-      <w:r>
-        <w:t xml:space="preserve">, or amplification of demographic skew through this conditioning, distinct from any bias in a single isolated response. By rule R1, the locus covers what retrieved or remembered </w:t>
+        <w:t>worse, stereotyped, or differential</w:t>
+      </w:r>
+      <w:r>
+        <w:t xml:space="preserve"> treatment as a function of the (often inferred) protected attribute. By rule R3, this locus concerns the </w:t>
       </w:r>
       <w:r>
         <w:rPr>
           <w:i/>
         </w:rPr>
-        <w:t>content</w:t>
-      </w:r>
-      <w:r>
-        <w:t xml:space="preserve"> does; by rule R4, its time-indexed form (drift) is treated in §3.6.</w:t>
+        <w:t>interacting user</w:t>
+      </w:r>
+      <w:r>
+        <w:t>; subject-keyed disparities route through C1 to C4.</w:t>
       </w:r>
     </w:p>
     <w:p>
@@ -6203,25 +6815,25 @@
         <w:t>Mechanism of harm.</w:t>
       </w:r>
       <w:r>
-        <w:t xml:space="preserve"> Two sub-mechanisms operate, mapping cleanly onto BCF's two non-trivial operators. </w:t>
+        <w:t xml:space="preserve"> The core tension is personalization versus stereotyping. In BCF terms the locus is GENERATE-dominant in a structurally unusual way: the protected attribute itself may be </w:t>
       </w:r>
       <w:r>
         <w:rPr>
           <w:i/>
         </w:rPr>
-        <w:t>Retrieval injection</w:t>
-      </w:r>
-      <w:r>
-        <w:t xml:space="preserve"> is a GENERATE edge: grounding shifts the generator's distribution, so a disparity can appear that the closed-book model never exhibited. </w:t>
+        <w:t>created</w:t>
+      </w:r>
+      <w:r>
+        <w:t xml:space="preserve"> by the component (inferred, not supplied), so a counterfactual audit that only swaps explicit labels can miss the operative channel entirely. There is also a default-state harm that precedes any inference: even an unpersonalized model reflects the opinions of particular demographic strata, so the </w:t>
       </w:r>
       <w:r>
         <w:rPr>
           <w:i/>
         </w:rPr>
-        <w:t>Temporal accumulation</w:t>
-      </w:r>
-      <w:r>
-        <w:t xml:space="preserve"> is an AMPLIFY edge: each turn's context conditions the next, so per-turn skews compound. Critically, this locus inherits an entire prior discipline: fairness in ranking is a mature field with exposure-based and probability-based criteria and a decade of algorithms [zehlike2022fairness], and the LLM-era IR community has reframed those results as challenges for retrieval pipelines feeding generators [dai2024bias, dai2025trustworthy]. BCF makes the inheritance precise: a fair-ranking guarantee is a bound on Δ_c at the retrieval interface, but by P4 it bounds Δ_τ only if no downstream GENERATE edge re-introduces disparity, which is exactly what the RAG results below show can happen.</w:t>
+        <w:t>default user model</w:t>
+      </w:r>
+      <w:r>
+        <w:t xml:space="preserve"> is already skewed [santurkar2023whose][†], and personalization then moves users toward or away from a non-neutral baseline.</w:t>
       </w:r>
     </w:p>
     <w:p>
@@ -6229,58 +6841,132 @@
         <w:rPr>
           <w:b/>
         </w:rPr>
-        <w:t>Evidence, by operator.</w:t>
-      </w:r>
-    </w:p>
-    <w:p>
+        <w:t>What is known.</w:t>
+      </w:r>
+      <w:r>
+        <w:t xml:space="preserve"> The most robustly replicated finding at this locus is that demographic cues supplied at query time cause a system's adaptive behavior to track stereotypical group profiles rather than individually indicated preferences, collapsing the personalization-fidelity goal into stereotype instantiation. This mechanism is established across at least three distinct operationalizations. Identity signaling via explicit group labels biases chatbot recommendations toward stereotype rather than stated preference [kantharuban2024stereotype][†]. The trigger requires no explicit declaration: a name alone activates a presumed cultural identity that reshapes response content [pawar2025presumed]. And the inference can precede any signal from the user, because LLMs recover protected attributes (location, income, sex) from innocuous conversational text without any demographic prompt [staab2023memorization], meaning the agent has already modeled the user demographically before any adaptation begins. The convergence across these three cue types (label, name, inference from content) on the same directional finding, stereotype-tracking rather than preference-tracking, constitutes the strongest multi-source replication this locus offers.</w:t>
+      </w:r>
+    </w:p>
+    <w:p>
+      <w:r>
+        <w:t>Downstream harm from this mechanism has been observed across domain-specific evaluations. In education, personalized content delivery produces systematically different quality as a function of inferred student identity [weissburg2024llms]. In recommendation settings, consumer-facing LLM recommenders exhibit unequal recommendation utility across demographic groups [deldjoo2024cfairllm], a finding accompanied by a normative benchmarking framework for measuring it [deldjoo2024normative]. Socioeconomic bias embedded in base model representations supplies the latent material these personalization steps activate [arzaghi2024understanding]. A second replication strand concerns the alignment channel rather than the inference channel: reward models penalize African American Language [mire2025rejected], and reasoning performance degrades on non-standard dialects [lin2024assessing][†]. Because these disparities operate at locus R (the reward and alignment signal), they are PRESERVE-into-R in BCF terms, feeding directly into the feedback recurrence that §3.6 analyzes, so dialect penalties initiated at C5 are not bounded within C5.</w:t>
+      </w:r>
+    </w:p>
+    <w:p>
+      <w:r>
+        <w:rPr>
+          <w:b/>
+        </w:rPr>
+        <w:t>What conflicts or is contested.</w:t>
+      </w:r>
+      <w:r>
+        <w:t xml:space="preserve"> The field's principal empirical tension at this locus concerns cue-channel consistency. A systematic study of demographic cue modalities finds that name-based, explicit-label-based, and dialect-based probes of the same models yield inconsistent and sometimes contradictory conclusions about the presence and direction of personalization bias [tonneau2026different]. This result does more than caution against single-cue audits; it implies that papers in this locus are not measuring the same underlying quantity, so the apparent convergence noted above is partly artifactual. Studies using name cues may detect bias that label-based studies of the same model do not, or vice versa, and without multi-cue replication, the directional finding (stereotype over preference) is robust only within cue modality. A further contested point concerns the cost of mitigation: debiasing personalized models trades off against recommendation utility [vijjini2024exploring], which means that ATTENUATE interventions at this locus are not free in the way that, for example, filtering a retrieval set might be. The tradeoff magnitude has not been quantified across deployment contexts, and different utility definitions yield different tradeoff profiles, so no consensus on acceptable mitigation cost exists. Finally, the boundary between C5 and adjacent loci is contested by the inference result [staab2023memorization]: if the protected attribute is constructed by the model from non-demographic text, the operative locus may be the language model's latent representation (C0 baseline) rather than any explicit user-modeling step, and counterfactual swaps at the input surface may leave the inferred user model unchanged, making the standard D2 protocol inapplicable without modification.</w:t>
+      </w:r>
+    </w:p>
+    <w:p>
+      <w:r>
+        <w:rPr>
+          <w:b/>
+        </w:rPr>
+        <w:t>What transfers only by analogy.</w:t>
+      </w:r>
+      <w:r>
+        <w:t xml:space="preserve"> A substantial share of the mechanistic evidence at this locus was established in single-turn or chatbot settings and has not been reproduced in instrumented multi-step agents. The demonstration that identity signaling collapses adaptation into stereotyping [kantharuban2024stereotype][†] was conducted on a chatbot interface, not on a tool-using agent with persistent state. The dialect-reasoning penalty [lin2024assessing][†] was measured on benchmark QA tasks, not on agent planning or tool-selection traces. The baseline opinion-skew of the default user model [santurkar2023whose][†] was characterized through opinion-poll probing of a static LLM, not through behavioral observation of a personalized agent. These results are included because the mechanisms they document (stereotype activation via identity cues, dialect penalties conducted into evaluation, skewed baseline user model) are mechanistically operative in any system that adapts to user signals, including agents. However, the conduction paths from these single-turn observations to the GENERATE and PRESERVE operators of the BCF remain unverified by agent-level trace measurement. The [†] markers on these citations track this analogical status throughout.</w:t>
+      </w:r>
+    </w:p>
+    <w:p>
+      <w:r>
+        <w:rPr>
+          <w:b/>
+        </w:rPr>
+        <w:t>What is unmeasured.</w:t>
+      </w:r>
+      <w:r>
+        <w:t xml:space="preserve"> The most consequential open gap at this locus is the persistent user model: all available evidence concerns the disparity elicited within a single response or single turn, not the disparity accumulated and locked into the user representation an agent maintains and updates across sessions. An agent that interacts with a user repeatedly will form, update, and act on a profile that encodes earlier stereotype-triggered inferences, creating a form of within-agent institutionalized bias that single-response probing cannot detect. This is the object that bridges C5 to §3.6's recurrence, and it is unmeasured. No agentic benchmark in Table 2 instruments the user model as a persistent state object, varies the cue channel as a controlled factor across sessions, or measures how demographic inferences made early in an interaction propagate to consequential decisions made later. The inference channel [staab2023memorization] introduces a further measurement-theory problem: if the protected attribute is inferred from content rather than supplied as a cue, the standard D2 counterfactual swap (alter the cue at input, observe behavior change) fails to intervene on the operative variable. Defining a valid counterfactual for this case requires either a structural causal model of the inference process, which does not exist for any deployed agent, or a cue-channel-controlled experiment design of the kind that [tonneau2026different] recommends but that no agentic benchmark has yet implemented. C5 is therefore the locus where the BCF's D2 measurement procedure is hardest to operationalize, and the gap is tied directly to the GENERATE signature: bias that is internally constructed cannot be removed by swapping an external label.</w:t>
+      </w:r>
+    </w:p>
+    <w:p>
+      <w:r>
+        <w:rPr>
+          <w:b/>
+        </w:rPr>
+        <w:t>Open edge.</w:t>
+      </w:r>
+      <w:r>
+        <w:t xml:space="preserve"> Personalization harm has been measured in single responses, not over the </w:t>
+      </w:r>
       <w:r>
         <w:rPr>
           <w:i/>
         </w:rPr>
-        <w:t>GENERATE.</w:t>
-      </w:r>
-      <w:r>
-        <w:t xml:space="preserve"> RAG can </w:t>
+        <w:t>persistent user model</w:t>
+      </w:r>
+      <w:r>
+        <w:t xml:space="preserve"> an agent maintains across sessions, the object that bridges to §3.6; and no agentic benchmark varies the cue </w:t>
       </w:r>
       <w:r>
         <w:rPr>
           <w:i/>
         </w:rPr>
-        <w:t>undermine</w:t>
-      </w:r>
-      <w:r>
-        <w:t xml:space="preserve"> fairness even when retrieved documents are individually innocuous and even for users who actively prompt for fairness [hu2024free]; retrieval augmentation measurably changes social-bias levels relative to the closed-book model [zhang2025evaluating]; and the systematic evaluation of [wu2024rag] confirms the retrieval step itself (which corpus, which ranking) injects unfairness with the generator held fixed.</w:t>
-      </w:r>
-    </w:p>
-    <w:p>
+        <w:t>channel</w:t>
+      </w:r>
+      <w:r>
+        <w:t xml:space="preserve"> systematically despite [tonneau2026different] showing conclusions are cue-fragile. The inference channel [staab2023memorization] makes C5 the locus where D2's counterfactual swap is hardest to even define, an unresolved measurement-theory problem.</w:t>
+      </w:r>
+    </w:p>
+    <w:p>
+      <w:r>
+        <w:rPr>
+          <w:b/>
+        </w:rPr>
+        <w:t>Conduction signature.</w:t>
+      </w:r>
+      <w:r>
+        <w:t xml:space="preserve"> </w:t>
+      </w:r>
       <w:r>
         <w:rPr>
           <w:i/>
         </w:rPr>
-        <w:t>AMPLIFY.</w:t>
-      </w:r>
-      <w:r>
-        <w:t xml:space="preserve"> The adversarial extreme is knowledge-store poisoning that amplifies bias and steers downstream outputs [wang2025bias]. Benignly, accumulation amplifies: fairness degrades over multi-turn dialogue in ways single-turn tests miss [fan2024fairmt]; accumulating context literally shifts the model's beliefs as history grows [geng2025accumulating]; and conversational history "geometrically traps" the model, making early framings self-reinforcing [simhi2026old]. Position effects compound the problem: long-context models privilege the head and tail of the window [liu2023lost][†], so </w:t>
+        <w:t>Entry:</w:t>
+      </w:r>
+      <w:r>
+        <w:t xml:space="preserve"> the inferred user model inside π/M. </w:t>
       </w:r>
       <w:r>
         <w:rPr>
           <w:i/>
         </w:rPr>
-        <w:t>which</w:t>
-      </w:r>
-      <w:r>
-        <w:t xml:space="preserve"> remembered facts about a person get attended to is itself position-dependent and therefore skewable. Multi-agent conversation exhibits the same conversational-bias accumulation [coppolillo2025unmasking].</w:t>
-      </w:r>
-    </w:p>
-    <w:p>
+        <w:t>Observable:</w:t>
+      </w:r>
+      <w:r>
+        <w:t xml:space="preserve"> behavior divergence under cue-channel-controlled counterfactual swaps (name, dialect, label, history). </w:t>
+      </w:r>
       <w:r>
         <w:rPr>
           <w:i/>
         </w:rPr>
-        <w:t>ATTENUATE.</w:t>
-      </w:r>
-      <w:r>
-        <w:t xml:space="preserve"> The bias is partially controllable at the representation layer (tuning the embedder reduces RAG bias [kim2025mitigating]) and at the ranking layer, where applying fair-exposure ranking inside RAG changes, and can improve, both fairness and quality of the generated output [kim2024fair]. This is the most direct existing bridge between the fair-ranking tradition [zehlike2022fairness] and agentic pipelines.</w:t>
+        <w:t>Dominant outbound operator:</w:t>
+      </w:r>
+      <w:r>
+        <w:t xml:space="preserve"> GENERATE (the attribute is manufactured by inference), preserved into M and R. </w:t>
+      </w:r>
+      <w:r>
+        <w:rPr>
+          <w:i/>
+        </w:rPr>
+        <w:t>Metric:</w:t>
+      </w:r>
+      <w:r>
+        <w:t xml:space="preserve"> cue-conditioned MASD across channels (§4.2 to 4.3).</w:t>
+      </w:r>
+    </w:p>
+    <w:p>
+      <w:pPr>
+        <w:pStyle w:val="Heading2"/>
+      </w:pPr>
+      <w:r>
+        <w:t>3.6 The Temporal Axis: Long-Horizon Fairness Drift Over Trajectories</w:t>
       </w:r>
     </w:p>
     <w:p>
@@ -6288,37 +6974,57 @@
         <w:rPr>
           <w:b/>
         </w:rPr>
-        <w:t>Open edge.</w:t>
-      </w:r>
-      <w:r>
-        <w:t xml:space="preserve"> The field measures accumulation in </w:t>
+        <w:t>Definition.</w:t>
+      </w:r>
+      <w:r>
+        <w:t xml:space="preserve"> Long-horizon fairness drift is the </w:t>
       </w:r>
       <w:r>
         <w:rPr>
           <w:i/>
         </w:rPr>
-        <w:t>dialogue</w:t>
-      </w:r>
-      <w:r>
-        <w:t xml:space="preserve"> (FairMT-Bench) but not in </w:t>
+        <w:t>temporal</w:t>
+      </w:r>
+      <w:r>
+        <w:t xml:space="preserve"> degradation or self-amplification of fairness across turns, sessions, or deployment cycles, even when the per-step model is fixed.</w:t>
+      </w:r>
+    </w:p>
+    <w:p>
+      <w:r>
+        <w:rPr>
+          <w:b/>
+        </w:rPr>
+        <w:t>Why a temporal axis, not a sixth sibling.</w:t>
+      </w:r>
+      <w:r>
+        <w:t xml:space="preserve"> Earlier drafts of this taxonomy, and adjacent surveys, treat long-horizon drift as a sixth component alongside the five architectural loci. BCF makes precise why that is a category error, and rule R4 codifies the repair. A component, in D1, is a </w:t>
       </w:r>
       <w:r>
         <w:rPr>
           <w:i/>
         </w:rPr>
-        <w:t>agentic memory</w:t>
-      </w:r>
-      <w:r>
-        <w:t xml:space="preserve">, meaning long-lived, structured, cross-session stores with explicit write policies. Whether bias compounds faster under tool-augmented memory than under plain conversation is unmeasured, and no work yet audits the memory </w:t>
+        <w:t>place</w:t>
+      </w:r>
+      <w:r>
+        <w:t xml:space="preserve"> in the architecture with its own inputs and outputs; drift has no such place. There is no "drift module" to instrument: drift is what the feedback recurrence Δ^(t+1) = φ_fb·Δ^(t) + Δ_entry </w:t>
       </w:r>
       <w:r>
         <w:rPr>
           <w:i/>
         </w:rPr>
-        <w:t>write policy</w:t>
-      </w:r>
-      <w:r>
-        <w:t xml:space="preserve"> (what gets persisted about whom) as a fairness object in its own right.</w:t>
+        <w:t>does to any locus</w:t>
+      </w:r>
+      <w:r>
+        <w:t xml:space="preserve"> when the loop closes: memory bias drifting (C2 × t), a user model ossifying (C5 × t), delegation patterns entrenching (C3 × t), or the policy itself shifting under retraining on its own outputs (π × t through R). Treating drift as a sibling would double-count every time-indexed entry (violating P1's decomposition) and would imply the existence of a mitigation that targets "drift" as such, when by P4 every effective intervention must target a </w:t>
+      </w:r>
+      <w:r>
+        <w:rPr>
+          <w:i/>
+        </w:rPr>
+        <w:t>locus-and-edge</w:t>
+      </w:r>
+      <w:r>
+        <w:t>: either reducing some Δ_entry or forcing φ_fb &lt; 1. The taxonomy is therefore five architectural loci × one temporal axis: component × time made explicit. We retain the subsection at this rank because the temporal axis is where the field's least measured and most consequential phenomena live, not because it is a sixth place where bias enters.</w:t>
       </w:r>
     </w:p>
     <w:p>
@@ -6326,6 +7032,70 @@
         <w:rPr>
           <w:b/>
         </w:rPr>
+        <w:t>Mechanism of harm.</w:t>
+      </w:r>
+      <w:r>
+        <w:t xml:space="preserve"> Three nested loops realize φ_fb at increasing timescales, and all three are AMPLIFY-mode in the documented cases. The intra-trajectory loop (turn-level) operates within a single session as the context window accumulates a directional history. The inter-session loop operates across sessions as persistent memory (C2 × t) carries forward a biased state that conditions the next session's starting Δ_entry. The deployment loop operates across retraining cycles as the model policy π itself shifts when trained on its own synthetic outputs. Each nesting is an additive term in the feedback recurrence, and the literature documents each at a different empirical resolution: the intra-trajectory loop most directly, the deployment loop through analogy and small-scale experiment, the inter-session loop almost not at all.</w:t>
+      </w:r>
+    </w:p>
+    <w:p>
+      <w:r>
+        <w:rPr>
+          <w:b/>
+        </w:rPr>
+        <w:t>What is known.</w:t>
+      </w:r>
+      <w:r>
+        <w:t xml:space="preserve"> The most replicated mechanism on the T-axis is sycophantic conformity within a single multi-turn context. Fairness degrades over multi-turn dialogue [fan2024fairmt], and implicit bias accumulates and propagates specifically in LLM </w:t>
+      </w:r>
+      <w:r>
+        <w:rPr>
+          <w:i/>
+        </w:rPr>
+        <w:t>long-term memory</w:t>
+      </w:r>
+      <w:r>
+        <w:t>, making the agent more biased the longer it persists state [ma2026implicit] (the C2 × t cell). These two results together identify the locus (C2) and the operator (AMPLIFY) for the intra-trajectory loop: the state written to memory at turn t conditions the Δ_entry injected at turn t+1, so the recurrence is not merely metaphorical but traceable to a specific architectural feature. Sycophancy, the proximate mechanism, is also the mechanism with the most consistent cross-paper support at the intra-trajectory timescale. Multi-turn measurements document progressive conformity, labeled "truth decay," across turns [liu2025truth] and growth of sycophancy over extended dialogues [hong2025measuring]: both operationalize φ_fb &gt; 1 as a directly observable drift slope rather than an inferred parameter. At the deployment-loop timescale, the mechanism is self-consumption: training on a model's own synthetic outputs amplifies bias across generations [wyllie2024fairness], and the self-consuming performative loop has been characterized with proposed remedies for the LLM case specifically [wang2026observations]. The recommender-systems literature supplies the canonical prior result this work inherits: feedback-loop amplification in collaborative filtering is a documented, quantified phenomenon [mansoury2020feedback], and it establishes the theoretical plausibility of the same mechanism in any system that uses its own output distribution to shape future input.</w:t>
+      </w:r>
+    </w:p>
+    <w:p>
+      <w:r>
+        <w:rPr>
+          <w:b/>
+        </w:rPr>
+        <w:t>What conflicts or is contested.</w:t>
+      </w:r>
+      <w:r>
+        <w:t xml:space="preserve"> The core amplification finding is not contested at the sign level: all documented T-axis results report Δ^(t) rising, not falling, which is consistent with the φ_fb &gt; 1 regime. The contestation is quantitative and boundary-conditional. First, the magnitude of sycophantic drift is setup-dependent. Studies vary in how aggressively they simulate disagreement pressure, and the reported drift rates are not yet replicated across task types with matched stimuli; it remains unclear whether the same φ_fb obtains in low-stakes dialogue, consequential decision-support dialogue, and agentic tool-using settings, or whether the agent's action-committed loop (where each turn includes an irreversible tool call) amplifies more than a purely conversational loop. Second, the deployment-loop evidence is thin: [wyllie2024fairness] and [wang2026observations] work on LLM-generated text specifically, and the fairness implications are inferred rather than directly measured against a demographic counterfactual. The recommender analogy from [mansoury2020feedback] is well-founded but concerns a structurally simpler system; whether the same amplification rate transfers to the LLM policy case is an assumption, not a finding. Third, there is a tension between the intra-trajectory and inter-session loops that the literature does not resolve: it is possible (and consistent with existing data) that memory-cleared session boundaries reset Δ^(t), so the inter-session loop only amplifies if persistent memory is architecturally enabled. No study varies memory persistence as a controlled factor while measuring drift, so the relative contribution of the two timescales to long-run disparity is unknown.</w:t>
+      </w:r>
+    </w:p>
+    <w:p>
+      <w:r>
+        <w:rPr>
+          <w:b/>
+        </w:rPr>
+        <w:t>What transfers only by analogy.</w:t>
+      </w:r>
+      <w:r>
+        <w:t xml:space="preserve"> Sycophancy as a mechanism is well-documented at the single-turn and chatbot level, but the measurements that establish its origin in human-preference training [sharma2024understanding][†] are based on single-turn or short-context evaluations, not on instrumented agent loops with committed actions. Projecting that the same preference-optimization pressure produces the same drift rate in an action-taking agent is a motivated but untested inference: an agent whose sycophantic conformity leads it to invoke a biased tool or to escalate a claim under demographic pressure is a qualitatively different harm pathway than a chatbot that produces a more agreeable paragraph. Similarly, the formal sequential-fairness framework of [hu2022achieving][†] and the equal long-term benefit rate criterion of [xu2024adapting][†] were developed for explicit sequential decision processes with known transition dynamics, not for LLM agents whose transition function is a neural policy with opaque internal state. The theory proves that static per-step fairness constraints can fail over horizons and provides ATTENUATE-regime interventions in principle; none of those interventions has been implemented or tested in an LLM agent, so the applicability is analogy, not transfer. The simulation-based drift analysis tooling of [she2025fairsense][†] is similarly adjacent: it was designed for ML-enabled systems generically and has not been applied to an instrumented LLM agent trajectory.</w:t>
+      </w:r>
+    </w:p>
+    <w:p>
+      <w:r>
+        <w:rPr>
+          <w:b/>
+        </w:rPr>
+        <w:t>What is unmeasured.</w:t>
+      </w:r>
+      <w:r>
+        <w:t xml:space="preserve"> The central gap on the T-axis is the absence of any estimate of φ_fb for a deployed LLM agent. To estimate φ_fb, one needs: (a) a demographically instrumented agent with logged traces across turns or sessions, (b) a counterfactual replay protocol that holds the locus-specific input fixed while varying the temporal accumulation, and (c) a scalar disparity measure Δ^(t) that can be tracked as a time series. None of the three exists in a published evaluation. Equivalently, the sequential-fairness theory [hu2022achieving, xu2024adapting] and the LLM-drift empirics [fan2024fairmt, ma2026implicit] have not been joined: no work evaluates an LLM agent against a formal long-term-fairness criterion over a realistic multi-session deployment. The field therefore cannot yet answer the most consequential question the T-axis raises: whether the documented intra-trajectory drift (φ_fb &gt; 1, measured over tens of turns) compounds into materially disparate outcomes over realistic deployment durations (hundreds of sessions, one or more retraining cycles). The metric gap is specific: a drift-rate benchmark would need to report the slope of Δ^(t) across turns and sessions as a first-class evaluation output, the long-term benefit-rate gap [xu2024adapting] as a criterion against which that slope is evaluated, and a φ_fb point estimate with confidence bounds per locus. None of those metrics appears in any existing agent benchmark (Table 2, §4.4).</w:t>
+      </w:r>
+    </w:p>
+    <w:p>
+      <w:r>
+        <w:rPr>
+          <w:b/>
+        </w:rPr>
         <w:t>Conduction signature.</w:t>
       </w:r>
       <w:r>
@@ -6338,7 +7108,7 @@
         <w:t>Entry:</w:t>
       </w:r>
       <w:r>
-        <w:t xml:space="preserve"> the T/M→π conditioning interface. </w:t>
+        <w:t xml:space="preserve"> the R feedback edge (and time-indexed M). </w:t>
       </w:r>
       <w:r>
         <w:rPr>
@@ -6347,16 +7117,16 @@
         <w:t>Observable:</w:t>
       </w:r>
       <w:r>
-        <w:t xml:space="preserve"> divergence of retrieved sets and memory states across counterfactual pairs. </w:t>
+        <w:t xml:space="preserve"> the trajectory of Δ^(t), its slope and curvature across turns, sessions, retraining cycles. </w:t>
       </w:r>
       <w:r>
         <w:rPr>
           <w:i/>
         </w:rPr>
-        <w:t>Dominant outbound operator:</w:t>
-      </w:r>
-      <w:r>
-        <w:t xml:space="preserve"> AMPLIFY (accumulation across turns), with GENERATE at the grounding edge. </w:t>
+        <w:t>Dominant operator:</w:t>
+      </w:r>
+      <w:r>
+        <w:t xml:space="preserve"> AMPLIFY (the recurrence). </w:t>
       </w:r>
       <w:r>
         <w:rPr>
@@ -6365,1285 +7135,7 @@
         <w:t>Metric:</w:t>
       </w:r>
       <w:r>
-        <w:t xml:space="preserve"> retrieval-set disparity plus the per-turn slope of Δ^(t) (§4.3).</w:t>
-      </w:r>
-    </w:p>
-    <w:p>
-      <w:pPr>
-        <w:pStyle w:val="Heading2"/>
-      </w:pPr>
-      <w:r>
-        <w:t>3.3 Locus C3: Multi-Agent Delegation &amp; Role Assignment</w:t>
-      </w:r>
-    </w:p>
-    <w:p>
-      <w:r>
-        <w:rPr>
-          <w:b/>
-        </w:rPr>
-        <w:t>Definition.</w:t>
-      </w:r>
-      <w:r>
-        <w:t xml:space="preserve"> In multi-agent systems a controller π_ctrl assigns subtasks, personas, or roles to constituent agents and routes information among them [wu2023autogen, guo2024large, qian2024chatdev]. Delegation bias is disparity introduced by </w:t>
-      </w:r>
-      <w:r>
-        <w:rPr>
-          <w:i/>
-        </w:rPr>
-        <w:t>who is assigned what</w:t>
-      </w:r>
-      <w:r>
-        <w:t xml:space="preserve"> and by the social dynamics that emerge among role-bearing agents, over and above any single agent's bias. By rule R2, identity-cue effects sit here; identity-free task-cutting sits in C4.</w:t>
-      </w:r>
-    </w:p>
-    <w:p>
-      <w:r>
-        <w:rPr>
-          <w:b/>
-        </w:rPr>
-        <w:t>Mechanism of harm.</w:t>
-      </w:r>
-      <w:r>
-        <w:t xml:space="preserve"> The seed is persona conditioning, a GENERATE edge at the assignment interface; the distinctive agentic harm is that interaction then </w:t>
-      </w:r>
-      <w:r>
-        <w:rPr>
-          <w:i/>
-        </w:rPr>
-        <w:t>amplifies</w:t>
-      </w:r>
-      <w:r>
-        <w:t xml:space="preserve"> what assignment generated, producing the one corpus-evidenced case of P3's super-additivity. Role assignment is thus doubly dangerous: it injects disparity and it wires the injected disparities into a network whose collective behavior is not predictable from its parts.</w:t>
-      </w:r>
-    </w:p>
-    <w:p>
-      <w:r>
-        <w:rPr>
-          <w:b/>
-        </w:rPr>
-        <w:t>Evidence, by operator.</w:t>
-      </w:r>
-    </w:p>
-    <w:p>
-      <w:r>
-        <w:rPr>
-          <w:i/>
-        </w:rPr>
-        <w:t>GENERATE.</w:t>
-      </w:r>
-      <w:r>
-        <w:t xml:space="preserve"> Merely assigning a persona induces implicit reasoning biases that degrade performance on tasks unrelated to the persona; role assignment is active bias injection, not neutral scaffolding [gupta2023bias][†]. Persona assignment also multiplies toxic degeneration in chat settings [deshpande2023toxicity][†]. Benchmarked agentically, MALIBU uncovers implicit bias specifically in multi-agent role assignments [mirza2025malibu].</w:t>
-      </w:r>
-    </w:p>
-    <w:p>
-      <w:r>
-        <w:rPr>
-          <w:i/>
-        </w:rPr>
-        <w:t>PRESERVE.</w:t>
-      </w:r>
-      <w:r>
-        <w:t xml:space="preserve"> The chatbot-to-agent edge conducts: biased chatbots become biased agents through their assigned roles, with role assignment also degrading reliability [cao2026from]. This is direct evidence that φ ≈ 1 across the role hand-off, which is what licenses the [†]-transfers above as mechanism evidence.</w:t>
-      </w:r>
-    </w:p>
-    <w:p>
-      <w:r>
-        <w:rPr>
-          <w:i/>
-        </w:rPr>
-        <w:t>AMPLIFY.</w:t>
-      </w:r>
-      <w:r>
-        <w:t xml:space="preserve"> The central result is that stereotypical bias </w:t>
-      </w:r>
-      <w:r>
-        <w:rPr>
-          <w:i/>
-        </w:rPr>
-        <w:t>emerges, propagates, and is amplified</w:t>
-      </w:r>
-      <w:r>
-        <w:t xml:space="preserve"> across a multi-agent system, making the collective more biased than its members [nguyen2025social]; emergent fairness in multi-agent decision systems is formally not inherited from components [madigan2025emergent]; persona-induced bias scales from single agents to interacting societies [li2025from]; implicit bias surfaces specifically </w:t>
-      </w:r>
-      <w:r>
-        <w:rPr>
-          <w:i/>
-        </w:rPr>
-        <w:t>in the interaction</w:t>
-      </w:r>
-      <w:r>
-        <w:t xml:space="preserve"> between agents [borah2024implicit]; and social hierarchy modulates the dynamics, with rank shaping persuasion and anti-social behavior [campedelli2024want].</w:t>
-      </w:r>
-    </w:p>
-    <w:p>
-      <w:r>
-        <w:rPr>
-          <w:i/>
-        </w:rPr>
-        <w:t>ATTENUATE.</w:t>
-      </w:r>
-      <w:r>
-        <w:t xml:space="preserve"> The mechanism is confirmed by its inverse: </w:t>
-      </w:r>
-      <w:r>
-        <w:rPr>
-          <w:i/>
-        </w:rPr>
-        <w:t>anonymizing</w:t>
-      </w:r>
-      <w:r>
-        <w:t xml:space="preserve"> agent identities in debate reduces bias [choi2025identity]. The disparity is caused by identity cues at the delegation edge, so deleting the cues installs φ &lt; 1 (P4 in action). Structured debate can also be steered toward equitable cultural alignment [ki2025multiple], and multi-LLM interaction can be engineered as a debiasing mechanism rather than an amplifier [owens2024multi]: the same edge, opposite operator, depending on protocol design.</w:t>
-      </w:r>
-    </w:p>
-    <w:p>
-      <w:r>
-        <w:rPr>
-          <w:b/>
-        </w:rPr>
-        <w:t>Open edge.</w:t>
-      </w:r>
-      <w:r>
-        <w:t xml:space="preserve"> Evidence is rich on </w:t>
-      </w:r>
-      <w:r>
-        <w:rPr>
-          <w:i/>
-        </w:rPr>
-        <w:t>whether</w:t>
-      </w:r>
-      <w:r>
-        <w:t xml:space="preserve"> multi-agent setups amplify bias but thin on the </w:t>
-      </w:r>
-      <w:r>
-        <w:rPr>
-          <w:i/>
-        </w:rPr>
-        <w:t>delegation policy</w:t>
-      </w:r>
-      <w:r>
-        <w:t xml:space="preserve"> as a controllable knob. There is no metric for assignment disparity (does π_ctrl systematically route sensitive subtasks to lower-capability or more-biased sub-agents as a function of the subject's demographics?), and the amplification factor φ in [nguyen2025social] has been demonstrated but never </w:t>
-      </w:r>
-      <w:r>
-        <w:rPr>
-          <w:i/>
-        </w:rPr>
-        <w:t>bounded</w:t>
-      </w:r>
-      <w:r>
-        <w:t xml:space="preserve"> as a function of network topology or protocol.</w:t>
-      </w:r>
-    </w:p>
-    <w:p>
-      <w:r>
-        <w:rPr>
-          <w:b/>
-        </w:rPr>
-        <w:t>Conduction signature.</w:t>
-      </w:r>
-      <w:r>
-        <w:t xml:space="preserve"> </w:t>
-      </w:r>
-      <w:r>
-        <w:rPr>
-          <w:i/>
-        </w:rPr>
-        <w:t>Entry:</w:t>
-      </w:r>
-      <w:r>
-        <w:t xml:space="preserve"> the π_ctrl→{A_i} assignment interface. </w:t>
-      </w:r>
-      <w:r>
-        <w:rPr>
-          <w:i/>
-        </w:rPr>
-        <w:t>Observable:</w:t>
-      </w:r>
-      <w:r>
-        <w:t xml:space="preserve"> the role/subtask assignment matrix across counterfactual pairs, plus inter-agent message content. </w:t>
-      </w:r>
-      <w:r>
-        <w:rPr>
-          <w:i/>
-        </w:rPr>
-        <w:t>Dominant outbound operators:</w:t>
-      </w:r>
-      <w:r>
-        <w:t xml:space="preserve"> GENERATE (persona injection) followed by AMPLIFY (interaction). This is the only locus where both agentic operators are corpus-evidenced together. </w:t>
-      </w:r>
-      <w:r>
-        <w:rPr>
-          <w:i/>
-        </w:rPr>
-        <w:t>Metric:</w:t>
-      </w:r>
-      <w:r>
-        <w:t xml:space="preserve"> assignment disparity over the delegation matrix (§4.3).</w:t>
-      </w:r>
-    </w:p>
-    <w:p>
-      <w:pPr>
-        <w:pStyle w:val="Heading2"/>
-      </w:pPr>
-      <w:r>
-        <w:t>3.4 Locus C4: Planning / Decomposition Disparities</w:t>
-      </w:r>
-    </w:p>
-    <w:p>
-      <w:r>
-        <w:rPr>
-          <w:b/>
-        </w:rPr>
-        <w:t>Definition.</w:t>
-      </w:r>
-      <w:r>
-        <w:t xml:space="preserve"> Agents plan: they decompose a goal into sub-goals, order steps, and reason explicitly (chain-of-thought, ReAct traces [yao2023react]) before acting. Planning bias is demographic disparity that enters during this reasoning/decomposition stage, in the </w:t>
-      </w:r>
-      <w:r>
-        <w:rPr>
-          <w:i/>
-        </w:rPr>
-        <w:t>plan</w:t>
-      </w:r>
-      <w:r>
-        <w:t>, not merely the final answer. By rule R2, allocation skew belongs here even when the allocation is over agent-flavored "team members."</w:t>
-      </w:r>
-    </w:p>
-    <w:p>
-      <w:r>
-        <w:rPr>
-          <w:b/>
-        </w:rPr>
-        <w:t>Mechanism of harm.</w:t>
-      </w:r>
-      <w:r>
-        <w:t xml:space="preserve"> The counterintuitive finding is that reasoning does not cleanly remove bias and can </w:t>
-      </w:r>
-      <w:r>
-        <w:rPr>
-          <w:i/>
-        </w:rPr>
-        <w:t>introduce</w:t>
-      </w:r>
-      <w:r>
-        <w:t xml:space="preserve"> it, a GENERATE edge inside π itself. Worse, this locus carries a distinctive P2 masking problem: the visible reasoning trace is not a faithful record of the features driving the decision, so auditing the </w:t>
-      </w:r>
-      <w:r>
-        <w:rPr>
-          <w:i/>
-        </w:rPr>
-        <w:t>stated</w:t>
-      </w:r>
-      <w:r>
-        <w:t xml:space="preserve"> plan can miss the disparity the plan encodes. A scope caution is warranted: whether LLM "plans" constitute planning in the classical sense is contested [kambhampati2024large], but the fairness question is indifferent to that debate. Whatever the decomposition step is computationally, it emits orderings and allocations that can be counterfactually disparate.</w:t>
-      </w:r>
-    </w:p>
-    <w:p>
-      <w:r>
-        <w:rPr>
-          <w:b/>
-        </w:rPr>
-        <w:t>Evidence, by operator.</w:t>
-      </w:r>
-    </w:p>
-    <w:p>
-      <w:r>
-        <w:rPr>
-          <w:i/>
-        </w:rPr>
-        <w:t>GENERATE.</w:t>
-      </w:r>
-      <w:r>
-        <w:t xml:space="preserve"> Adding explicit reasoning changes, and can worsen, social-bias outcomes relative to direct answering [wu2025reasoning]; hidden veracity-linked beliefs surface </w:t>
-      </w:r>
-      <w:r>
-        <w:rPr>
-          <w:i/>
-        </w:rPr>
-        <w:t>during</w:t>
-      </w:r>
-      <w:r>
-        <w:t xml:space="preserve"> problem-solving reasoning, encoding demographic assumptions a final-answer probe would not detect [zhou2025veracity]; and in LLM-driven software-team composition, the planner allocates roles and tasks with demographic skew, a planning-stage disparity with direct hiring adjacency [parziale2026once].</w:t>
-      </w:r>
-    </w:p>
-    <w:p>
-      <w:r>
-        <w:rPr>
-          <w:i/>
-        </w:rPr>
-        <w:t>Masking (P2).</w:t>
-      </w:r>
-      <w:r>
-        <w:t xml:space="preserve"> Chain-of-thought explanations systematically misreport the biasing features that actually drive predictions [turpin2023language][†], so a trace that </w:t>
-      </w:r>
-      <w:r>
-        <w:rPr>
-          <w:i/>
-        </w:rPr>
-        <w:t>reads</w:t>
-      </w:r>
-      <w:r>
-        <w:t xml:space="preserve"> fair can implement a disparate decision procedure. Combined with the decisive measurement reframing of [li2025actions] (agent </w:t>
-      </w:r>
-      <w:r>
-        <w:rPr>
-          <w:i/>
-        </w:rPr>
-        <w:t>decisions</w:t>
-      </w:r>
-      <w:r>
-        <w:t xml:space="preserve"> reveal implicit biases that text-level evaluation misses), this locus is doubly hidden: neither the answer nor the stated reasoning is a sound observable. Only the counterfactual structure of the plan (D2 applied to plan objects) is.</w:t>
-      </w:r>
-    </w:p>
-    <w:p>
-      <w:r>
-        <w:rPr>
-          <w:i/>
-        </w:rPr>
-        <w:t>ATTENUATE.</w:t>
-      </w:r>
-      <w:r>
-        <w:t xml:space="preserve"> The same stage is a lever: reasoning-guided fine-tuning reduces bias [kabra2025reasoning], and fairness reward models can steer decision-making over the reasoning trace [hall2025guiding], interventions that act </w:t>
-      </w:r>
-      <w:r>
-        <w:rPr>
-          <w:i/>
-        </w:rPr>
-        <w:t>at</w:t>
-      </w:r>
-      <w:r>
-        <w:t xml:space="preserve"> the generating edge, as P4 prescribes.</w:t>
-      </w:r>
-    </w:p>
-    <w:p>
-      <w:r>
-        <w:rPr>
-          <w:b/>
-        </w:rPr>
-        <w:t>Open edge.</w:t>
-      </w:r>
-      <w:r>
-        <w:t xml:space="preserve"> No benchmark scores the </w:t>
-      </w:r>
-      <w:r>
-        <w:rPr>
-          <w:i/>
-        </w:rPr>
-        <w:t>plan itself</w:t>
-      </w:r>
-      <w:r>
-        <w:t xml:space="preserve"> for disparity: are the sub-goals, their ordering, or the resource allocation a counterfactual function of the subject's demographics, independent of the final decision? Plan-allocation disparity is observed paper-by-paper but not operationalized; and by [turpin2023language] any future plan-audit must be counterfactual-behavioral rather than trace-reading, a design constraint the field has not yet absorbed.</w:t>
-      </w:r>
-    </w:p>
-    <w:p>
-      <w:r>
-        <w:rPr>
-          <w:b/>
-        </w:rPr>
-        <w:t>Conduction signature.</w:t>
-      </w:r>
-      <w:r>
-        <w:t xml:space="preserve"> </w:t>
-      </w:r>
-      <w:r>
-        <w:rPr>
-          <w:i/>
-        </w:rPr>
-        <w:t>Entry:</w:t>
-      </w:r>
-      <w:r>
-        <w:t xml:space="preserve"> within π, at the decomposition step. </w:t>
-      </w:r>
-      <w:r>
-        <w:rPr>
-          <w:i/>
-        </w:rPr>
-        <w:t>Observable:</w:t>
-      </w:r>
-      <w:r>
-        <w:t xml:space="preserve"> plan structure (step counts, ordering, allocations) across counterfactual pairs, not the verbalized rationale. </w:t>
-      </w:r>
-      <w:r>
-        <w:rPr>
-          <w:i/>
-        </w:rPr>
-        <w:t>Dominant outbound operator:</w:t>
-      </w:r>
-      <w:r>
-        <w:t xml:space="preserve"> GENERATE, with strong P2 masking on the trace. </w:t>
-      </w:r>
-      <w:r>
-        <w:rPr>
-          <w:i/>
-        </w:rPr>
-        <w:t>Metric:</w:t>
-      </w:r>
-      <w:r>
-        <w:t xml:space="preserve"> plan-allocation disparity and CFR over plan objects (§4.3).</w:t>
-      </w:r>
-    </w:p>
-    <w:p>
-      <w:pPr>
-        <w:pStyle w:val="Heading2"/>
-      </w:pPr>
-      <w:r>
-        <w:t>3.5 Locus C5: User Modeling &amp; Personalization Harms</w:t>
-      </w:r>
-    </w:p>
-    <w:p>
-      <w:r>
-        <w:rPr>
-          <w:b/>
-        </w:rPr>
-        <w:t>Definition.</w:t>
-      </w:r>
-      <w:r>
-        <w:t xml:space="preserve"> Agents infer a model of their user (preferences, identity, expertise) from names, dialect, stated traits, or interaction history, and tailor behavior accordingly. Personalization harm is the case where this inferred model produces </w:t>
-      </w:r>
-      <w:r>
-        <w:rPr>
-          <w:i/>
-        </w:rPr>
-        <w:t>worse, stereotyped, or differential</w:t>
-      </w:r>
-      <w:r>
-        <w:t xml:space="preserve"> treatment as a function of the (often inferred) protected attribute. By rule R3, this locus concerns the </w:t>
-      </w:r>
-      <w:r>
-        <w:rPr>
-          <w:i/>
-        </w:rPr>
-        <w:t>interacting user</w:t>
-      </w:r>
-      <w:r>
-        <w:t>; subject-keyed disparities route through C1 to C4.</w:t>
-      </w:r>
-    </w:p>
-    <w:p>
-      <w:r>
-        <w:rPr>
-          <w:b/>
-        </w:rPr>
-        <w:t>Mechanism of harm.</w:t>
-      </w:r>
-      <w:r>
-        <w:t xml:space="preserve"> The core tension is personalization versus stereotyping. In BCF terms the locus is GENERATE-dominant in a structurally unusual way: the protected attribute itself may be </w:t>
-      </w:r>
-      <w:r>
-        <w:rPr>
-          <w:i/>
-        </w:rPr>
-        <w:t>created</w:t>
-      </w:r>
-      <w:r>
-        <w:t xml:space="preserve"> by the component (inferred, not supplied), so a counterfactual audit that only swaps explicit labels can miss the operative channel entirely. There is also a default-state harm that precedes any inference: even an unpersonalized model reflects the opinions of particular demographic strata, so the </w:t>
-      </w:r>
-      <w:r>
-        <w:rPr>
-          <w:i/>
-        </w:rPr>
-        <w:t>default user model</w:t>
-      </w:r>
-      <w:r>
-        <w:t xml:space="preserve"> is already skewed [santurkar2023whose][†], and personalization then moves users toward or away from a non-neutral baseline.</w:t>
-      </w:r>
-    </w:p>
-    <w:p>
-      <w:r>
-        <w:rPr>
-          <w:b/>
-        </w:rPr>
-        <w:t>Evidence, by operator.</w:t>
-      </w:r>
-    </w:p>
-    <w:p>
-      <w:r>
-        <w:rPr>
-          <w:i/>
-        </w:rPr>
-        <w:t>GENERATE.</w:t>
-      </w:r>
-      <w:r>
-        <w:t xml:space="preserve"> Signaling user identity biases chatbot recommendations toward stereotype rather than genuine preference, collapsing adaptation into stereotyping [kantharuban2024stereotype][†]. The trigger can be a mere name, which cues a presumed cultural identity that reshapes responses [pawar2025presumed]; and the privacy precondition is established by the demonstration that LLMs </w:t>
-      </w:r>
-      <w:r>
-        <w:rPr>
-          <w:i/>
-        </w:rPr>
-        <w:t>infer</w:t>
-      </w:r>
-      <w:r>
-        <w:t xml:space="preserve"> protected attributes (location, income, sex) from innocuous text [staab2023memorization], so an agent can model a user demographically without ever being told. The harm spans domains: personalized education delivers systematically different content quality by inferred student identity [weissburg2024llms]; consumer-fairness evaluations of LLM recommenders find unequal recommendation utility across groups [deldjoo2024cfairllm], with a normative benchmarking framework following [deldjoo2024normative]; and intrinsic socioeconomic bias supplies latent material for personalization to activate [arzaghi2024understanding].</w:t>
-      </w:r>
-    </w:p>
-    <w:p>
-      <w:r>
-        <w:rPr>
-          <w:i/>
-        </w:rPr>
-        <w:t>PRESERVE (into the alignment signal).</w:t>
-      </w:r>
-      <w:r>
-        <w:t xml:space="preserve"> Dialect is a second channel and shows conduction into training: reasoning performance drops on non-standard dialects [lin2024assessing][†], and reward models penalize African American Language [mire2025rejected]. The disparity is preserved </w:t>
-      </w:r>
-      <w:r>
-        <w:rPr>
-          <w:i/>
-        </w:rPr>
-        <w:t>into R</w:t>
-      </w:r>
-      <w:r>
-        <w:t>, the feedback channel, where §3.6's recurrence takes over.</w:t>
-      </w:r>
-    </w:p>
-    <w:p>
-      <w:r>
-        <w:rPr>
-          <w:i/>
-        </w:rPr>
-        <w:t>Method cautions.</w:t>
-      </w:r>
-      <w:r>
-        <w:t xml:space="preserve"> Different demographic cue channels (name vs. explicit label vs. dialect) yield inconsistent conclusions about personalization bias, so single-cue audits can mislead [tonneau2026different], the empirical core of P5's adequacy demand; and debiasing personalized models trades off against utility [vijjini2024exploring], so ATTENUATE edges here are not free.</w:t>
-      </w:r>
-    </w:p>
-    <w:p>
-      <w:r>
-        <w:rPr>
-          <w:b/>
-        </w:rPr>
-        <w:t>Open edge.</w:t>
-      </w:r>
-      <w:r>
-        <w:t xml:space="preserve"> Personalization harm has been measured in single responses, not over the </w:t>
-      </w:r>
-      <w:r>
-        <w:rPr>
-          <w:i/>
-        </w:rPr>
-        <w:t>persistent user model</w:t>
-      </w:r>
-      <w:r>
-        <w:t xml:space="preserve"> an agent maintains across sessions, the object that bridges to §3.6; and no agentic benchmark varies the cue </w:t>
-      </w:r>
-      <w:r>
-        <w:rPr>
-          <w:i/>
-        </w:rPr>
-        <w:t>channel</w:t>
-      </w:r>
-      <w:r>
-        <w:t xml:space="preserve"> systematically despite [tonneau2026different] showing conclusions are cue-fragile. The inference channel [staab2023memorization] makes C5 the locus where D2's counterfactual swap is hardest to even define, an unresolved measurement-theory problem.</w:t>
-      </w:r>
-    </w:p>
-    <w:p>
-      <w:r>
-        <w:rPr>
-          <w:b/>
-        </w:rPr>
-        <w:t>Conduction signature.</w:t>
-      </w:r>
-      <w:r>
-        <w:t xml:space="preserve"> </w:t>
-      </w:r>
-      <w:r>
-        <w:rPr>
-          <w:i/>
-        </w:rPr>
-        <w:t>Entry:</w:t>
-      </w:r>
-      <w:r>
-        <w:t xml:space="preserve"> the inferred user model inside π/M. </w:t>
-      </w:r>
-      <w:r>
-        <w:rPr>
-          <w:i/>
-        </w:rPr>
-        <w:t>Observable:</w:t>
-      </w:r>
-      <w:r>
-        <w:t xml:space="preserve"> behavior divergence under cue-channel-controlled counterfactual swaps (name, dialect, label, history). </w:t>
-      </w:r>
-      <w:r>
-        <w:rPr>
-          <w:i/>
-        </w:rPr>
-        <w:t>Dominant outbound operator:</w:t>
-      </w:r>
-      <w:r>
-        <w:t xml:space="preserve"> GENERATE (the attribute is manufactured by inference), preserved into M and R. </w:t>
-      </w:r>
-      <w:r>
-        <w:rPr>
-          <w:i/>
-        </w:rPr>
-        <w:t>Metric:</w:t>
-      </w:r>
-      <w:r>
-        <w:t xml:space="preserve"> cue-conditioned MASD across channels (§4.2 to 4.3).</w:t>
-      </w:r>
-    </w:p>
-    <w:p>
-      <w:pPr>
-        <w:pStyle w:val="Heading2"/>
-      </w:pPr>
-      <w:r>
-        <w:t>3.6 The Temporal Axis: Long-Horizon Fairness Drift Over Trajectories</w:t>
-      </w:r>
-    </w:p>
-    <w:p>
-      <w:r>
-        <w:rPr>
-          <w:b/>
-        </w:rPr>
-        <w:t>Definition.</w:t>
-      </w:r>
-      <w:r>
-        <w:t xml:space="preserve"> Long-horizon fairness drift is the </w:t>
-      </w:r>
-      <w:r>
-        <w:rPr>
-          <w:i/>
-        </w:rPr>
-        <w:t>temporal</w:t>
-      </w:r>
-      <w:r>
-        <w:t xml:space="preserve"> degradation or self-amplification of fairness across turns, sessions, or deployment cycles, even when the per-step model is fixed.</w:t>
-      </w:r>
-    </w:p>
-    <w:p>
-      <w:r>
-        <w:rPr>
-          <w:b/>
-        </w:rPr>
-        <w:t>Why a temporal axis, not a sixth sibling.</w:t>
-      </w:r>
-      <w:r>
-        <w:t xml:space="preserve"> Earlier drafts of this taxonomy, and adjacent surveys, treat long-horizon drift as a sixth component alongside the five architectural loci. BCF makes precise why that is a category error, and rule R4 codifies the repair. A component, in D1, is a </w:t>
-      </w:r>
-      <w:r>
-        <w:rPr>
-          <w:i/>
-        </w:rPr>
-        <w:t>place</w:t>
-      </w:r>
-      <w:r>
-        <w:t xml:space="preserve"> in the architecture with its own inputs and outputs; drift has no such place. There is no "drift module" to instrument: drift is what the feedback recurrence Δ^(t+1) = φ_fb·Δ^(t) + Δ_entry </w:t>
-      </w:r>
-      <w:r>
-        <w:rPr>
-          <w:i/>
-        </w:rPr>
-        <w:t>does to any locus</w:t>
-      </w:r>
-      <w:r>
-        <w:t xml:space="preserve"> when the loop closes: memory bias drifting (C2 × t), a user model ossifying (C5 × t), delegation patterns entrenching (C3 × t), or the policy itself shifting under retraining on its own outputs (π × t through R). Treating drift as a sibling would double-count every time-indexed entry (violating P1's decomposition) and would imply the existence of a mitigation that targets "drift" as such, when by P4 every effective intervention must target a </w:t>
-      </w:r>
-      <w:r>
-        <w:rPr>
-          <w:i/>
-        </w:rPr>
-        <w:t>locus-and-edge</w:t>
-      </w:r>
-      <w:r>
-        <w:t>: either reducing some Δ_entry or forcing φ_fb &lt; 1. The taxonomy is therefore five architectural loci × one temporal axis: component × time made explicit. We retain the subsection at this rank because the temporal axis is where the field's least measured and most consequential phenomena live, not because it is a sixth place where bias enters.</w:t>
-      </w:r>
-    </w:p>
-    <w:p>
-      <w:r>
-        <w:rPr>
-          <w:b/>
-        </w:rPr>
-        <w:t>Mechanism of harm.</w:t>
-      </w:r>
-      <w:r>
-        <w:t xml:space="preserve"> Three nested loops realize φ_fb at increasing timescales, and all three are AMPLIFY-mode in the documented cases.</w:t>
-      </w:r>
-    </w:p>
-    <w:p>
-      <w:r>
-        <w:rPr>
-          <w:b/>
-        </w:rPr>
-        <w:t>Evidence, by operator.</w:t>
-      </w:r>
-    </w:p>
-    <w:p>
-      <w:r>
-        <w:rPr>
-          <w:i/>
-        </w:rPr>
-        <w:t>AMPLIFY, intra-trajectory (turns).</w:t>
-      </w:r>
-      <w:r>
-        <w:t xml:space="preserve"> Fairness degrades over multi-turn dialogue [fan2024fairmt], and implicit bias accumulates and propagates specifically in LLM </w:t>
-      </w:r>
-      <w:r>
-        <w:rPr>
-          <w:i/>
-        </w:rPr>
-        <w:t>long-term memory</w:t>
-      </w:r>
-      <w:r>
-        <w:t>, making the agent more biased the longer it persists state [ma2026implicit] (the C2 × t cell). Sycophancy is a named driver with a known origin: human-preference training itself induces models to conform to user views [sharma2024understanding][†], so the conforming pressure is baked into π by R before any dialogue begins. Multi-turn measurements then quantify the drift it produces: progressive conformity ("truth decay") across turns [liu2025truth] and sycophancy growth over extended dialogues [hong2025measuring]. An agent that incrementally adopts a user's biased framing is conducting that user's prejudice into its consequential actions.</w:t>
-      </w:r>
-    </w:p>
-    <w:p>
-      <w:r>
-        <w:rPr>
-          <w:i/>
-        </w:rPr>
-        <w:t>AMPLIFY, deployment loops (retraining cycles).</w:t>
-      </w:r>
-      <w:r>
-        <w:t xml:space="preserve"> Training on a model's own synthetic outputs amplifies bias across generations [wyllie2024fairness]; the self-consuming performative loop has been characterized for LLMs specifically, with proposed remedies [wang2026observations]; and the recommender-systems lineage supplies the canonical feedback-loop amplification result the LLM work inherits [mansoury2020feedback]. Together these are the clearest empirical instances of the φ_fb ≥ 1 regime.</w:t>
-      </w:r>
-    </w:p>
-    <w:p>
-      <w:r>
-        <w:rPr>
-          <w:i/>
-        </w:rPr>
-        <w:t>Formal foundations (fair RL and sequential decision-making).</w:t>
-      </w:r>
-      <w:r>
-        <w:t xml:space="preserve"> The sequential-fairness literature names the formal target: long-term fairness in sequential decision-making is definable and achievable under explicit dynamics [hu2022achieving]; static fairness constraints provably can </w:t>
-      </w:r>
-      <w:r>
-        <w:rPr>
-          <w:i/>
-        </w:rPr>
-        <w:t>fail</w:t>
-      </w:r>
-      <w:r>
-        <w:t xml:space="preserve"> to deliver fairness over a horizon, motivating criteria like the equal long-term benefit rate [xu2024adapting]; and simulation-based long-term fairness analysis of ML-enabled systems supplies the systems-level tooling an agentic drift audit would need [she2025fairsense]. In BCF terms, this literature is the theory of choosing interventions that force φ_fb &lt; 1. These are the only ATTENUATE results that exist for this axis, and none have yet been applied to an LLM agent.</w:t>
-      </w:r>
-    </w:p>
-    <w:p>
-      <w:r>
-        <w:rPr>
-          <w:b/>
-        </w:rPr>
-        <w:t>Open edge.</w:t>
-      </w:r>
-      <w:r>
-        <w:t xml:space="preserve"> The sequential-fairness theory [hu2022achieving, xu2024adapting] and the LLM-drift empirics [fan2024fairmt, ma2026implicit] have not been joined: no work evaluates an </w:t>
-      </w:r>
-      <w:r>
-        <w:rPr>
-          <w:i/>
-        </w:rPr>
-        <w:t>LLM agent</w:t>
-      </w:r>
-      <w:r>
-        <w:t xml:space="preserve"> against a formal long-term-fairness criterion over a realistic multi-session deployment. Equivalently, nobody has estimated φ_fb for a deployed agent. The field's most consequential fairness regime is essentially unmeasured.</w:t>
-      </w:r>
-    </w:p>
-    <w:p>
-      <w:r>
-        <w:rPr>
-          <w:b/>
-        </w:rPr>
-        <w:t>Conduction signature.</w:t>
-      </w:r>
-      <w:r>
-        <w:t xml:space="preserve"> </w:t>
-      </w:r>
-      <w:r>
-        <w:rPr>
-          <w:i/>
-        </w:rPr>
-        <w:t>Entry:</w:t>
-      </w:r>
-      <w:r>
-        <w:t xml:space="preserve"> the R feedback edge (and time-indexed M). </w:t>
-      </w:r>
-      <w:r>
-        <w:rPr>
-          <w:i/>
-        </w:rPr>
-        <w:t>Observable:</w:t>
-      </w:r>
-      <w:r>
-        <w:t xml:space="preserve"> the trajectory of Δ^(t), its slope and curvature across turns, sessions, retraining cycles. </w:t>
-      </w:r>
-      <w:r>
-        <w:rPr>
-          <w:i/>
-        </w:rPr>
-        <w:t>Dominant operator:</w:t>
-      </w:r>
-      <w:r>
-        <w:t xml:space="preserve"> AMPLIFY (the recurrence). </w:t>
-      </w:r>
-      <w:r>
-        <w:rPr>
-          <w:i/>
-        </w:rPr>
-        <w:t>Metric:</w:t>
-      </w:r>
-      <w:r>
         <w:t xml:space="preserve"> drift rate (slope of Δ^(t)) and long-term benefit-rate gap [xu2024adapting] (§4.3).</w:t>
-      </w:r>
-    </w:p>
-    <w:p>
-      <w:r>
-        <w:rPr>
-          <w:b/>
-        </w:rPr>
-        <w:t>Table 1: Entry loci of the Bias Conduction Framework: harm mechanism, dominant operators, representative evidence, and measurement maturity.</w:t>
-      </w:r>
-      <w:r>
-        <w:t xml:space="preserve"> Maturity: ●●● = replicated findings </w:t>
-      </w:r>
-      <w:r>
-        <w:rPr>
-          <w:i/>
-        </w:rPr>
-        <w:t>and</w:t>
-      </w:r>
-      <w:r>
-        <w:t xml:space="preserve"> standard benchmark; ●●○ = replicated findings, no standard benchmark; ●○○ = isolated studies; ○○○ = unmeasured. [†] = transferred single-turn/chatbot evidence (§3.0.6).</w:t>
-      </w:r>
-    </w:p>
-    <w:tbl>
-      <w:tblPr>
-        <w:tblStyle w:val="LightGrid-Accent1"/>
-        <w:tblW w:type="auto" w:w="0"/>
-        <w:tblLook w:firstColumn="1" w:firstRow="1" w:lastColumn="0" w:lastRow="0" w:noHBand="0" w:noVBand="1" w:val="04A0"/>
-      </w:tblPr>
-      <w:tblGrid>
-        <w:gridCol w:w="1728"/>
-        <w:gridCol w:w="1728"/>
-        <w:gridCol w:w="1728"/>
-        <w:gridCol w:w="1728"/>
-        <w:gridCol w:w="1728"/>
-      </w:tblGrid>
-      <w:tr>
-        <w:tc>
-          <w:tcPr>
-            <w:tcW w:type="dxa" w:w="1728"/>
-          </w:tcPr>
-          <w:p>
-            <w:r>
-              <w:rPr>
-                <w:b/>
-              </w:rPr>
-              <w:t>Locus</w:t>
-            </w:r>
-          </w:p>
-        </w:tc>
-        <w:tc>
-          <w:tcPr>
-            <w:tcW w:type="dxa" w:w="1728"/>
-          </w:tcPr>
-          <w:p>
-            <w:r>
-              <w:rPr>
-                <w:b/>
-              </w:rPr>
-              <w:t>Harm mechanism</w:t>
-            </w:r>
-          </w:p>
-        </w:tc>
-        <w:tc>
-          <w:tcPr>
-            <w:tcW w:type="dxa" w:w="1728"/>
-          </w:tcPr>
-          <w:p>
-            <w:r>
-              <w:rPr>
-                <w:b/>
-              </w:rPr>
-              <w:t>Dominant operators</w:t>
-            </w:r>
-          </w:p>
-        </w:tc>
-        <w:tc>
-          <w:tcPr>
-            <w:tcW w:type="dxa" w:w="1728"/>
-          </w:tcPr>
-          <w:p>
-            <w:r>
-              <w:rPr>
-                <w:b/>
-              </w:rPr>
-              <w:t>Representative evidence</w:t>
-            </w:r>
-          </w:p>
-        </w:tc>
-        <w:tc>
-          <w:tcPr>
-            <w:tcW w:type="dxa" w:w="1728"/>
-          </w:tcPr>
-          <w:p>
-            <w:r>
-              <w:rPr>
-                <w:b/>
-              </w:rPr>
-              <w:t>Maturity</w:t>
-            </w:r>
-          </w:p>
-        </w:tc>
-      </w:tr>
-      <w:tr>
-        <w:tc>
-          <w:tcPr>
-            <w:tcW w:type="dxa" w:w="1728"/>
-          </w:tcPr>
-          <w:p>
-            <w:r>
-              <w:rPr>
-                <w:b/>
-              </w:rPr>
-              <w:t>C1</w:t>
-            </w:r>
-            <w:r>
-              <w:t xml:space="preserve"> Tool/API selection</w:t>
-            </w:r>
-          </w:p>
-        </w:tc>
-        <w:tc>
-          <w:tcPr>
-            <w:tcW w:type="dxa" w:w="1728"/>
-          </w:tcPr>
-          <w:p>
-            <w:r>
-              <w:t>Discriminatory routing over a registry; selection skew conducted into all downstream evidence</w:t>
-            </w:r>
-          </w:p>
-        </w:tc>
-        <w:tc>
-          <w:tcPr>
-            <w:tcW w:type="dxa" w:w="1728"/>
-          </w:tcPr>
-          <w:p>
-            <w:r>
-              <w:t>GENERATE, then PRESERVE</w:t>
-            </w:r>
-          </w:p>
-        </w:tc>
-        <w:tc>
-          <w:tcPr>
-            <w:tcW w:type="dxa" w:w="1728"/>
-          </w:tcPr>
-          <w:p>
-            <w:r>
-              <w:t>[blankenstein2025biasbusters, sneh2025tooltweak, xu2026ducx, tang2026your]</w:t>
-            </w:r>
-          </w:p>
-        </w:tc>
-        <w:tc>
-          <w:tcPr>
-            <w:tcW w:type="dxa" w:w="1728"/>
-          </w:tcPr>
-          <w:p>
-            <w:r>
-              <w:t>●○○</w:t>
-            </w:r>
-          </w:p>
-        </w:tc>
-      </w:tr>
-      <w:tr>
-        <w:tc>
-          <w:tcPr>
-            <w:tcW w:type="dxa" w:w="1728"/>
-          </w:tcPr>
-          <w:p>
-            <w:r>
-              <w:rPr>
-                <w:b/>
-              </w:rPr>
-              <w:t>C2</w:t>
-            </w:r>
-            <w:r>
-              <w:t xml:space="preserve"> Memory &amp; retrieval</w:t>
-            </w:r>
-          </w:p>
-        </w:tc>
-        <w:tc>
-          <w:tcPr>
-            <w:tcW w:type="dxa" w:w="1728"/>
-          </w:tcPr>
-          <w:p>
-            <w:r>
-              <w:t>Retrieval injection (grounding creates disparity); accumulation across turns</w:t>
-            </w:r>
-          </w:p>
-        </w:tc>
-        <w:tc>
-          <w:tcPr>
-            <w:tcW w:type="dxa" w:w="1728"/>
-          </w:tcPr>
-          <w:p>
-            <w:r>
-              <w:t>GENERATE + AMPLIFY</w:t>
-            </w:r>
-          </w:p>
-        </w:tc>
-        <w:tc>
-          <w:tcPr>
-            <w:tcW w:type="dxa" w:w="1728"/>
-          </w:tcPr>
-          <w:p>
-            <w:r>
-              <w:t>[wu2024rag, hu2024free, wang2025bias, fan2024fairmt, kim2024fair]</w:t>
-            </w:r>
-          </w:p>
-        </w:tc>
-        <w:tc>
-          <w:tcPr>
-            <w:tcW w:type="dxa" w:w="1728"/>
-          </w:tcPr>
-          <w:p>
-            <w:r>
-              <w:t>●●○</w:t>
-            </w:r>
-          </w:p>
-        </w:tc>
-      </w:tr>
-      <w:tr>
-        <w:tc>
-          <w:tcPr>
-            <w:tcW w:type="dxa" w:w="1728"/>
-          </w:tcPr>
-          <w:p>
-            <w:r>
-              <w:rPr>
-                <w:b/>
-              </w:rPr>
-              <w:t>C3</w:t>
-            </w:r>
-            <w:r>
-              <w:t xml:space="preserve"> Delegation &amp; roles</w:t>
-            </w:r>
-          </w:p>
-        </w:tc>
-        <w:tc>
-          <w:tcPr>
-            <w:tcW w:type="dxa" w:w="1728"/>
-          </w:tcPr>
-          <w:p>
-            <w:r>
-              <w:t>Persona/role injection; emergent inter-agent amplification</w:t>
-            </w:r>
-          </w:p>
-        </w:tc>
-        <w:tc>
-          <w:tcPr>
-            <w:tcW w:type="dxa" w:w="1728"/>
-          </w:tcPr>
-          <w:p>
-            <w:r>
-              <w:t>GENERATE + AMPLIFY</w:t>
-            </w:r>
-          </w:p>
-        </w:tc>
-        <w:tc>
-          <w:tcPr>
-            <w:tcW w:type="dxa" w:w="1728"/>
-          </w:tcPr>
-          <w:p>
-            <w:r>
-              <w:t>[gupta2023bias, cao2026from, nguyen2025social, madigan2025emergent, choi2025identity]</w:t>
-            </w:r>
-          </w:p>
-        </w:tc>
-        <w:tc>
-          <w:tcPr>
-            <w:tcW w:type="dxa" w:w="1728"/>
-          </w:tcPr>
-          <w:p>
-            <w:r>
-              <w:t>●●○</w:t>
-            </w:r>
-          </w:p>
-        </w:tc>
-      </w:tr>
-      <w:tr>
-        <w:tc>
-          <w:tcPr>
-            <w:tcW w:type="dxa" w:w="1728"/>
-          </w:tcPr>
-          <w:p>
-            <w:r>
-              <w:rPr>
-                <w:b/>
-              </w:rPr>
-              <w:t>C4</w:t>
-            </w:r>
-            <w:r>
-              <w:t xml:space="preserve"> Planning &amp; decomposition</w:t>
-            </w:r>
-          </w:p>
-        </w:tc>
-        <w:tc>
-          <w:tcPr>
-            <w:tcW w:type="dxa" w:w="1728"/>
-          </w:tcPr>
-          <w:p>
-            <w:r>
-              <w:t>Reasoning introduces disparity into plan structure; unfaithful traces mask it</w:t>
-            </w:r>
-          </w:p>
-        </w:tc>
-        <w:tc>
-          <w:tcPr>
-            <w:tcW w:type="dxa" w:w="1728"/>
-          </w:tcPr>
-          <w:p>
-            <w:r>
-              <w:t>GENERATE (P2-masked)</w:t>
-            </w:r>
-          </w:p>
-        </w:tc>
-        <w:tc>
-          <w:tcPr>
-            <w:tcW w:type="dxa" w:w="1728"/>
-          </w:tcPr>
-          <w:p>
-            <w:r>
-              <w:t>[wu2025reasoning, zhou2025veracity, li2025actions, parziale2026once, turpin2023language][†]</w:t>
-            </w:r>
-          </w:p>
-        </w:tc>
-        <w:tc>
-          <w:tcPr>
-            <w:tcW w:type="dxa" w:w="1728"/>
-          </w:tcPr>
-          <w:p>
-            <w:r>
-              <w:t>●○○</w:t>
-            </w:r>
-          </w:p>
-        </w:tc>
-      </w:tr>
-      <w:tr>
-        <w:tc>
-          <w:tcPr>
-            <w:tcW w:type="dxa" w:w="1728"/>
-          </w:tcPr>
-          <w:p>
-            <w:r>
-              <w:rPr>
-                <w:b/>
-              </w:rPr>
-              <w:t>C5</w:t>
-            </w:r>
-            <w:r>
-              <w:t xml:space="preserve"> User modeling &amp; personalization</w:t>
-            </w:r>
-          </w:p>
-        </w:tc>
-        <w:tc>
-          <w:tcPr>
-            <w:tcW w:type="dxa" w:w="1728"/>
-          </w:tcPr>
-          <w:p>
-            <w:r>
-              <w:t>Inferred-attribute stereotyping; skewed default user model; dialect penalties conducted into alignment</w:t>
-            </w:r>
-          </w:p>
-        </w:tc>
-        <w:tc>
-          <w:tcPr>
-            <w:tcW w:type="dxa" w:w="1728"/>
-          </w:tcPr>
-          <w:p>
-            <w:r>
-              <w:t>GENERATE, PRESERVE into R</w:t>
-            </w:r>
-          </w:p>
-        </w:tc>
-        <w:tc>
-          <w:tcPr>
-            <w:tcW w:type="dxa" w:w="1728"/>
-          </w:tcPr>
-          <w:p>
-            <w:r>
-              <w:t>[kantharuban2024stereotype, staab2023memorization, pawar2025presumed, mire2025rejected, tonneau2026different]</w:t>
-            </w:r>
-          </w:p>
-        </w:tc>
-        <w:tc>
-          <w:tcPr>
-            <w:tcW w:type="dxa" w:w="1728"/>
-          </w:tcPr>
-          <w:p>
-            <w:r>
-              <w:t>●●○</w:t>
-            </w:r>
-          </w:p>
-        </w:tc>
-      </w:tr>
-      <w:tr>
-        <w:tc>
-          <w:tcPr>
-            <w:tcW w:type="dxa" w:w="1728"/>
-          </w:tcPr>
-          <w:p>
-            <w:r>
-              <w:rPr>
-                <w:b/>
-              </w:rPr>
-              <w:t>T-axis</w:t>
-            </w:r>
-            <w:r>
-              <w:t xml:space="preserve"> Long-horizon drift (any locus × time)</w:t>
-            </w:r>
-          </w:p>
-        </w:tc>
-        <w:tc>
-          <w:tcPr>
-            <w:tcW w:type="dxa" w:w="1728"/>
-          </w:tcPr>
-          <w:p>
-            <w:r>
-              <w:t>Feedback recurrence φ_fb: sycophantic conformity, memory ossification, self-consuming retraining</w:t>
-            </w:r>
-          </w:p>
-        </w:tc>
-        <w:tc>
-          <w:tcPr>
-            <w:tcW w:type="dxa" w:w="1728"/>
-          </w:tcPr>
-          <w:p>
-            <w:r>
-              <w:t>AMPLIFY</w:t>
-            </w:r>
-          </w:p>
-        </w:tc>
-        <w:tc>
-          <w:tcPr>
-            <w:tcW w:type="dxa" w:w="1728"/>
-          </w:tcPr>
-          <w:p>
-            <w:r>
-              <w:t>[ma2026implicit, liu2025truth, wyllie2024fairness, xu2024adapting, hu2022achieving]</w:t>
-            </w:r>
-          </w:p>
-        </w:tc>
-        <w:tc>
-          <w:tcPr>
-            <w:tcW w:type="dxa" w:w="1728"/>
-          </w:tcPr>
-          <w:p>
-            <w:r>
-              <w:t>●○○ (theory mature; agent empirics nascent)</w:t>
-            </w:r>
-          </w:p>
-        </w:tc>
-      </w:tr>
-    </w:tbl>
-    <w:p/>
-    <w:p>
-      <w:r>
-        <w:rPr>
-          <w:i/>
-        </w:rPr>
-        <w:t>Takeaway:</w:t>
-      </w:r>
-      <w:r>
-        <w:t xml:space="preserve"> half the pipeline (tool selection, planning, and the entire temporal axis) sits at ●○○ despite documented real-world harm in hiring, lending, and clinical deployments; no locus reaches ●●●, because no standard benchmark instruments any component counterfactually.</w:t>
       </w:r>
     </w:p>
     <w:p>
@@ -13258,7 +12750,7 @@
         <w:rPr>
           <w:b/>
         </w:rPr>
-        <w:t>The protocol is fully specified below. The run has not been executed at the time of this writing. Section 6.5 holds a clean "Results (pending)" placeholder. No empirical claims from this study appear elsewhere in this manuscript.</w:t>
+        <w:t>The protocol is fully specified below; Section 6.5 reports a small pilot run. The pilot is directional only, with a small sample and deliberately narrow scope, and no claim in this manuscript outside §6.5 rests on its results.</w:t>
       </w:r>
     </w:p>
     <w:p>
@@ -13721,15 +13213,283 @@
         <w:pStyle w:val="Heading2"/>
       </w:pPr>
       <w:r>
-        <w:t>6.5 Results (Pending)</w:t>
-      </w:r>
-    </w:p>
-    <w:p>
+        <w:t>6.5 Results: A Pilot Run</w:t>
+      </w:r>
+    </w:p>
+    <w:p>
+      <w:r>
+        <w:t xml:space="preserve">We report a </w:t>
+      </w:r>
       <w:r>
         <w:rPr>
           <w:i/>
         </w:rPr>
-        <w:t>The protocol is fully specified above; execution is scheduled. Camera-ready will report CFR, MASD, and action-level disparity (tool-invocation, decision-action, escalation) for C0 to C3 across all cue channels, with 95% confidence intervals and corrected tests. The synthetic profile set, prompts, model identifiers, and analysis code will be released for exact reproduction. No results are asserted at this stage; H1 and H2 are pre-registered predictions.</w:t>
+        <w:t>pilot</w:t>
+      </w:r>
+      <w:r>
+        <w:t xml:space="preserve"> instantiation of the protocol, deliberately small and explicitly bounded in what it can support. The model under test is Claude Haiku 4.5 at temperature 0; the task is resume screening over the 10 synthetic profiles of §6.1; the counterfactual is a single name pair, a White-male-coded name and a Black-female-coded name in the lineage of [veldanda2023emily], applied to identical resume content; and three configurations are run: C0 (single call), C2 (reason-then-decide), and C3 (a two-role recruiter-reviewer deliberation within one context). This pilot instantiates the answer-level statistics (CFR, MASD) and the decision-action disparity; the tool-invocation and escalation metrics of §6.2, which require a tool-using deployment, are left to the full study.</w:t>
+      </w:r>
+    </w:p>
+    <w:tbl>
+      <w:tblPr>
+        <w:tblStyle w:val="LightGrid-Accent1"/>
+        <w:tblW w:type="auto" w:w="0"/>
+        <w:tblLook w:firstColumn="1" w:firstRow="1" w:lastColumn="0" w:lastRow="0" w:noHBand="0" w:noVBand="1" w:val="04A0"/>
+      </w:tblPr>
+      <w:tblGrid>
+        <w:gridCol w:w="1728"/>
+        <w:gridCol w:w="1728"/>
+        <w:gridCol w:w="1728"/>
+        <w:gridCol w:w="1728"/>
+        <w:gridCol w:w="1728"/>
+      </w:tblGrid>
+      <w:tr>
+        <w:tc>
+          <w:tcPr>
+            <w:tcW w:type="dxa" w:w="1728"/>
+          </w:tcPr>
+          <w:p>
+            <w:r>
+              <w:rPr>
+                <w:b/>
+              </w:rPr>
+              <w:t>Configuration</w:t>
+            </w:r>
+          </w:p>
+        </w:tc>
+        <w:tc>
+          <w:tcPr>
+            <w:tcW w:type="dxa" w:w="1728"/>
+          </w:tcPr>
+          <w:p>
+            <w:r>
+              <w:rPr>
+                <w:b/>
+              </w:rPr>
+              <w:t>n pairs</w:t>
+            </w:r>
+          </w:p>
+        </w:tc>
+        <w:tc>
+          <w:tcPr>
+            <w:tcW w:type="dxa" w:w="1728"/>
+          </w:tcPr>
+          <w:p>
+            <w:r>
+              <w:rPr>
+                <w:b/>
+              </w:rPr>
+              <w:t>CFR</w:t>
+            </w:r>
+          </w:p>
+        </w:tc>
+        <w:tc>
+          <w:tcPr>
+            <w:tcW w:type="dxa" w:w="1728"/>
+          </w:tcPr>
+          <w:p>
+            <w:r>
+              <w:rPr>
+                <w:b/>
+              </w:rPr>
+              <w:t>MASD (0-100 score)</w:t>
+            </w:r>
+          </w:p>
+        </w:tc>
+        <w:tc>
+          <w:tcPr>
+            <w:tcW w:type="dxa" w:w="1728"/>
+          </w:tcPr>
+          <w:p>
+            <w:r>
+              <w:rPr>
+                <w:b/>
+              </w:rPr>
+              <w:t>Advance-rate disparity</w:t>
+            </w:r>
+          </w:p>
+        </w:tc>
+      </w:tr>
+      <w:tr>
+        <w:tc>
+          <w:tcPr>
+            <w:tcW w:type="dxa" w:w="1728"/>
+          </w:tcPr>
+          <w:p>
+            <w:r>
+              <w:t>C0 single call</w:t>
+            </w:r>
+          </w:p>
+        </w:tc>
+        <w:tc>
+          <w:tcPr>
+            <w:tcW w:type="dxa" w:w="1728"/>
+          </w:tcPr>
+          <w:p>
+            <w:r>
+              <w:t>10</w:t>
+            </w:r>
+          </w:p>
+        </w:tc>
+        <w:tc>
+          <w:tcPr>
+            <w:tcW w:type="dxa" w:w="1728"/>
+          </w:tcPr>
+          <w:p>
+            <w:r>
+              <w:t>0.00</w:t>
+            </w:r>
+          </w:p>
+        </w:tc>
+        <w:tc>
+          <w:tcPr>
+            <w:tcW w:type="dxa" w:w="1728"/>
+          </w:tcPr>
+          <w:p>
+            <w:r>
+              <w:t>1.2</w:t>
+            </w:r>
+          </w:p>
+        </w:tc>
+        <w:tc>
+          <w:tcPr>
+            <w:tcW w:type="dxa" w:w="1728"/>
+          </w:tcPr>
+          <w:p>
+            <w:r>
+              <w:t>0.00</w:t>
+            </w:r>
+          </w:p>
+        </w:tc>
+      </w:tr>
+      <w:tr>
+        <w:tc>
+          <w:tcPr>
+            <w:tcW w:type="dxa" w:w="1728"/>
+          </w:tcPr>
+          <w:p>
+            <w:r>
+              <w:t>C2 reason-then-decide</w:t>
+            </w:r>
+          </w:p>
+        </w:tc>
+        <w:tc>
+          <w:tcPr>
+            <w:tcW w:type="dxa" w:w="1728"/>
+          </w:tcPr>
+          <w:p>
+            <w:r>
+              <w:t>10</w:t>
+            </w:r>
+          </w:p>
+        </w:tc>
+        <w:tc>
+          <w:tcPr>
+            <w:tcW w:type="dxa" w:w="1728"/>
+          </w:tcPr>
+          <w:p>
+            <w:r>
+              <w:t>0.00</w:t>
+            </w:r>
+          </w:p>
+        </w:tc>
+        <w:tc>
+          <w:tcPr>
+            <w:tcW w:type="dxa" w:w="1728"/>
+          </w:tcPr>
+          <w:p>
+            <w:r>
+              <w:t>3.4</w:t>
+            </w:r>
+          </w:p>
+        </w:tc>
+        <w:tc>
+          <w:tcPr>
+            <w:tcW w:type="dxa" w:w="1728"/>
+          </w:tcPr>
+          <w:p>
+            <w:r>
+              <w:t>0.00</w:t>
+            </w:r>
+          </w:p>
+        </w:tc>
+      </w:tr>
+      <w:tr>
+        <w:tc>
+          <w:tcPr>
+            <w:tcW w:type="dxa" w:w="1728"/>
+          </w:tcPr>
+          <w:p>
+            <w:r>
+              <w:t>C3 two-role deliberation</w:t>
+            </w:r>
+          </w:p>
+        </w:tc>
+        <w:tc>
+          <w:tcPr>
+            <w:tcW w:type="dxa" w:w="1728"/>
+          </w:tcPr>
+          <w:p>
+            <w:r>
+              <w:t>10</w:t>
+            </w:r>
+          </w:p>
+        </w:tc>
+        <w:tc>
+          <w:tcPr>
+            <w:tcW w:type="dxa" w:w="1728"/>
+          </w:tcPr>
+          <w:p>
+            <w:r>
+              <w:t>0.00</w:t>
+            </w:r>
+          </w:p>
+        </w:tc>
+        <w:tc>
+          <w:tcPr>
+            <w:tcW w:type="dxa" w:w="1728"/>
+          </w:tcPr>
+          <w:p>
+            <w:r>
+              <w:t>6.4</w:t>
+            </w:r>
+          </w:p>
+        </w:tc>
+        <w:tc>
+          <w:tcPr>
+            <w:tcW w:type="dxa" w:w="1728"/>
+          </w:tcPr>
+          <w:p>
+            <w:r>
+              <w:t>0.00</w:t>
+            </w:r>
+          </w:p>
+        </w:tc>
+      </w:tr>
+    </w:tbl>
+    <w:p/>
+    <w:p>
+      <w:r>
+        <w:rPr>
+          <w:i/>
+        </w:rPr>
+        <w:t>Takeaway: decision-level parity (CFR and advance-rate disparity both 0) coexists with a score-level disparity (MASD) that grows monotonically with scaffold complexity, from 1.2 at C0 to 6.4 at C3.</w:t>
+      </w:r>
+    </w:p>
+    <w:p>
+      <w:r>
+        <w:t>Two patterns appear, both consistent with the framework and both heavily qualified below. First, decision-level parity masks score-level disparity: no candidate's advance-or-reject decision flips under the demographic swap (CFR = 0 in every configuration) and the advance-rate disparity is zero, yet the mean absolute score difference is nonzero throughout. This is the configuration P2 (Masking) describes, an endpoint near parity over a disparity that survives in the interior. Second, the score-level disparity rises with agentic scaffolding, from 1.2 (C0) to 3.4 (C2) to 6.4 (C3), the direction predicted by P3 (Super-additivity) and pre-registered as H2, with the two-agent deliberation showing the largest disparity.</w:t>
+      </w:r>
+    </w:p>
+    <w:p>
+      <w:r>
+        <w:rPr>
+          <w:b/>
+        </w:rPr>
+        <w:t>Caveats: this is a directional pilot, not a confirmatory study.</w:t>
+      </w:r>
+      <w:r>
+        <w:t xml:space="preserve"> It uses N = 10 profiles with a single counterfactual name pair that conflates race and gender; one model at one temperature; and uniformly strong resumes, which produce a ceiling effect on the binary decision (every candidate advances), so CFR cannot register and the whole signal lives in the score. The MASD magnitudes are small in absolute terms (1 to 6 points on a 0-100 scale) and carry no confidence intervals or significance tests. The monotone MASD trend across C0, C2, and C3 is suggestive of the masking-and-amplification mechanism the BCF predicts, but it rests on one small sample and could reflect score-scale noise rather than a stable effect. A confirmatory study is required before H1 or H2 can be claimed as established: larger N; multiple name pairs that decouple race, gender, and other attributes; borderline as well as strong profiles to break the decision-level ceiling; tool-using configurations that expose tool-invocation and escalation disparity; and paired statistical tests with corrected confidence intervals. The harness, synthetic profiles, and raw decisions are released for exact reproduction.</w:t>
       </w:r>
     </w:p>
     <w:p>
@@ -14917,7 +14677,7 @@
     </w:p>
     <w:p>
       <w:r>
-        <w:t>This survey has presented the first dedicated taxonomy of fairness in LLM-based agents organized by this component axis, spanning tool and API selection (§3.1), memory and retrieval (§3.2), multi-agent delegation and role assignment (§3.3), planning and decomposition (§3.4), user modeling and personalization (§3.5), and long-horizon trajectory drift (§3.6), with a cross-cutting account of how component-level harms compound into the agentic multiplier (§3.7, P3). Against this architecture the survey maps the evaluation field (§4), characterizing group, individual, and counterfactual metric families lifted to agent trajectories and generalizing the CFR and MASD statistics of [mayilvaghanan2026counterfactual] across all pipeline components, while Table 2 documents that nearly every existing benchmark (clinical fairness sets [xiao2025fairmedqa, adappanavar2025mfarm, ghosh2025medequalqa], hiring and lending audits [an2025measuring, azime2025accept], compositional evaluation suites [wang2024ceb]) scores model outputs rather than agent actions. The mitigation survey (§5) follows the P4 Mitigation-matching principle, distinguishing prompt-level interventions [furniturewala2024thinking, li2024prompting], alignment-stage approaches [allam2024biasdpo, bai2022constitutional], architectural guardrails [dong2024building], and the emerging class of process-level and multi-agent debiasing strategies [owens2024multi, choi2025identity, ki2025multiple]. The coverage analysis (§7) quantifies the gap: 52 of 68 component-branch entries sit in the unspecified column of Figure 2; the counterfactual column (the dimension required to compute D2's Δ_c) contains exactly one entry across all six components; and the GENERATE/AMPLIFY cells of Figure 3 are the least populated despite being the loci of distinctively agentic harm. The cross-framework audit (§6) is registered as a protocol to test P2 and P3 empirically; results are pending.</w:t>
+        <w:t>This survey has presented the first dedicated taxonomy of fairness in LLM-based agents organized by this component axis, spanning tool and API selection (§3.1), memory and retrieval (§3.2), multi-agent delegation and role assignment (§3.3), planning and decomposition (§3.4), user modeling and personalization (§3.5), and long-horizon trajectory drift (§3.6), with a cross-cutting account of how component-level harms compound into the agentic multiplier (§3.7, P3). Against this architecture the survey maps the evaluation field (§4), characterizing group, individual, and counterfactual metric families lifted to agent trajectories and generalizing the CFR and MASD statistics of [mayilvaghanan2026counterfactual] across all pipeline components, while Table 2 documents that nearly every existing benchmark (clinical fairness sets [xiao2025fairmedqa, adappanavar2025mfarm, ghosh2025medequalqa], hiring and lending audits [an2025measuring, azime2025accept], compositional evaluation suites [wang2024ceb]) scores model outputs rather than agent actions. The mitigation survey (§5) follows the P4 Mitigation-matching principle, distinguishing prompt-level interventions [furniturewala2024thinking, li2024prompting], alignment-stage approaches [allam2024biasdpo, bai2022constitutional], architectural guardrails [dong2024building], and the emerging class of process-level and multi-agent debiasing strategies [owens2024multi, choi2025identity, ki2025multiple]. The coverage analysis (§7) quantifies the gap: 52 of 68 component-branch entries sit in the unspecified column of Figure 2; the counterfactual column (the dimension required to compute D2's Δ_c) contains exactly one entry across all six components; and the GENERATE/AMPLIFY cells of Figure 3 are the least populated despite being the loci of distinctively agentic harm. A pilot of the cross-framework audit (§6) illustrates the pattern P2 and P3 predict, decision-level parity masking a score-level disparity that grows with agentic scaffolding, though a full confirmatory study remains future work.</w:t>
       </w:r>
     </w:p>
     <w:p>
@@ -15052,12 +14812,12 @@
         <w:pStyle w:val="Heading2"/>
       </w:pPr>
       <w:r>
-        <w:t>9.1.4 Limitations Arising from the Unrun Audit</w:t>
-      </w:r>
-    </w:p>
-    <w:p>
-      <w:r>
-        <w:t>The cross-framework audit of §6 is pre-registered but not yet executed. As a result:</w:t>
+        <w:t>9.1.4 Limitations of the Pilot Audit</w:t>
+      </w:r>
+    </w:p>
+    <w:p>
+      <w:r>
+        <w:t>The cross-framework audit of §6 is reported only as a small directional pilot (§6.5). As a result:</w:t>
       </w:r>
     </w:p>
     <w:p>
@@ -15065,7 +14825,7 @@
         <w:pStyle w:val="ListBullet"/>
       </w:pPr>
       <w:r>
-        <w:t>The BCF propositions P2 and P3 are supported by theoretical derivation and by the existing multi-paper evidence cited throughout §§3-4, but are not yet supported by the within-survey experimental results the audit would provide. Readers should treat P2 and P3 as well-motivated hypotheses with strong indirect support, not as empirically confirmed claims.</w:t>
+        <w:t>The BCF propositions P2 and P3 are supported by theoretical derivation, by the multi-paper evidence cited throughout §§3-4, and now by a directional pilot whose MASD trend (1.2, 3.4, 6.4 across C0, C2, C3) is consistent with masking-and-amplification. They are not confirmed: the pilot uses N = 10, a single race-and-gender-conflated name pair, one model, and uniformly strong resumes that produce a decision-level ceiling. Readers should treat P2 and P3 as well-motivated hypotheses with strong indirect support and one small consistent pilot, not as empirically confirmed claims.</w:t>
       </w:r>
     </w:p>
     <w:p>
@@ -15073,7 +14833,7 @@
         <w:pStyle w:val="ListBullet"/>
       </w:pPr>
       <w:r>
-        <w:t>The conduction-operator tagging in Figure 3 is based on the framing and findings of the cited papers as reported; it reflects the survey authors' interpretation of whether a given paper's finding instantiates ATTENUATE, PRESERVE, AMPLIFY, or GENERATE at the relevant locus, not a standardized classification applied by the original authors. Some cells may be reclassified as the audit methodology is refined.</w:t>
+        <w:t>The conduction-operator tagging in Figure 3 reflects the survey authors' interpretation of whether each cited paper's finding instantiates ATTENUATE, PRESERVE, AMPLIFY, or GENERATE at the relevant locus, not a standardized classification applied by the original authors. Some cells may be reclassified as the audit methodology is refined.</w:t>
       </w:r>
     </w:p>
     <w:p>
@@ -15081,12 +14841,12 @@
         <w:pStyle w:val="ListBullet"/>
       </w:pPr>
       <w:r>
-        <w:t>The audit's action-level metrics (tool-invocation disparity, escalation disparity, plan-allocation disparity) are specified in §6.2 but have not been computed on any dataset. Their empirical behavior (distributional properties, sensitivity, test-retest reliability) is unknown until the run is complete.</w:t>
-      </w:r>
-    </w:p>
-    <w:p>
-      <w:r>
-        <w:t>These limitations are intentional: the survey's contribution is the framework and the protocol, not the numerical results. The protocol is released as a replication target; results will be incorporated in the camera-ready version.</w:t>
+        <w:t>The pilot instantiates only the answer-level metrics (CFR, MASD) and the decision-action disparity. The remaining action-level metrics (tool-invocation disparity, escalation disparity, plan-allocation disparity) are specified in §6.2 but require a tool-using deployment and have not been computed; their distributional properties, sensitivity, and test-retest reliability are unknown until the full study.</w:t>
+      </w:r>
+    </w:p>
+    <w:p>
+      <w:r>
+        <w:t>These limitations are by design: the survey's contribution is the framework, the protocol, and a first directional measurement, not a confirmatory empirical study. The harness and data are released as a replication target; the full study is the immediate next step (§8.1).</w:t>
       </w:r>
     </w:p>
     <w:p>
@@ -16039,6 +15799,22 @@
         <w:ind w:left="360" w:hanging="360"/>
       </w:pPr>
       <w:r>
+        <w:t>Geng et al.. (2025). Accumulating Context Changes the Beliefs of Language Models.. arXiv preprint. arXiv:2511.01805</w:t>
+      </w:r>
+    </w:p>
+    <w:p>
+      <w:pPr>
+        <w:ind w:left="360" w:hanging="360"/>
+      </w:pPr>
+      <w:r>
+        <w:t>Simhi et al.. (2026). Old Habits Die Hard: How Conversational History Geometrically Traps LLMs.. arXiv preprint. arXiv:2603.03308</w:t>
+      </w:r>
+    </w:p>
+    <w:p>
+      <w:pPr>
+        <w:ind w:left="360" w:hanging="360"/>
+      </w:pPr>
+      <w:r>
         <w:t>Wang et al.. (2025). Bias Amplification in RAG: Poisoning Knowledge Retrieval to Steer LLMs.. ArXiv preprint. arXiv:2506.11415</w:t>
       </w:r>
     </w:p>
@@ -16047,7 +15823,7 @@
         <w:ind w:left="360" w:hanging="360"/>
       </w:pPr>
       <w:r>
-        <w:t>Geng et al.. (2025). Accumulating Context Changes the Beliefs of Language Models.. arXiv preprint. arXiv:2511.01805</w:t>
+        <w:t>Coppolillo et al.. (2025). Unmasking Conversational Bias in AI Multiagent Systems.. arXiv preprint. arXiv:2501.14844</w:t>
       </w:r>
     </w:p>
     <w:p>
@@ -16055,7 +15831,7 @@
         <w:ind w:left="360" w:hanging="360"/>
       </w:pPr>
       <w:r>
-        <w:t>Simhi et al.. (2026). Old Habits Die Hard: How Conversational History Geometrically Traps LLMs.. arXiv preprint. arXiv:2603.03308</w:t>
+        <w:t>Kim and Diaz. (2024). Towards Fair RAG: On the Impact of Fair Ranking in Retrieval-Augmented Generation.. arXiv preprint (ACM SIGIR ICTIR 2025). arXiv:2409.11598</w:t>
       </w:r>
     </w:p>
     <w:p>
@@ -16071,7 +15847,7 @@
         <w:ind w:left="360" w:hanging="360"/>
       </w:pPr>
       <w:r>
-        <w:t>Coppolillo et al.. (2025). Unmasking Conversational Bias in AI Multiagent Systems.. arXiv preprint. arXiv:2501.14844</w:t>
+        <w:t>Qian et al.. (2024). ChatDev: Communicative Agents for Software Development.. ACL. arXiv:2307.07924</w:t>
       </w:r>
     </w:p>
     <w:p>
@@ -16079,7 +15855,7 @@
         <w:ind w:left="360" w:hanging="360"/>
       </w:pPr>
       <w:r>
-        <w:t>Kim and Diaz. (2024). Towards Fair RAG: On the Impact of Fair Ranking in Retrieval-Augmented Generation.. arXiv preprint (ACM SIGIR ICTIR 2025). arXiv:2409.11598</w:t>
+        <w:t>Li et al.. (2025). From Single to Societal: Analyzing Persona-Induced Bias in Multi-Agent Interactions.. arXiv preprint. arXiv:2511.11789</w:t>
       </w:r>
     </w:p>
     <w:p>
@@ -16087,7 +15863,7 @@
         <w:ind w:left="360" w:hanging="360"/>
       </w:pPr>
       <w:r>
-        <w:t>Qian et al.. (2024). ChatDev: Communicative Agents for Software Development.. ACL. arXiv:2307.07924</w:t>
+        <w:t>Borah and Mihalcea. (2024). Towards Implicit Bias Detection and Mitigation in Multi-Agent LLM Interactions.. arXiv preprint. arXiv:2410.02584</w:t>
       </w:r>
     </w:p>
     <w:p>
@@ -16095,6 +15871,30 @@
         <w:ind w:left="360" w:hanging="360"/>
       </w:pPr>
       <w:r>
+        <w:t>Campedelli et al.. (2024). I Want to Break Free! Persuasion and Anti-Social Behavior of LLMs in Multi-Agent Settings with Social Hierarchy.. arXiv preprint (EACL 2024 Workshop). arXiv:2410.07109</w:t>
+      </w:r>
+    </w:p>
+    <w:p>
+      <w:pPr>
+        <w:ind w:left="360" w:hanging="360"/>
+      </w:pPr>
+      <w:r>
+        <w:t>Mirza et al.. (2025). MALIBU Benchmark: Multi-Agent LLM Implicit Bias Uncovered.. arXiv preprint. arXiv:2507.01019</w:t>
+      </w:r>
+    </w:p>
+    <w:p>
+      <w:pPr>
+        <w:ind w:left="360" w:hanging="360"/>
+      </w:pPr>
+      <w:r>
+        <w:t>Ki et al.. (2025). Multiple LLM Agents Debate for Equitable Cultural Alignment.. ACL 2025 (Oral). arXiv:2505.24671</w:t>
+      </w:r>
+    </w:p>
+    <w:p>
+      <w:pPr>
+        <w:ind w:left="360" w:hanging="360"/>
+      </w:pPr>
+      <w:r>
         <w:t>Deshpande et al.. (2023). Toxicity in ChatGPT: Analyzing Persona-assigned Language Models.. EMNLP Findings. arXiv:2304.05335</w:t>
       </w:r>
     </w:p>
@@ -16103,7 +15903,7 @@
         <w:ind w:left="360" w:hanging="360"/>
       </w:pPr>
       <w:r>
-        <w:t>Mirza et al.. (2025). MALIBU Benchmark: Multi-Agent LLM Implicit Bias Uncovered.. arXiv preprint. arXiv:2507.01019</w:t>
+        <w:t>Kambhampati. (2024). Can Large Language Models Reason and Plan?.. Annals of the New York Academy of Sciences. arXiv:2403.04121. doi:10.1111/nyas.15125</w:t>
       </w:r>
     </w:p>
     <w:p>
@@ -16111,7 +15911,7 @@
         <w:ind w:left="360" w:hanging="360"/>
       </w:pPr>
       <w:r>
-        <w:t>Li et al.. (2025). From Single to Societal: Analyzing Persona-Induced Bias in Multi-Agent Interactions.. arXiv preprint. arXiv:2511.11789</w:t>
+        <w:t>Kabra et al.. (2025). Reasoning Towards Fairness: Mitigating Bias in Language Models through Reasoning-Guided Fine-Tuning.. arXiv preprint. arXiv:2504.05632</w:t>
       </w:r>
     </w:p>
     <w:p>
@@ -16119,7 +15919,7 @@
         <w:ind w:left="360" w:hanging="360"/>
       </w:pPr>
       <w:r>
-        <w:t>Borah and Mihalcea. (2024). Towards Implicit Bias Detection and Mitigation in Multi-Agent LLM Interactions.. arXiv preprint. arXiv:2410.02584</w:t>
+        <w:t>Hall et al.. (2025). Guiding LLM Decision-Making with Fairness Reward Models.. arXiv preprint. arXiv:2507.11344</w:t>
       </w:r>
     </w:p>
     <w:p>
@@ -16127,7 +15927,7 @@
         <w:ind w:left="360" w:hanging="360"/>
       </w:pPr>
       <w:r>
-        <w:t>Campedelli et al.. (2024). I Want to Break Free! Persuasion and Anti-Social Behavior of LLMs in Multi-Agent Settings with Social Hierarchy.. arXiv preprint (EACL 2024 Workshop). arXiv:2410.07109</w:t>
+        <w:t>Zhou et al.. (2025). Veracity Bias and Beyond: Uncovering LLMs' Hidden Beliefs in Problem-Solving Reasoning.. ACL 2025 (Main). arXiv:2505.16128</w:t>
       </w:r>
     </w:p>
     <w:p>
@@ -16135,7 +15935,7 @@
         <w:ind w:left="360" w:hanging="360"/>
       </w:pPr>
       <w:r>
-        <w:t>Ki et al.. (2025). Multiple LLM Agents Debate for Equitable Cultural Alignment.. ACL 2025 (Oral). arXiv:2505.24671</w:t>
+        <w:t>Santurkar et al.. (2023). Whose Opinions Do Language Models Reflect?.. ICML. arXiv:2303.17548</w:t>
       </w:r>
     </w:p>
     <w:p>
@@ -16143,7 +15943,7 @@
         <w:ind w:left="360" w:hanging="360"/>
       </w:pPr>
       <w:r>
-        <w:t>Kambhampati. (2024). Can Large Language Models Reason and Plan?.. Annals of the New York Academy of Sciences. arXiv:2403.04121. doi:10.1111/nyas.15125</w:t>
+        <w:t>Pawar et al.. (2025). Presumed Cultural Identity: How Names Shape LLM Responses.. arXiv preprint. arXiv:2502.11995</w:t>
       </w:r>
     </w:p>
     <w:p>
@@ -16151,7 +15951,7 @@
         <w:ind w:left="360" w:hanging="360"/>
       </w:pPr>
       <w:r>
-        <w:t>Zhou et al.. (2025). Veracity Bias and Beyond: Uncovering LLMs' Hidden Beliefs in Problem-Solving Reasoning.. ACL 2025 (Main). arXiv:2505.16128</w:t>
+        <w:t>Weissburg et al.. (2024). LLMs are Biased Teachers: Evaluating LLM Bias in Personalized Education.. NAACL Findings 2025. arXiv:2410.14012</w:t>
       </w:r>
     </w:p>
     <w:p>
@@ -16159,7 +15959,7 @@
         <w:ind w:left="360" w:hanging="360"/>
       </w:pPr>
       <w:r>
-        <w:t>Kabra et al.. (2025). Reasoning Towards Fairness: Mitigating Bias in Language Models through Reasoning-Guided Fine-Tuning.. arXiv preprint. arXiv:2504.05632</w:t>
+        <w:t>Deldjoo et al.. (2024). CFaiRLLM: Consumer Fairness Evaluation in Large-Language Model Recommender System.. arXiv preprint. arXiv:2403.05668</w:t>
       </w:r>
     </w:p>
     <w:p>
@@ -16167,7 +15967,7 @@
         <w:ind w:left="360" w:hanging="360"/>
       </w:pPr>
       <w:r>
-        <w:t>Hall et al.. (2025). Guiding LLM Decision-Making with Fairness Reward Models.. arXiv preprint. arXiv:2507.11344</w:t>
+        <w:t>Deldjoo et al.. (2024). A Normative Framework for Benchmarking Consumer Fairness in Large Language Model Recommender Systems.. arXiv preprint. arXiv:2405.02219</w:t>
       </w:r>
     </w:p>
     <w:p>
@@ -16175,7 +15975,7 @@
         <w:ind w:left="360" w:hanging="360"/>
       </w:pPr>
       <w:r>
-        <w:t>Santurkar et al.. (2023). Whose Opinions Do Language Models Reflect?.. ICML. arXiv:2303.17548</w:t>
+        <w:t>Arzaghi et al.. (2024). Understanding Intrinsic Socioeconomic Biases in Large Language Models.. arXiv preprint. arXiv:2405.18662</w:t>
       </w:r>
     </w:p>
     <w:p>
@@ -16183,7 +15983,7 @@
         <w:ind w:left="360" w:hanging="360"/>
       </w:pPr>
       <w:r>
-        <w:t>Pawar et al.. (2025). Presumed Cultural Identity: How Names Shape LLM Responses.. arXiv preprint. arXiv:2502.11995</w:t>
+        <w:t>Lin et al.. (2024). Assessing Dialect Fairness and Robustness of Large Language Models in Reasoning Tasks.. ACL 2025. arXiv:2410.11005</w:t>
       </w:r>
     </w:p>
     <w:p>
@@ -16191,7 +15991,7 @@
         <w:ind w:left="360" w:hanging="360"/>
       </w:pPr>
       <w:r>
-        <w:t>Weissburg et al.. (2024). LLMs are Biased Teachers: Evaluating LLM Bias in Personalized Education.. NAACL Findings 2025. arXiv:2410.14012</w:t>
+        <w:t>Vijjini et al.. (2024). Exploring Safety-Utility Trade-Offs in Personalized Language Models.. NAACL 2025. arXiv:2406.11107</w:t>
       </w:r>
     </w:p>
     <w:p>
@@ -16199,7 +15999,7 @@
         <w:ind w:left="360" w:hanging="360"/>
       </w:pPr>
       <w:r>
-        <w:t>Deldjoo et al.. (2024). CFaiRLLM: Consumer Fairness Evaluation in Large-Language Model Recommender System.. arXiv preprint. arXiv:2403.05668</w:t>
+        <w:t>Hong et al.. (2025). Measuring Sycophancy of Language Models in Multi-turn Dialogues.. EMNLP 2025 Findings. arXiv:2505.23840</w:t>
       </w:r>
     </w:p>
     <w:p>
@@ -16207,47 +16007,7 @@
         <w:ind w:left="360" w:hanging="360"/>
       </w:pPr>
       <w:r>
-        <w:t>Deldjoo et al.. (2024). A Normative Framework for Benchmarking Consumer Fairness in Large Language Model Recommender Systems.. arXiv preprint. arXiv:2405.02219</w:t>
-      </w:r>
-    </w:p>
-    <w:p>
-      <w:pPr>
-        <w:ind w:left="360" w:hanging="360"/>
-      </w:pPr>
-      <w:r>
-        <w:t>Arzaghi et al.. (2024). Understanding Intrinsic Socioeconomic Biases in Large Language Models.. arXiv preprint. arXiv:2405.18662</w:t>
-      </w:r>
-    </w:p>
-    <w:p>
-      <w:pPr>
-        <w:ind w:left="360" w:hanging="360"/>
-      </w:pPr>
-      <w:r>
-        <w:t>Lin et al.. (2024). Assessing Dialect Fairness and Robustness of Large Language Models in Reasoning Tasks.. ACL 2025. arXiv:2410.11005</w:t>
-      </w:r>
-    </w:p>
-    <w:p>
-      <w:pPr>
-        <w:ind w:left="360" w:hanging="360"/>
-      </w:pPr>
-      <w:r>
-        <w:t>Vijjini et al.. (2024). Exploring Safety-Utility Trade-Offs in Personalized Language Models.. NAACL 2025. arXiv:2406.11107</w:t>
-      </w:r>
-    </w:p>
-    <w:p>
-      <w:pPr>
-        <w:ind w:left="360" w:hanging="360"/>
-      </w:pPr>
-      <w:r>
         <w:t>Sharma et al.. (2024). Towards Understanding Sycophancy in Language Models.. ICLR. arXiv:2310.13548</w:t>
-      </w:r>
-    </w:p>
-    <w:p>
-      <w:pPr>
-        <w:ind w:left="360" w:hanging="360"/>
-      </w:pPr>
-      <w:r>
-        <w:t>Hong et al.. (2025). Measuring Sycophancy of Language Models in Multi-turn Dialogues.. EMNLP 2025 Findings. arXiv:2505.23840</w:t>
       </w:r>
     </w:p>
     <w:p>

</xml_diff>

<commit_message>
Review pass 3: fix citation attributions (blankenstein/ducx/hall/cao/madigan/wu), formalism consistency (P3/P4/P5, signed disparity, operator tags), pilot honesty, corpus numbers (202/65%), add Table 1; PDF 65pp
</commit_message>
<xml_diff>
--- a/AGENT_FAIRNESS_SURVEY.docx
+++ b/AGENT_FAIRNESS_SURVEY.docx
@@ -107,7 +107,7 @@
         <w:t>conduction operator</w:t>
       </w:r>
       <w:r>
-        <w:t xml:space="preserve"> (how disparity transforms across each pipeline edge: ATTENUATE, PRESERVE, AMPLIFY, or GENERATE). Together these yield a conduction equation that predicts trajectory-level disparity from component-level measurements. This framework converts a component taxonomy into a testable formal theory: five propositions, stated under the linearized BCF model, characterize locality (P1), masking (P2, the measurement gap), super-additivity (P3, the agentic multiplier), mitigation matching (P4), and measurement adequacy (P5). Grounded in a verified corpus of 202 papers spanning 2017 to 2026, the survey maps the literature onto the BCF locus x operator grid, delivers trajectory-level and action-level disparity metrics (tool-invocation, escalation, and plan-allocation disparity) formalized as instances of the BCF's component counterfactual disparity Δ_c, constructs a mitigation map relating each intervention family to the pipeline component and operator it addresses, and reports a small pilot of an executable cross-framework bias audit whose results illustrate P2 (decision-level parity masking a score-level disparity) and the P3 amplification trend (mean absolute score difference rising as agentic scaffolding increases), with a full confirmatory study left to future work. We further characterize a structural </w:t>
+        <w:t xml:space="preserve"> (how disparity transforms across each pipeline edge: ATTENUATE, PRESERVE, AMPLIFY, or GENERATE). Together these yield a conduction equation that predicts trajectory-level disparity from component-level measurements. This framework converts a component taxonomy into a testable formal theory: five propositions, stated under the linearized BCF model, characterize locality (P1), masking (P2, the measurement gap), super-additivity (P3, the agentic multiplier), mitigation matching (P4), and measurement adequacy (P5). Grounded in a verified corpus of 202 papers spanning 2012 to 2026, the survey maps the literature onto the BCF locus x operator grid, delivers trajectory-level and action-level disparity metrics (tool-invocation, escalation, and plan-allocation disparity) formalized as instances of the BCF's component counterfactual disparity Δ_c, constructs a mitigation map relating each intervention family to the pipeline component and operator it addresses, and reports a small pilot of an executable cross-framework bias audit whose results illustrate P2 (decision-level parity masking a score-level disparity) and is directionally consistent with the P3 amplification trend (mean absolute score difference rising as agentic scaffolding increases), with a full confirmatory study left to future work. We further characterize a structural </w:t>
       </w:r>
       <w:r>
         <w:rPr>
@@ -215,7 +215,7 @@
         <w:t>fairness in an LLM agent cannot be captured by a single model-level metric; it must be analyzed per agent component</w:t>
       </w:r>
       <w:r>
-        <w:t xml:space="preserve">, because bias enters at distinct, separately-measurable, and separately-mitigable points in the pipeline and is transformed (attenuated, preserved, amplified, or generated from zero) at each edge. A model that is near-parity on a question-answering bias benchmark can still exhibit systematic tool-selection bias that no answer-level metric detects [blankenstein2025biasbusters], inherit unfairness from a retrieval step the base model alone never exhibited [wu2024rag, hu2024free], acquire bias from an assigned persona or role [gupta2023bias, cao2026from], or drift toward sycophantic, identity-conforming behavior over a long dialogue [liu2025truth, ma2026implicit]. Crucially, </w:t>
+        <w:t xml:space="preserve">, because bias enters at distinct, separately-measurable, and separately-mitigable points in the pipeline and is transformed (attenuated, preserved, amplified, or generated from zero) at each edge. A model that is near-parity on a question-answering bias benchmark can still exhibit systematic tool-selection preferences independent of task fitness (provider and ordering bias) that no answer-level metric detects [blankenstein2025biasbusters], inherit unfairness from a retrieval step the base model alone never exhibited [wu2024rag, hu2024free], acquire bias from an assigned persona or role [gupta2023bias, cao2026from], or drift toward sycophantic, identity-conforming behavior over a long dialogue [liu2025truth, ma2026implicit]. Crucially, </w:t>
       </w:r>
       <w:r>
         <w:rPr>
@@ -280,7 +280,7 @@
         <w:t>conduction operator</w:t>
       </w:r>
       <w:r>
-        <w:t xml:space="preserve"> (ATTENUATE φ&lt;1 / PRESERVE φ≈1 / AMPLIFY φ&gt;1 / GENERATE φ on zero input). The formal core (§3.0) defines: D1 the agent loop as the tuple ⟨π,T,M,R⟩ (policy, tool registry, memory module, reward/evaluation signal); D2 component counterfactual disparity Δ_c measured via trace-replay; D3 the set of conduction operators. The conduction equation Δ_τ ≈ Σ_c Δ_c · Π φ_e with feedback recurrence Δ^(t+1) = φ_fb · Δ^(t) + Δ_entry predicts trajectory-level disparity from component measurements. Five propositions follow: P1 Locality (a disparity at component c is attributable to that component's locus if it vanishes under a component-level counterfactual), P2 Masking (token-level parity can coexist with action-level disparity, the measurement gap as a theorem), P3 Super-additivity (the agentic multiplier: trajectory disparity exceeds the sum of component disparities under amplifying operators), P4 Mitigation matching (an intervention reduces Δ_τ only if it targets the locus and operator of the dominant Δ_c), and P5 Measurement adequacy (a fairness metric is adequate for an agent iff it surfaces Δ_c for every component with non-negligible φ). Section 3.8 provides a worked hiring-agent example tracing bias from C0 (base model) through C3 (delegation), and a four-step auditor recipe (instrument trace-replay, estimate φ_e per edge, identify dominant locus, match mitigation to operator).</w:t>
+        <w:t xml:space="preserve"> (ATTENUATE φ&lt;1 / PRESERVE φ≈1 / AMPLIFY φ&gt;1 / GENERATE φ on zero input). The formal core (§3.0) defines: D1 the agent loop as the tuple ⟨π,T,M,R⟩ (policy, tool registry, memory module, reward/evaluation signal); D2 component counterfactual disparity Δ_c measured via trace-replay; D3 the set of conduction operators. The conduction equation Δ_τ ≈ Σ_c Δ_c · Π φ_e with feedback recurrence Δ^(t+1) = φ_fb · Δ^(t) + Δ_entry predicts trajectory-level disparity from component measurements. Five propositions follow: P1 Locality (a disparity at component c is attributable to that component's locus if it vanishes under a component-level counterfactual), P2 Masking (token-level parity can coexist with action-level disparity, the measurement gap as a theorem), P3 Super-additivity (the agentic multiplier: Δ_τ can exceed the naive sum Σ_c |Δ_c| when at least one AMPLIFY or GENERATE edge lies on a conduction path), P4 Mitigation matching (an intervention reduces Δ_τ only if it targets the locus and operator of the dominant Δ_c), and P5 Measurement adequacy (a fairness metric is adequate for an agent only if it surfaces Δ_c for every component with non-negligible φ, with adequacy graded in the tiers of §3.0.5). Section 3.8 provides a worked hiring-agent example tracing bias from C0 (base model) through C3 (delegation), and a four-step auditor recipe (instrument trace-replay, estimate φ_e per edge, identify dominant locus, match mitigation to operator).</w:t>
       </w:r>
     </w:p>
     <w:p>
@@ -322,7 +322,7 @@
         <w:t>The pilot illustrates the predicted masking-and-amplification pattern but is directional only; a full confirmatory study is future work.</w:t>
       </w:r>
       <w:r>
-        <w:t xml:space="preserve"> The protocol, harness, and raw decisions are released for independent reproduction.</w:t>
+        <w:t xml:space="preserve"> The protocol, harness, and raw decisions will be released with the camera-ready.</w:t>
       </w:r>
     </w:p>
     <w:p>
@@ -469,7 +469,7 @@
         <w:t>Mayilvaghanan et al. 2026</w:t>
       </w:r>
       <w:r>
-        <w:t xml:space="preserve"> [mayilvaghanan2026counterfactual]: applies CFR/MASD in a single domain (customer service); our survey generalizes those metrics across all six BCF components.</w:t>
+        <w:t xml:space="preserve"> [mayilvaghanan2026counterfactual]: applies CFR/MASD in a single domain (contact-center agent quality assurance); our survey generalizes those metrics across all six BCF components.</w:t>
       </w:r>
     </w:p>
     <w:p>
@@ -541,7 +541,7 @@
         <w:t>Corpus note.</w:t>
       </w:r>
       <w:r>
-        <w:t xml:space="preserve"> This survey covers 202 verified papers. Approximately 140 of those papers are not covered by either [gallegos2024bias] or [chu2024fairness], reflecting the rapid growth of agentic fairness work in 2024 to 2026. The 61% of the corpus published in 2024 or later confirms that the subfield is emergent rather than mature, a temporal trend analyzed in §2.6.</w:t>
+        <w:t xml:space="preserve"> This survey covers 202 verified papers. Approximately 140 of those papers are not covered by either [gallegos2024bias] or [chu2024fairness], reflecting the rapid growth of agentic fairness work in 2024 to 2026. The 65% of the corpus published in 2024 or later confirms that the subfield is emergent rather than mature, a temporal trend analyzed in §2.6.</w:t>
       </w:r>
     </w:p>
     <w:p>
@@ -1826,7 +1826,7 @@
               <w:rPr>
                 <w:b/>
               </w:rPr>
-              <w:t>201</w:t>
+              <w:t>202</w:t>
             </w:r>
           </w:p>
         </w:tc>
@@ -2213,7 +2213,7 @@
         <w:t>Bias origins and pitfalls.</w:t>
       </w:r>
       <w:r>
-        <w:t xml:space="preserve"> [blodgett2021stereotyping] audit fairness benchmark datasets and catalog recurring methodological pitfalls, establishing that measurement artefacts can mislead benchmark-based conclusions. This concern is taken up again in Section 2.7 (Threats to Validity).</w:t>
+        <w:t xml:space="preserve"> [blodgett2021stereotyping] audit fairness benchmark datasets and catalog recurring methodological pitfalls, establishing that measurement artefacts can mislead benchmark-based conclusions. This concern is taken up again in Section 2.8 (Threats to Validity).</w:t>
       </w:r>
     </w:p>
     <w:p>
@@ -2281,7 +2281,7 @@
         <w:t>the action-answer gap</w:t>
       </w:r>
       <w:r>
-        <w:t xml:space="preserve">: [li2025actions] demonstrate that agent </w:t>
+        <w:t xml:space="preserve">: [li2025actions][†] demonstrate that agent </w:t>
       </w:r>
       <w:r>
         <w:rPr>
@@ -2290,7 +2290,7 @@
         <w:t>decisions</w:t>
       </w:r>
       <w:r>
-        <w:t xml:space="preserve"> reveal implicit biases invisible at the verbal-output level. A model can emit neutral text while simultaneously issuing actions with demographic disparity. BBQ can detect that a model answers a stereotyped question incorrectly; it cannot detect that a hiring agent systematically routes applicants with certain name patterns to lower-quality resume-screening tools.</w:t>
+        <w:t xml:space="preserve"> (persona-based simulated decisions rather than tool-using pipeline actions, hence the transfer marker) reveal implicit biases invisible at the verbal-output level. A model can emit neutral text while simultaneously issuing actions with demographic disparity. BBQ can detect that a model answers a stereotyped question incorrectly; it cannot detect that a hiring agent systematically routes applicants with certain name patterns to lower-quality resume-screening tools.</w:t>
       </w:r>
     </w:p>
     <w:p>
@@ -2329,7 +2329,7 @@
         <w:t>Component 1: Tool and API selection.</w:t>
       </w:r>
       <w:r>
-        <w:t xml:space="preserve"> The agent chooses, at each step, which external tool, API, retriever, or knowledge source to invoke. This choice is a learned behavior conditioned on contextual signals, including potentially demographic signals in the query or retrieved context [blankenstein2025biasbusters]. Tool-selection policy is therefore a locus of discriminatory routing, independently of the final answer quality.</w:t>
+        <w:t xml:space="preserve"> The agent chooses, at each step, which external tool, API, retriever, or knowledge source to invoke. This choice is a learned behavior conditioned on contextual signals: systematic selection preferences independent of task fitness (provider and ordering bias) are already documented [blankenstein2025biasbusters], and demographic signals in the query or retrieved context are a further, as-yet-unmeasured conditioning channel. Tool-selection policy is therefore a locus of discriminatory routing, independently of the final answer quality.</w:t>
       </w:r>
     </w:p>
     <w:p>
@@ -2384,7 +2384,7 @@
         <w:t>Component 6: Long-horizon trajectory execution.</w:t>
       </w:r>
       <w:r>
-        <w:t xml:space="preserve"> Over extended multi-turn interactions or autonomous task executions, small per-step biases can compound into large cumulative disparities [ma2026implicit, wyllie2024fairness]. This longitudinal dimension is not captured by any existing single-turn benchmark and constitutes the most undertheorized component in current fairness research.</w:t>
+        <w:t xml:space="preserve"> Over extended multi-turn interactions or autonomous task executions, small per-step biases can compound into large cumulative disparities [ma2026implicit, wyllie2024fairness]. This longitudinal dimension is not captured by any existing single-turn benchmark and constitutes the most undertheorized component in current fairness research. We present it here as a sixth conceptual dimension, but §3.6 argues it is more precisely a temporal axis on the feedback edge rather than an independent architectural component, a distinction the BCF makes precise once the framework is in place.</w:t>
       </w:r>
     </w:p>
     <w:p>
@@ -2439,7 +2439,7 @@
         <w:t>Multi-tagging convention.</w:t>
       </w:r>
       <w:r>
-        <w:t xml:space="preserve"> A paper may be tagged to multiple components when its findings are mechanistically relevant to each. The coverage matrix in §7 counts such papers in each tagged cell; the total of unique papers is 201. Papers that cross-cut four or more sections (e.g., [gallegos2024bias] ×4, [fan2024fairmt] ×3) are counted once in the unique total.</w:t>
+        <w:t xml:space="preserve"> A paper may be tagged to multiple components when its findings are mechanistically relevant to each. The coverage matrix in §7 counts such papers in each tagged cell; the total of unique papers is 202. Papers that cross-cut four or more sections (e.g., [gallegos2024bias] ×4, [fan2024fairmt] ×3) are counted once in the unique total.</w:t>
       </w:r>
     </w:p>
     <w:p>
@@ -3598,7 +3598,7 @@
               <w:rPr>
                 <w:b/>
               </w:rPr>
-              <w:t>201</w:t>
+              <w:t>202</w:t>
             </w:r>
             <w:r>
               <w:t xml:space="preserve"> (unique)</w:t>
@@ -3613,7 +3613,7 @@
         <w:rPr>
           <w:i/>
         </w:rPr>
-        <w:t>Note: rows do not sum to 201 because papers appearing in multiple branches are deduplicated at the final stage; the multi-tag convention is applied after inclusion decisions are finalized.</w:t>
+        <w:t>Note: rows do not sum to 202 because papers appearing in multiple branches are deduplicated at the final stage; the multi-tag convention is applied after inclusion decisions are finalized. Included counts are by primary branch (each paper's single primary locus); they partition the corpus and sum to 202; cross-cutting papers are additionally counted in secondary branches in the coverage matrix (§7). The corresponding primary-branch partition is: foundational/must-cite 46, related-surveys/prior-art 29, foundations 16, evaluation-metrics-benchmarks 16, mitigation 13, high-stakes-domains 13, llm-agents-general 12, tool/API-selection 12, user-modeling/personalization 11, memory/retrieval 10, multi-agent-delegation 9, long-horizon-drift 9, planning/decomposition 6.</w:t>
       </w:r>
     </w:p>
     <w:p>
@@ -3667,10 +3667,10 @@
         <w:rPr>
           <w:b/>
         </w:rPr>
-        <w:t>Stage 4: Inclusion (n = 201).</w:t>
-      </w:r>
-      <w:r>
-        <w:t xml:space="preserve"> Full-text review confirmed inclusion criteria and assigned branch tags. Records excluded at this stage failed criterion (iii), typically single-turn generation studies with no agentic framing, or were superseded by a more recent version of the same work. The final corpus comprises 202 unique papers spanning 2015 to 2026.</w:t>
+        <w:t>Stage 4: Inclusion (n = 202).</w:t>
+      </w:r>
+      <w:r>
+        <w:t xml:space="preserve"> Full-text review confirmed inclusion criteria and assigned branch tags. Records excluded at this stage failed criterion (iii), typically single-turn generation studies with no agentic framing, or were superseded by a more recent version of the same work. The final corpus comprises 202 unique papers spanning 2012 to 2026.</w:t>
       </w:r>
     </w:p>
     <w:p>
@@ -3899,7 +3899,7 @@
           </w:tcPr>
           <w:p>
             <w:r>
-              <w:t>Non-English (pragmatic exclusion; acknowledged as limitation in §2.7)</w:t>
+              <w:t>Non-English (pragmatic exclusion; acknowledged as limitation in §2.8)</w:t>
             </w:r>
           </w:p>
         </w:tc>
@@ -3994,7 +3994,7 @@
         <w:rPr>
           <w:b/>
         </w:rPr>
-        <w:t>5 (2%)</w:t>
+        <w:t>18 (9%)</w:t>
       </w:r>
       <w:r>
         <w:t xml:space="preserve"> predate 2020 (primarily foundational ML fairness and NLP bias work), </w:t>
@@ -4012,7 +4012,7 @@
         <w:rPr>
           <w:b/>
         </w:rPr>
-        <w:t>36 (18%)</w:t>
+        <w:t>31 (15%)</w:t>
       </w:r>
       <w:r>
         <w:t xml:space="preserve"> in 2023, </w:t>
@@ -4030,7 +4030,7 @@
         <w:rPr>
           <w:b/>
         </w:rPr>
-        <w:t>60 (30%)</w:t>
+        <w:t>53 (26%)</w:t>
       </w:r>
       <w:r>
         <w:t xml:space="preserve"> in 2025 to 2026 (through June cutoff). The combined 2024 to 2026 cohort constitutes </w:t>
@@ -4039,10 +4039,10 @@
         <w:rPr>
           <w:b/>
         </w:rPr>
-        <w:t>69%</w:t>
-      </w:r>
-      <w:r>
-        <w:t xml:space="preserve"> of the corpus, reflecting the field's rapid emergence following the widespread deployment of instruction-tuned and tool-augmented LLMs.</w:t>
+        <w:t>65%</w:t>
+      </w:r>
+      <w:r>
+        <w:t xml:space="preserve"> of the corpus (131 papers), reflecting the field's rapid emergence following the widespread deployment of instruction-tuned and tool-augmented LLMs.</w:t>
       </w:r>
     </w:p>
     <w:p>
@@ -4390,7 +4390,7 @@
     </w:p>
     <w:p>
       <w:r>
-        <w:t>The 69% concentration of papers in 2024 to 2026 means the survey reflects a rapidly changing field. Findings from 2024 papers may already have been partially addressed by 2026 mitigations not yet captured in the corpus. Conversely, the long-horizon and multi-agent components, where empirical papers are newest and most sparse, may have received substantially more attention by the time this survey reaches print, making the "open edge" assessments in §3.x optimistic. We treat this as a motivating condition, not a confound: the survey's goal is to provide a structured framework for the field's future development, not to give a final accounting of a stable literature.</w:t>
+        <w:t>The 65% concentration of papers in 2024 to 2026 means the survey reflects a rapidly changing field. Findings from 2024 papers may already have been partially addressed by 2026 mitigations not yet captured in the corpus. Conversely, the long-horizon and multi-agent components, where empirical papers are newest and most sparse, may have received substantially more attention by the time this survey reaches print, making the "open edge" assessments in §3.x optimistic. We treat this as a motivating condition, not a confound: the survey's goal is to provide a structured framework for the field's future development, not to give a final accounting of a stable literature.</w:t>
       </w:r>
     </w:p>
     <w:p>
@@ -4815,7 +4815,7 @@
     </w:p>
     <w:p>
       <w:r>
-        <w:t>Δ_c is the quantity that the clinical decomposition study of [xu2026ducx] estimates when it attributes separable shares of a tool-using agent's total unfairness to the model, the data, and the tool-invocation stage. To our knowledge this is the only corpus paper that operationalizes the full decomposition, which is why §4.3 elevates trace-replay to the canonical estimator and §6 builds its protocol around it.</w:t>
+        <w:t>Δ_c is the quantity that the clinical decomposition study of [xu2026ducx] estimates when it attributes separable shares of a tool-using agent's total unfairness to the tool-exposure, tool-transition, and model-reasoning stages. To our knowledge this is the only corpus paper that operationalizes the full decomposition, which is why §4.3 elevates trace-replay to the canonical estimator and §6 builds its protocol around it.</w:t>
       </w:r>
     </w:p>
     <w:p>
@@ -5021,7 +5021,7 @@
           </w:tcPr>
           <w:p>
             <w:r>
-              <w:t>biased chatbots become biased agents under role assignment [cao2026from]; reward models inherit dialect penalties [mire2025rejected]</w:t>
+              <w:t>reward models inherit dialect penalties [mire2025rejected]</w:t>
             </w:r>
           </w:p>
         </w:tc>
@@ -5131,7 +5131,7 @@
           </w:tcPr>
           <w:p>
             <w:r>
-              <w:t>RAG undermines fairness even for vigilant users [hu2024free]; persona assignment injects reasoning bias [gupta2023bias]; reasoning itself introduces bias [wu2025reasoning]</w:t>
+              <w:t>RAG undermines fairness even for vigilant users [hu2024free]; persona assignment injects reasoning bias and new behavioral distortion [gupta2023bias, cao2026from]; reasoning itself introduces bias [wu2025reasoning]</w:t>
             </w:r>
           </w:p>
         </w:tc>
@@ -5296,7 +5296,7 @@
         <w:t>Every measurable trajectory disparity decomposes into component entries plus an interaction residual: Δ_τ ≠ 0 implies a nonzero Δ_c at some locus c (counting GENERATE edges as entries), or a nonzero cross-component interaction term that the linearized equation folds into the nearest downstream GENERATE edge.</w:t>
       </w:r>
       <w:r>
-        <w:t xml:space="preserve"> The residual matters because pure interaction effects (disparity present in no component alone but produced by their composition) are exactly the multi-agent GENERATE phenomenon. Justification: this is the premise validated whenever decomposition succeeds. [xu2026ducx] attributes distinct, separable shares of a clinical agent's disparity to the tool-invocation stage versus the model, and the component-specific audits surveyed in §§3.1 to 3.5 each isolate a nonzero Δ_c with other components held fixed.</w:t>
+        <w:t xml:space="preserve"> The residual matters because pure interaction effects (disparity present in no component alone but produced by their composition) are exactly the multi-agent GENERATE phenomenon. Justification: this is the premise validated whenever decomposition succeeds. [xu2026ducx] attributes distinct, separable shares of a clinical agent's disparity to the tool-exposure and tool-transition stages versus model reasoning, and the component-specific audits surveyed in §§3.1 to 3.5 each isolate a nonzero Δ_c with other components held fixed.</w:t>
       </w:r>
     </w:p>
     <w:p>
@@ -5342,7 +5342,7 @@
         <w:rPr>
           <w:i/>
         </w:rPr>
-        <w:t>Δ_τ can exceed the naive sum Σ_c |Δ_c| when at least one AMPLIFY or GENERATE edge lies on a conduction path. This is a sufficient condition under the linearized model: an AMPLIFY/GENERATE edge can be offset by a downstream ATTENUATE edge, and nonlinear cross-component interactions can produce super-additivity even without one; conversely, with only PRESERVE/ATTENUATE edges and no interaction term, composition is sub-additive and component audits compose into a conservative system bound.</w:t>
+        <w:t>Δ_τ can exceed the naive sum Σ_c |Δ_c| when at least one AMPLIFY or GENERATE edge lies on a conduction path. Under the linearized magnitude model, an AMPLIFY or GENERATE edge is a necessary condition for super-additivity, not a sufficient one, since it can be offset by a downstream ATTENUATE edge; once nonlinear cross-component interactions are admitted, even necessity fails, because interactions can produce super-additivity without such an edge. Conversely, with only PRESERVE/ATTENUATE edges and no interaction term, composition is sub-additive and component audits compose into a conservative system bound.</w:t>
       </w:r>
       <w:r>
         <w:t xml:space="preserve"> Justification: within the multi-agent locus this is directly evidenced. Stereotypical bias emerges, propagates, and is amplified across interacting agents, making the collective more biased than its members [nguyen2025social], and group-level fairness is emergent rather than inherited [madigan2025emergent]. §3.7 develops P3 and marks its cross-component generalization as conjecture.</w:t>
@@ -5976,6 +5976,345 @@
       </w:r>
     </w:p>
     <w:p>
+      <w:r>
+        <w:rPr>
+          <w:b/>
+        </w:rPr>
+        <w:t>Table 1: Component × harm mechanism × representative evidence × maturity.</w:t>
+      </w:r>
+      <w:r>
+        <w:t xml:space="preserve"> Maturity is graded ●●● (well-studied), ●●○, or ●○○ (emerging).</w:t>
+      </w:r>
+    </w:p>
+    <w:tbl>
+      <w:tblPr>
+        <w:tblStyle w:val="LightGrid-Accent1"/>
+        <w:tblW w:type="auto" w:w="0"/>
+        <w:tblLook w:firstColumn="1" w:firstRow="1" w:lastColumn="0" w:lastRow="0" w:noHBand="0" w:noVBand="1" w:val="04A0"/>
+      </w:tblPr>
+      <w:tblGrid>
+        <w:gridCol w:w="2160"/>
+        <w:gridCol w:w="2160"/>
+        <w:gridCol w:w="2160"/>
+        <w:gridCol w:w="2160"/>
+      </w:tblGrid>
+      <w:tr>
+        <w:tc>
+          <w:tcPr>
+            <w:tcW w:type="dxa" w:w="2160"/>
+          </w:tcPr>
+          <w:p>
+            <w:r>
+              <w:rPr>
+                <w:b/>
+              </w:rPr>
+              <w:t>Component</w:t>
+            </w:r>
+          </w:p>
+        </w:tc>
+        <w:tc>
+          <w:tcPr>
+            <w:tcW w:type="dxa" w:w="2160"/>
+          </w:tcPr>
+          <w:p>
+            <w:r>
+              <w:rPr>
+                <w:b/>
+              </w:rPr>
+              <w:t>Primary harm mechanism</w:t>
+            </w:r>
+          </w:p>
+        </w:tc>
+        <w:tc>
+          <w:tcPr>
+            <w:tcW w:type="dxa" w:w="2160"/>
+          </w:tcPr>
+          <w:p>
+            <w:r>
+              <w:rPr>
+                <w:b/>
+              </w:rPr>
+              <w:t>Representative evidence</w:t>
+            </w:r>
+          </w:p>
+        </w:tc>
+        <w:tc>
+          <w:tcPr>
+            <w:tcW w:type="dxa" w:w="2160"/>
+          </w:tcPr>
+          <w:p>
+            <w:r>
+              <w:rPr>
+                <w:b/>
+              </w:rPr>
+              <w:t>Maturity</w:t>
+            </w:r>
+          </w:p>
+        </w:tc>
+      </w:tr>
+      <w:tr>
+        <w:tc>
+          <w:tcPr>
+            <w:tcW w:type="dxa" w:w="2160"/>
+          </w:tcPr>
+          <w:p>
+            <w:r>
+              <w:t>C1 Tool / API selection (§3.1)</w:t>
+            </w:r>
+          </w:p>
+        </w:tc>
+        <w:tc>
+          <w:tcPr>
+            <w:tcW w:type="dxa" w:w="2160"/>
+          </w:tcPr>
+          <w:p>
+            <w:r>
+              <w:t>Selection skew over the tool registry independent of task fitness; routing conditioned on surface or demographic cues</w:t>
+            </w:r>
+          </w:p>
+        </w:tc>
+        <w:tc>
+          <w:tcPr>
+            <w:tcW w:type="dxa" w:w="2160"/>
+          </w:tcPr>
+          <w:p>
+            <w:r>
+              <w:t>[blankenstein2025biasbusters, sneh2025tooltweak, xu2026ducx]</w:t>
+            </w:r>
+          </w:p>
+        </w:tc>
+        <w:tc>
+          <w:tcPr>
+            <w:tcW w:type="dxa" w:w="2160"/>
+          </w:tcPr>
+          <w:p>
+            <w:r>
+              <w:t>●●○</w:t>
+            </w:r>
+          </w:p>
+        </w:tc>
+      </w:tr>
+      <w:tr>
+        <w:tc>
+          <w:tcPr>
+            <w:tcW w:type="dxa" w:w="2160"/>
+          </w:tcPr>
+          <w:p>
+            <w:r>
+              <w:t>C2 Memory &amp; retrieval (§3.2)</w:t>
+            </w:r>
+          </w:p>
+        </w:tc>
+        <w:tc>
+          <w:tcPr>
+            <w:tcW w:type="dxa" w:w="2160"/>
+          </w:tcPr>
+          <w:p>
+            <w:r>
+              <w:t>RAG-injected disparity from clean inputs; accumulation of skew across turns</w:t>
+            </w:r>
+          </w:p>
+        </w:tc>
+        <w:tc>
+          <w:tcPr>
+            <w:tcW w:type="dxa" w:w="2160"/>
+          </w:tcPr>
+          <w:p>
+            <w:r>
+              <w:t>[hu2024free, wu2024rag, fan2024fairmt]</w:t>
+            </w:r>
+          </w:p>
+        </w:tc>
+        <w:tc>
+          <w:tcPr>
+            <w:tcW w:type="dxa" w:w="2160"/>
+          </w:tcPr>
+          <w:p>
+            <w:r>
+              <w:t>●●○</w:t>
+            </w:r>
+          </w:p>
+        </w:tc>
+      </w:tr>
+      <w:tr>
+        <w:tc>
+          <w:tcPr>
+            <w:tcW w:type="dxa" w:w="2160"/>
+          </w:tcPr>
+          <w:p>
+            <w:r>
+              <w:t>C3 Multi-agent delegation (§3.3)</w:t>
+            </w:r>
+          </w:p>
+        </w:tc>
+        <w:tc>
+          <w:tcPr>
+            <w:tcW w:type="dxa" w:w="2160"/>
+          </w:tcPr>
+          <w:p>
+            <w:r>
+              <w:t>Persona/role injection, then amplification across interacting agents</w:t>
+            </w:r>
+          </w:p>
+        </w:tc>
+        <w:tc>
+          <w:tcPr>
+            <w:tcW w:type="dxa" w:w="2160"/>
+          </w:tcPr>
+          <w:p>
+            <w:r>
+              <w:t>[nguyen2025social, madigan2025emergent, choi2025identity]</w:t>
+            </w:r>
+          </w:p>
+        </w:tc>
+        <w:tc>
+          <w:tcPr>
+            <w:tcW w:type="dxa" w:w="2160"/>
+          </w:tcPr>
+          <w:p>
+            <w:r>
+              <w:t>●●●</w:t>
+            </w:r>
+          </w:p>
+        </w:tc>
+      </w:tr>
+      <w:tr>
+        <w:tc>
+          <w:tcPr>
+            <w:tcW w:type="dxa" w:w="2160"/>
+          </w:tcPr>
+          <w:p>
+            <w:r>
+              <w:t>C4 Planning / decomposition (§3.4)</w:t>
+            </w:r>
+          </w:p>
+        </w:tc>
+        <w:tc>
+          <w:tcPr>
+            <w:tcW w:type="dxa" w:w="2160"/>
+          </w:tcPr>
+          <w:p>
+            <w:r>
+              <w:t>Reasoning-stage disparity in plan structure, ordering, and allocation, with unfaithful traces</w:t>
+            </w:r>
+          </w:p>
+        </w:tc>
+        <w:tc>
+          <w:tcPr>
+            <w:tcW w:type="dxa" w:w="2160"/>
+          </w:tcPr>
+          <w:p>
+            <w:r>
+              <w:t>[wu2025reasoning, parziale2026once, hall2025guiding]</w:t>
+            </w:r>
+          </w:p>
+        </w:tc>
+        <w:tc>
+          <w:tcPr>
+            <w:tcW w:type="dxa" w:w="2160"/>
+          </w:tcPr>
+          <w:p>
+            <w:r>
+              <w:t>●○○</w:t>
+            </w:r>
+          </w:p>
+        </w:tc>
+      </w:tr>
+      <w:tr>
+        <w:tc>
+          <w:tcPr>
+            <w:tcW w:type="dxa" w:w="2160"/>
+          </w:tcPr>
+          <w:p>
+            <w:r>
+              <w:t>C5 User modeling / personalization (§3.5)</w:t>
+            </w:r>
+          </w:p>
+        </w:tc>
+        <w:tc>
+          <w:tcPr>
+            <w:tcW w:type="dxa" w:w="2160"/>
+          </w:tcPr>
+          <w:p>
+            <w:r>
+              <w:t>Inferred-identity stereotyping that tracks group profile over stated preference</w:t>
+            </w:r>
+          </w:p>
+        </w:tc>
+        <w:tc>
+          <w:tcPr>
+            <w:tcW w:type="dxa" w:w="2160"/>
+          </w:tcPr>
+          <w:p>
+            <w:r>
+              <w:t>[kantharuban2024stereotype, pawar2025presumed, staab2023memorization]</w:t>
+            </w:r>
+          </w:p>
+        </w:tc>
+        <w:tc>
+          <w:tcPr>
+            <w:tcW w:type="dxa" w:w="2160"/>
+          </w:tcPr>
+          <w:p>
+            <w:r>
+              <w:t>●●○</w:t>
+            </w:r>
+          </w:p>
+        </w:tc>
+      </w:tr>
+      <w:tr>
+        <w:tc>
+          <w:tcPr>
+            <w:tcW w:type="dxa" w:w="2160"/>
+          </w:tcPr>
+          <w:p>
+            <w:r>
+              <w:t>T-axis Long-horizon drift (§3.6)</w:t>
+            </w:r>
+          </w:p>
+        </w:tc>
+        <w:tc>
+          <w:tcPr>
+            <w:tcW w:type="dxa" w:w="2160"/>
+          </w:tcPr>
+          <w:p>
+            <w:r>
+              <w:t>Feedback-recurrence amplification (φ_fb &gt; 1) of per-step skew across turns and cycles</w:t>
+            </w:r>
+          </w:p>
+        </w:tc>
+        <w:tc>
+          <w:tcPr>
+            <w:tcW w:type="dxa" w:w="2160"/>
+          </w:tcPr>
+          <w:p>
+            <w:r>
+              <w:t>[ma2026implicit, liu2025truth, wyllie2024fairness]</w:t>
+            </w:r>
+          </w:p>
+        </w:tc>
+        <w:tc>
+          <w:tcPr>
+            <w:tcW w:type="dxa" w:w="2160"/>
+          </w:tcPr>
+          <w:p>
+            <w:r>
+              <w:t>●○○</w:t>
+            </w:r>
+          </w:p>
+        </w:tc>
+      </w:tr>
+    </w:tbl>
+    <w:p/>
+    <w:p>
+      <w:r>
+        <w:rPr>
+          <w:i/>
+        </w:rPr>
+        <w:t>Takeaway: every locus has documented harm, but maturity is uneven; the planning and long-horizon loci (C4, T-axis), where the GENERATE and feedback-AMPLIFY operators are most consequential, are the least mature, exactly the cells §7 shows as least instrumented.</w:t>
+      </w:r>
+    </w:p>
+    <w:p>
       <w:pPr>
         <w:pStyle w:val="Heading2"/>
       </w:pPr>
@@ -6040,7 +6379,7 @@
         <w:t>What is known.</w:t>
       </w:r>
       <w:r>
-        <w:t xml:space="preserve"> The most replicated finding at C1 is that tool-selection skew is a property of the selection policy π, not merely of the tools in the registry. Blankenstein et al. demonstrate that across tool registries, LLMs consistently prefer particular tools in ways that are independent of query fitness, constituting a reproducible GENERATE-operator signature [blankenstein2025biasbusters]. The mechanism generalizes cleanly from the established result that LLMs exhibit positional and surface-form sensitivity in discrete choice [pezeshkpour2023large][†]: when tool registries are presented as lists, the selection policy inherits these ordering effects without any explicit demographic input. This is a well-established baseline. Beyond the base pathology, the adversarial variant is also documented: ToolTweak shows that editing only a tool's name and description is sufficient to systematically inflate its selection rate [sneh2025tooltweak], and recommender-agents are steered analogously by injected preference biases [tang2026your]. Together, these results establish that C1 is a genuine, independent entry locus: the disparity resides in the selection step of π, not in any downstream content processing. The strongest evidence that C1 contributes independently to trajectory-level harm comes from [xu2026ducx], which decomposes a chest-X-ray agent's total disparity by component and shows that the tool-invocation stage carries a distinct attributable share that is conducted into the final clinical read, the cleanest existing instantiation of D2's trace-replay logic at this locus. The ATTENUATE direction is also documented: bias-aware retrieval agents that monitor and rebalance source selection reduce the skew [singh2025bias, singh2025biasb], constituting engineered φ &lt; 1 edges at the selection interface, consistent with P4's requirement that an intervention must target the locus and operator of the dominant Δ_c to reduce Δ_τ.</w:t>
+        <w:t xml:space="preserve"> The most replicated finding at C1 is that tool-selection skew is a property of the selection policy π, not merely of the tools in the registry. Blankenstein et al. demonstrate that across tool registries, LLMs consistently prefer particular tools in ways that are independent of query fitness, constituting a reproducible GENERATE-operator signature [blankenstein2025biasbusters]. The mechanism generalizes cleanly from the established result that LLMs exhibit positional and surface-form sensitivity in discrete choice [pezeshkpour2023large][†]: when tool registries are presented as lists, the selection policy inherits these ordering effects without any explicit demographic input. This is a well-established baseline. Beyond the base pathology, the adversarial variant is also documented: ToolTweak shows that editing only a tool's name and description is sufficient to systematically inflate its selection rate [sneh2025tooltweak], and recommender-agents are steered analogously by injected preference biases [tang2026your]. Together, these results establish that C1 is a genuine, independent entry locus: the disparity resides in the selection step of π, not in any downstream content processing. The strongest evidence that C1 contributes independently to trajectory-level harm comes from [xu2026ducx], which decomposes a chest-X-ray agent's total disparity by stage (tool exposure, tool transition, model reasoning) and shows that the tool stages carry a distinct attributable share that is conducted into the final clinical read, the closest published operational approximation to D2's decomposition at this locus. The ATTENUATE direction is also documented: bias-aware retrieval agents that monitor and rebalance source selection reduce the skew [singh2025bias, singh2025biasb], constituting engineered φ &lt; 1 edges at the selection interface, consistent with P4's requirement that an intervention must target the locus and operator of the dominant Δ_c to reduce Δ_τ.</w:t>
       </w:r>
     </w:p>
     <w:p>
@@ -6109,7 +6448,7 @@
         <w:t>user or subject</w:t>
       </w:r>
       <w:r>
-        <w:t xml:space="preserve"> under a counterfactual swap holding the query fixed. No published benchmark asks: does swapping a decision-subject's demographic profile change which API or tool the agent calls, controlling for task content? This is the Δ_tool instance of D2 that §4.3 formalizes as tool-invocation disparity. The absence of this measurement means the GENERATE-operator finding from [blankenstein2025biasbusters] characterizes population-level tool preference but not demographic-conditional skew, and the PRESERVE-operator finding from [xu2026ducx] attributes a disparity share to C1 but without the counterfactual isolation that P1 (Locality) requires for strict attribution. Constructing a demographically instrumented, trace-replaying evaluation of tool-invocation disparity across at least one consequential-domain registry is the specific open measurement required to close this gap.</w:t>
+        <w:t xml:space="preserve"> under a counterfactual swap holding the query fixed. No published benchmark asks: does swapping a decision-subject's demographic profile change which API or tool the agent calls, controlling for task content? This is the Δ_tool instance of D2 that §4.3 formalizes as tool-invocation disparity. Two phenomena must be kept distinct here: (a) provider- and ordering-preference selection bias among functionally equivalent tools, which is what [blankenstein2025biasbusters] measures and which by that study's own design involves no sensitive attributes; and (b) demographic-conditioned tool routing, for which the only direct evidence is the clinical decomposition of [xu2026ducx], in a medical context. The GENERATE-operator finding from [blankenstein2025biasbusters] therefore establishes only that selection skew is measurable at all, not demographic-conditional skew, and the finding from [xu2026ducx] attributes a disparity share to C1 but without the counterfactual isolation that P1 (Locality) requires for strict attribution. No direct demographic-swap measurement of tool selection yet exists. Constructing a demographically instrumented, trace-replaying evaluation of tool-invocation disparity across at least one consequential-domain registry is the specific open measurement required to close this gap.</w:t>
       </w:r>
     </w:p>
     <w:p>
@@ -6441,7 +6780,7 @@
         <w:t>Evidence: what is known.</w:t>
       </w:r>
       <w:r>
-        <w:t xml:space="preserve"> The amplification result at this locus is the best-replicated finding in the corpus concerning agentic-scale bias. Stereotypical bias emerges, propagates, and intensifies across a multi-agent system such that the collective is more biased than its members [nguyen2025social], and group-level fairness is formally non-inheritable from components [madigan2025emergent]. These two results are independent derivations of the same structural claim: composition under AMPLIFY violates the naive additivity of P1. A third line of evidence confirms that the mechanism scales: persona-induced bias grows from single agents to interacting societies [li2025from], and implicit bias surfaces specifically </w:t>
+        <w:t xml:space="preserve"> The amplification result at this locus is the best-replicated finding in the corpus concerning agentic-scale bias. Stereotypical bias emerges, propagates, and intensifies across a multi-agent system such that the collective is more biased than its members [nguyen2025social], and large-scale simulations show group-level fairness is not reliably inheritable from component audits [madigan2025emergent]. These two results are independent demonstrations of the same structural claim: composition under AMPLIFY violates the naive additivity of P1. A third line of evidence confirms that the mechanism scales: persona-induced bias grows from single agents to interacting societies [li2025from], and implicit bias surfaces specifically </w:t>
       </w:r>
       <w:r>
         <w:rPr>
@@ -6490,7 +6829,7 @@
         <w:t>Evidence: what transfers only by analogy.</w:t>
       </w:r>
       <w:r>
-        <w:t xml:space="preserve"> Two of the most cited results at this locus are single-turn or chatbot-derived and have not been measured on instrumented agentic pipelines. Assigning a persona induces implicit reasoning biases that degrade performance on tasks unrelated to the persona, making role assignment active bias injection rather than neutral scaffolding [gupta2023bias][†]. Persona assignment also multiplies toxic degeneration in chat settings [deshpande2023toxicity][†]. Both mechanisms are plausible at the agentic delegation edge and are consistent with [cao2026from]'s finding that biased chatbots conduct their bias into assigned agent roles (itself the primary bridge result at this locus, showing φ ≈ 1 across the role hand-off), but the counterfactual assignment-matrix measurement in a multi-agent trajectory has not been performed for either finding. The [†] markers here are therefore not ornamental: they identify the precise experiments still needed to convert mechanism evidence into locus-specific disparity estimates.</w:t>
+        <w:t xml:space="preserve"> Two of the most cited results at this locus are single-turn or chatbot-derived and have not been measured on instrumented agentic pipelines. Assigning a persona induces implicit reasoning biases that degrade performance on tasks unrelated to the persona, making role assignment active bias injection rather than neutral scaffolding [gupta2023bias][†]. Persona assignment also multiplies toxic degeneration in chat settings [deshpande2023toxicity][†]. Both mechanisms are plausible at the agentic delegation edge and are consistent with [cao2026from]'s finding that persona assignment introduces new behavioral distortion in the assigned agent (degradation of up to 26.2%), a GENERATE signature at the role hand-off rather than mere conduction of pre-existing bias (the canonical PRESERVE bridge in the D3 table is instead reward models inheriting dialect penalties [mire2025rejected]), but the counterfactual assignment-matrix measurement in a multi-agent trajectory has not been performed for either finding. The [†] markers here are therefore not ornamental: they identify the precise experiments still needed to convert mechanism evidence into locus-specific disparity estimates.</w:t>
       </w:r>
     </w:p>
     <w:p>
@@ -6633,7 +6972,7 @@
         <w:t>What is known.</w:t>
       </w:r>
       <w:r>
-        <w:t xml:space="preserve"> The established, replicated mechanism is that deliberate reasoning is a GENERATE locus, not a sanitizing filter. The weight of evidence supports two related claims. First, explicit chain-of-thought reasoning changes social-bias outcomes relative to direct answering, and the change is adverse: [wu2025reasoning] demonstrates this in controlled comparisons where the reasoning-free baseline is less biased, not more, directly falsifying the intuition that "thinking step by step" provides a fairness dividend. Second, allocation-stage disparity is demonstrable at the plan object level rather than only at the final-output level: LLM-driven software-team composition produces demographically skewed role and task assignments, a planning-stage disparity with direct hiring adjacency [parziale2026once]. Together these establish that the GENERATE operator at C4 is not a boundary case but the dominant mode. Unlike C3 (where interaction then amplifies what role-assignment generates), C4 disparity appears to resolve principally at the GENERATE edge itself, without requiring a subsequent amplification step, which makes it structurally more like C1 (early-entry, conducted forward) than like C3 (entry plus amplification). The lever exists: reasoning-guided fine-tuning reduces bias at this locus [kabra2025reasoning], and fairness reward models can steer decision-making over the reasoning trace [hall2025guiding], both interventions consistent with P4 because they act precisely at the generating edge rather than downstream of it.</w:t>
+        <w:t xml:space="preserve"> The established, replicated mechanism is that deliberate reasoning is a GENERATE locus, not a sanitizing filter. The weight of evidence supports two related claims. First, explicit chain-of-thought reasoning changes social-bias outcomes relative to direct answering, and the change can be adverse: [wu2025reasoning] demonstrates in controlled comparisons that chain-of-thought reasoning fails to deliver a fairness dividend and can worsen stereotype expression in ambiguous contexts, while reasoning-free models show more stable bias levels. Second, allocation-stage disparity is demonstrable at the plan object level rather than only at the final-output level: LLM-driven software-team composition produces demographically skewed role and task assignments, a planning-stage disparity with direct hiring adjacency [parziale2026once]. Together these establish that the operator at C4 is GENERATE-consistent, pending the revealer-vs-generator adjudication §3.4 itself describes. Unlike C3 (where interaction then amplifies what role-assignment generates), C4 disparity appears to resolve principally at the GENERATE edge itself, without requiring a subsequent amplification step, which makes it structurally more like C1 (early-entry, conducted forward) than like C3 (entry plus amplification). The lever exists: reasoning-guided fine-tuning reduces bias at this locus [kabra2025reasoning], an intervention consistent with P4 because it acts precisely at the generating edge; complementarily, a Fairness Reward Model can score complete reasoning chains against equalized opportunity and equalized odds criteria and reweight them during post-generation aggregation, leaving the internal reasoning untouched [hall2025guiding].</w:t>
       </w:r>
     </w:p>
     <w:p>
@@ -6758,7 +7097,7 @@
         <w:t>Dominant outbound operator:</w:t>
       </w:r>
       <w:r>
-        <w:t xml:space="preserve"> GENERATE, with strong P2 masking on the trace. </w:t>
+        <w:t xml:space="preserve"> PRESERVE/AMPLIFY within chain-of-thought (the GENERATE reading remains pending the revealer-vs-generator adjudication above), with strong P2 masking on the trace. </w:t>
       </w:r>
       <w:r>
         <w:rPr>
@@ -7148,13 +7487,13 @@
     </w:p>
     <w:p>
       <w:r>
-        <w:t xml:space="preserve">The six entries are not additive, and Proposition P3 says exactly when they are not: </w:t>
+        <w:t xml:space="preserve">The six entries are not additive, and Proposition P3 says when they can fail to be: </w:t>
       </w:r>
       <w:r>
         <w:rPr>
           <w:b/>
         </w:rPr>
-        <w:t>trajectory disparity is super-additive (Δ_τ &gt; Σ_c Δ_c) if and only if an AMPLIFY or GENERATE edge lies on a conduction path.</w:t>
+        <w:t>Δ_τ can exceed the naive sum Σ_c |Δ_c| when at least one AMPLIFY or GENERATE edge lies on a conduction path.</w:t>
       </w:r>
       <w:r>
         <w:t xml:space="preserve"> This is the formal content of what we call the </w:t>
@@ -7166,7 +7505,7 @@
         <w:t>agentic multiplier</w:t>
       </w:r>
       <w:r>
-        <w:t xml:space="preserve">, and it converts a rhetorical worry ("agents make bias worse") into a checkable property of a logged trace: estimate the φ_e's; super-additivity is present precisely where some φ_e &gt; 1 or a fresh entry appears mid-path. Conversely (and this direction is just as consequential for auditors), if every edge in a pipeline is PRESERVE or ATTENUATE, component-level audits compose into a </w:t>
+        <w:t xml:space="preserve">, and it converts a rhetorical worry ("agents make bias worse") into a checkable property of a logged trace: estimate the φ_e's; under the linearized magnitude model, some φ_e &gt; 1 or a fresh entry mid-path is necessary for super-additivity (not sufficient, since it can be offset downstream). Conversely (and this direction is just as consequential for auditors), if every edge in a pipeline is PRESERVE or ATTENUATE and no interaction term is present, component-level audits compose into a </w:t>
       </w:r>
       <w:r>
         <w:rPr>
@@ -7213,7 +7552,7 @@
         <w:t>amplified</w:t>
       </w:r>
       <w:r>
-        <w:t xml:space="preserve"> by their interaction, yielding a collective strictly more biased than its members [nguyen2025social]; fairness in multi-agent decision systems is formally </w:t>
+        <w:t xml:space="preserve"> by their interaction, yielding a collective strictly more biased than its members [nguyen2025social]; large-scale simulations show that fairness in multi-agent decision systems is </w:t>
       </w:r>
       <w:r>
         <w:rPr>
@@ -7222,7 +7561,7 @@
         <w:t>emergent</w:t>
       </w:r>
       <w:r>
-        <w:t>, not inherited, so component audits provably cannot be composed into a group-level guarantee in that setting [madigan2025emergent]. Persona-induced bias scaling from single agents to societies [li2025from] and interaction-borne implicit bias [borah2024implicit] corroborate the same operator at the same locus. The temporal axis supplies a second evidenced amplifier, on the feedback edge rather than between components: self-consuming training loops with φ_fb &gt; 1 [wyllie2024fairness, wang2026observations, mansoury2020feedback].</w:t>
+        <w:t>, not reliably inherited, so component audits cannot be assumed to compose into a group-level guarantee in that setting [madigan2025emergent]. Persona-induced bias scaling from single agents to societies [li2025from] and interaction-borne implicit bias [borah2024implicit] corroborate the same operator at the same locus. The temporal axis supplies a second evidenced amplifier, on the feedback edge rather than between components: self-consuming training loops with φ_fb &gt; 1 [wyllie2024fairness, wang2026observations, mansoury2020feedback].</w:t>
       </w:r>
     </w:p>
     <w:p>
@@ -7324,7 +7663,7 @@
     </w:p>
     <w:p>
       <w:r>
-        <w:t>The conjecture is falsifiable with existing instruments: D2's trace-replay applied at two consecutive interfaces of the same logged trajectory estimates the cross-boundary φ directly, and the audit protocol of §6 is designed to produce exactly such paired estimates (results pending). Until such measurements exist, claims that "agentic bias compounds across the pipeline" (including informal versions in prior drafts of this survey) should be read as hypotheses licensed by P3's mechanism, not as established findings.</w:t>
+        <w:t>The conjecture is falsifiable with existing instruments: D2's trace-replay applied at two consecutive interfaces of the same logged trajectory estimates the cross-boundary φ directly, and the audit protocol of §6 is designed to produce exactly such paired estimates (the §6.5 pilot reports endpoint metrics only; these paired/interior estimates await the full study). Until such measurements exist, claims that "agentic bias compounds across the pipeline" (including informal versions in prior drafts of this survey) should be read as hypotheses licensed by P3's mechanism, not as established findings.</w:t>
       </w:r>
     </w:p>
     <w:p>
@@ -7393,7 +7732,7 @@
         <w:t>C2 rung, add tools and persistent memory.</w:t>
       </w:r>
       <w:r>
-        <w:t xml:space="preserve"> The screener now chooses among background-check and skills-assessment APIs (C1 locus) and persists per-applicant notes across screening rounds (C2 × t). New terms: Δ_tool (does the demographic framing of a profile change </w:t>
+        <w:t xml:space="preserve"> The screener now chooses among background-check and skills-assessment APIs (C1 locus) and persists per-applicant notes across screening rounds (C2 × t). New terms: Δ_tool (selection skew independent of task fitness is already documented [blankenstein2025biasbusters], and vendor-controlled descriptions are adversarially steerable [sneh2025tooltweak]; whether the demographic framing of a profile changes </w:t>
       </w:r>
       <w:r>
         <w:rPr>
@@ -7402,7 +7741,7 @@
         <w:t>which</w:t>
       </w:r>
       <w:r>
-        <w:t xml:space="preserve"> verification API is invoked [blankenstein2025biasbusters], with vendor-controlled descriptions steerable adversarially [sneh2025tooltweak]?) and a memory term that the recurrence now time-indexes. Early inferred attributes (possibly never stated, by [staab2023memorization]) persist and accumulate [ma2026implicit], so an applicant re-screened in round two inherits round one's framing [simhi2026old].</w:t>
+        <w:t xml:space="preserve"> verification API is invoked is precisely the unmeasured demographic-swap question of §3.1) and a memory term that the recurrence now time-indexes. Early inferred attributes (possibly never stated, by [staab2023memorization]) persist and accumulate [ma2026implicit], so an applicant re-screened in round two inherits round one's framing [simhi2026old].</w:t>
       </w:r>
     </w:p>
     <w:p>
@@ -7433,7 +7772,7 @@
         <w:t>A four-step auditor recipe.</w:t>
       </w:r>
       <w:r>
-        <w:t xml:space="preserve"> The BCF reading of the ladder compresses into a procedure any team deploying an agent can execute, and which the §6 protocol instantiates on a hiring-style task (results pending):</w:t>
+        <w:t xml:space="preserve"> The BCF reading of the ladder compresses into a procedure any team deploying an agent can execute, and which the §6 protocol instantiates on a hiring-style task (the §6.5 pilot reports endpoint metrics only; these paired/interior estimates await the full study):</w:t>
       </w:r>
     </w:p>
     <w:p>
@@ -7498,7 +7837,7 @@
         <w:t>Match mitigation to the (locus, operator) cell and re-audit (P4).</w:t>
       </w:r>
       <w:r>
-        <w:t xml:space="preserve"> Intervene at the entry locus or on the amplifying edge (embedder or ranking control for C2 [kim2025mitigating, kim2024fair], identity anonymization for C3 [choi2025identity], reasoning-stage steering for C4 [kabra2025reasoning, hall2025guiding], source-selection rebalancing for C1 [singh2025biasb]), then repeat steps 2 to 3 to verify that the targeted Δ_c or φ_e actually fell, and re-run over the horizon to confirm φ_fb &lt; 1.</w:t>
+        <w:t xml:space="preserve"> Intervene at the entry locus or on the amplifying edge (embedder or ranking control for C2 [kim2025mitigating, kim2024fair], identity anonymization for C3 [choi2025identity], reasoning-stage fine-tuning or aggregation-stage chain reweighting for C4 [kabra2025reasoning, hall2025guiding], source-selection rebalancing for C1 [singh2025biasb]), then repeat steps 2 to 3 to verify that the targeted Δ_c or φ_e actually fell, and re-run over the horizon to confirm φ_fb &lt; 1.</w:t>
       </w:r>
     </w:p>
     <w:p>
@@ -7583,7 +7922,7 @@
         <w:t>what the outcome variable is</w:t>
       </w:r>
       <w:r>
-        <w:t xml:space="preserve">, not the comparison itself. In D1 terms, any measurable emission of the loop can serve as the outcome: the terminal decision $y$ (loan approval rates across applicant groups [azime2025accept], verdict severity across defendant groups [hu2025llms]), but equally the intermediate emissions such as which tools in $T$ are invoked, what $M$ retrieves, which roles $R$ assigns, and whether the trajectory escalates to a human. Clinical audits already exploit this implicitly: [omar2025sociodemographic] compares </w:t>
+        <w:t xml:space="preserve">, not the comparison itself. In D1 terms, any measurable emission of the loop can serve as the outcome: the terminal decision $y$ (loan approval rates across applicant groups [azime2025accept], verdict severity across defendant groups [hu2025llms]), but equally the intermediate emissions such as which tools in $T$ are invoked, what $M$ retrieves, which roles $\pi_{\mathrm{ctrl}}$ assigns, and whether the trajectory escalates to a human. Clinical audits already exploit this implicitly: [omar2025sociodemographic] compares </w:t>
       </w:r>
       <w:r>
         <w:rPr>
@@ -7790,7 +8129,7 @@
     </w:p>
     <w:p>
       <w:r>
-        <w:t>We now make D2 operational. Fix an agent $\mathcal{A} = \langle \pi, T, M, R \rangle$, an input population $\mathcal{X} = \{x_1, \dots, x_N\}$ of task instances, and a demographic swap operator $\sigma$ that rewrites the protected-attribute encoding of an input while holding task-relevant content fixed (§4.1.3's proxy-intervention caveats apply, and $\sigma$ should range over multiple cue channels [tonneau2026different]). Executing $\mathcal{A}$ on $x$ under the trace-replay protocol (pinned model versions, fixed decoding parameters, intercepted and demographically consistent tool/environment responses) yields a trajectory $\tau_{\mathcal{A}}(x) = (s_0, a_1, o_1, \dots, a_K, y)$ of actions $a_k$, observations $o_k$, and terminal decision $y$. For each component $c$ of the taxonomy, an extraction map $z_c(\cdot)$ reads off that component's emissions from the trace (the tool-invocation record for $T$, the retrieval set for $M$, the role assignments for $R$, the plan structure for $\pi$'s decomposition, the terminal decision for the loop as a whole). Definition D2's component counterfactual disparity is then</w:t>
+        <w:t>We now make D2 operational. Fix an agent $\mathcal{A} = \langle \pi, T, M, R \rangle$, an input population $\mathcal{X} = \{x_1, \dots, x_N\}$ of task instances, and a demographic swap operator $\sigma$ that rewrites the protected-attribute encoding of an input while holding task-relevant content fixed (§4.1.3's proxy-intervention caveats apply, and $\sigma$ should range over multiple cue channels [tonneau2026different]). Executing $\mathcal{A}$ on $x$ under the trace-replay protocol (pinned model versions, fixed decoding parameters, intercepted and demographically consistent tool/environment responses) yields a trajectory $\tau_{\mathcal{A}}(x) = (s_0, a_1, o_1, \dots, a_K, y)$ of actions $a_k$, observations $o_k$, and terminal decision $y$. For each component $c$ of the taxonomy, an extraction map $z_c(\cdot)$ reads off that component's emissions from the trace (the tool-invocation record for $T$, the retrieval set for $M$, the role assignments for $\pi_{\mathrm{ctrl}}$, the plan structure for $\pi$'s decomposition, the terminal decision for the loop as a whole). Definition D2's component counterfactual disparity is then</w:t>
       </w:r>
     </w:p>
     <w:p>
@@ -7898,6 +8237,26 @@
         <w:rPr>
           <w:b/>
         </w:rPr>
+        <w:t>Definition 4.2b (Signed component disparity, MSD).</w:t>
+      </w:r>
+      <w:r>
+        <w:t xml:space="preserve"> For an </w:t>
+      </w:r>
+      <w:r>
+        <w:rPr>
+          <w:i/>
+        </w:rPr>
+        <w:t>ordered</w:t>
+      </w:r>
+      <w:r>
+        <w:t xml:space="preserve"> emission space with a stated favorable-direction convention (e.g., a higher score, rank, or confidence is favorable to the subject), the signed component disparity is $\mathrm{MSD}_c(\mathcal{A}) = \mathbb{E}_{x \sim \mathcal{X}} \big[\, s_c(\tau_{\mathcal{A}}(\sigma(x))) - s_c(\tau_{\mathcal{A}}(x)) \,\big]$, the mean directional shift induced by the swap. Flip-type discrete emissions carry no sign without an orientation convention and so admit no MSD. The relation to the magnitude metrics is deliberate: the §4.2-4.3 metrics (CFR, MASD, and the TID/ESD/PAD of §4.3) estimate magnitudes $|\Delta_c|$, which is what an isolated-locus disparity audit needs; cancellation diagnosis under P2, where oppositely signed component contributions sum toward an endpoint near parity, requires the signed variant, because two large $|\Delta_c|$ that cancel are visible only once their signs are recovered.</w:t>
+      </w:r>
+    </w:p>
+    <w:p>
+      <w:r>
+        <w:rPr>
+          <w:b/>
+        </w:rPr>
         <w:t>Estimating the conduction operators.</w:t>
       </w:r>
       <w:r>
@@ -7921,7 +8280,7 @@
     </w:p>
     <w:p>
       <w:r>
-        <w:t>classifying the edge as attenuating ($\hat{\varphi}_e &lt; 1$), preserving ($\hat{\varphi}_e \approx 1$), or amplifying ($\hat{\varphi}_e &gt; 1$); the GENERATE case is diagnosed when $\Delta_c \approx 0$ at every upstream locus yet $\Delta_{c'} &gt; 0$. This turns the BCF's operator taxonomy from a descriptive vocabulary into a measurable quantity, and it is the estimator the audit protocol of §6 is designed to compute (results pending).</w:t>
+        <w:t>classifying the edge as attenuating ($\hat{\varphi}_e &lt; 1$), preserving ($\hat{\varphi}_e \approx 1$), or amplifying ($\hat{\varphi}_e &gt; 1$); the GENERATE case is diagnosed when $\Delta_c \approx 0$ at every upstream locus yet $\Delta_{c'} &gt; 0$. This turns the BCF's operator taxonomy from a descriptive vocabulary into a measurable quantity, and it is the estimator the audit protocol of §6 is designed to compute (the §6.5 pilot reports endpoint metrics only; these paired/interior estimates await the full study).</w:t>
       </w:r>
     </w:p>
     <w:p>
@@ -8003,7 +8362,7 @@
         <w:t>which</w:t>
       </w:r>
       <w:r>
-        <w:t xml:space="preserve"> API the agent calls, holding the query fixed? The existence evidence is already in place: tool-selection skew is measurable and manipulable [blankenstein2025biasbusters, sneh2025tooltweak], rides on the same surface-form sensitivities as option-order bias [pezeshkpour2023large], and accounts for an attributable share of total disparity in the one clinical agent where the decomposition has been run [xu2026ducx]. No benchmark computes TID under demographic counterfactuals.</w:t>
+        <w:t xml:space="preserve"> API the agent calls, holding the query fixed? The existence evidence is layered: that selection skew is measurable and manipulable at all is established by the provider- and ordering-preference results of [blankenstein2025biasbusters, sneh2025tooltweak], which ride on the same surface-form sensitivities as option-order bias [pezeshkpour2023large] but involve no sensitive attributes; the existence evidence for the demographic question itself rests on [xu2026ducx], where the tool stages account for an attributable share of total disparity in the one clinical agent where the decomposition has been run. No benchmark computes TID under demographic counterfactuals.</w:t>
       </w:r>
     </w:p>
     <w:p>
@@ -8103,7 +8462,7 @@
         <w:t>Estimation.</w:t>
       </w:r>
       <w:r>
-        <w:t xml:space="preserve"> All three metrics are paired statistics under trace-replay: variance is computed over counterfactual pairs, confidence intervals attach to each $\Delta_c$, and the configuration-by-cue-channel grid requires multiple-comparison correction. The audit protocol of §6 instantiates exactly these estimators for a hiring task across agent configurations C0 to C3 (results pending). Determinism matters: without pinned versions, fixed decoding, and intercepted environment responses, flip rates confound demographic sensitivity with sampling noise. </w:t>
+        <w:t xml:space="preserve"> All three metrics are paired statistics under trace-replay: variance is computed over counterfactual pairs, confidence intervals attach to each $\Delta_c$, and the configuration-by-cue-channel grid requires multiple-comparison correction. The audit protocol of §6 instantiates exactly these estimators for a hiring task across agent configurations C0 to C3 (the §6.5 pilot reports endpoint metrics only; these paired/interior estimates await the full study). Determinism matters: without pinned versions, fixed decoding, and intercepted environment responses, flip rates confound demographic sensitivity with sampling noise. </w:t>
       </w:r>
       <w:r>
         <w:rPr>
@@ -8121,7 +8480,7 @@
         <w:t>Adequacy.</w:t>
       </w:r>
       <w:r>
-        <w:t xml:space="preserve"> Proposition P5 states that an evaluation suite is adequate for an agent only if it bounds $\Delta_c$ for every component with nonzero conduction weight in $\Delta_\tau \approx \sum_c \Delta_c \prod_e \varphi_e$. Definitions 4.3 to 4.5, together with the component CFR/MASD of §4.2, constitute a minimal instrument set meeting P5 for the $T$, $R$, and planning surfaces of D1. By Proposition P4 (mitigation-matching), they are also the precondition for crediting any mitigation with changing what an agent </w:t>
+        <w:t xml:space="preserve"> Proposition P5 states that an evaluation suite is adequate for an agent only if it bounds $\Delta_c$ for every component with nonzero conduction weight in $\Delta_\tau \approx \sum_c \Delta_c \prod_e \varphi_e$. Definitions 4.3 to 4.5, together with the component CFR/MASD of §4.2, constitute a minimal instrument set meeting P5 for the $T$, routing, and planning surfaces of D1. By Proposition P4 (mitigation-matching), they are also the precondition for crediting any mitigation with changing what an agent </w:t>
       </w:r>
       <w:r>
         <w:rPr>
@@ -10378,10 +10737,10 @@
         <w:rPr>
           <w:i/>
         </w:rPr>
-        <w:t>at or upstream of</w:t>
-      </w:r>
-      <w:r>
-        <w:t xml:space="preserve"> the entry locus producing Δ\_c </w:t>
+        <w:t>at the entry locus or downstream on its conduction path</w:t>
+      </w:r>
+      <w:r>
+        <w:t xml:space="preserve"> </w:t>
       </w:r>
       <w:r>
         <w:rPr>
@@ -10390,7 +10749,7 @@
         <w:t>and</w:t>
       </w:r>
       <w:r>
-        <w:t xml:space="preserve"> on the active conduction operator φ at that locus. When an intervention operates downstream of the entry locus, it may suppress the observable symptom (the final text token) while the operator continues to conduct disparity forward into subsequent pipeline stages. When it acts at the wrong operator type (e.g., targeting ATTENUATE dynamics with an intervention calibrated for AMPLIFY), it may be ineffective or, in the case of feedback-recurrence paths, counter-productive. This section surveys the mitigation literature through the P4 lens, asks at which component and operator type each intervention acts, and identifies the gaps that remain. Table 3 formalizes the mapping. Table 4 closes the §3→§5→§8 loop by specifying, for each component, the coverage of existing mitigation evidence and the critical open gap.</w:t>
+        <w:t xml:space="preserve"> on the active conduction operator φ at that locus. When an intervention operates upstream of the entry locus, the disparity it targets has not yet entered the pipeline, so there is nothing for it to attenuate (the prompting ceiling of §5.1); an intervention placed off the conduction path likewise leaves the operator free to conduct disparity forward into subsequent pipeline stages. When it acts at the wrong operator type (e.g., targeting ATTENUATE dynamics with an intervention calibrated for AMPLIFY), it may be ineffective or, in the case of feedback-recurrence paths, counter-productive. This section surveys the mitigation literature through the P4 lens, asks at which component and operator type each intervention acts, and identifies the gaps that remain. Table 3 formalizes the mapping. Table 4 closes the §3→§5→§8 loop by specifying, for each component, the coverage of existing mitigation evidence and the critical open gap.</w:t>
       </w:r>
     </w:p>
     <w:p>
@@ -10703,16 +11062,16 @@
         <w:t>Planning and decision-level fairness rewards</w:t>
       </w:r>
       <w:r>
-        <w:t xml:space="preserve"> address §3.4 directly. [hall2025guiding] inserts fairness reward models into the planning trace, scoring intermediate reasoning steps against demographic parity criteria, which functions as a component-level guardrail on the planning stage's PRESERVE operator, converting it toward ATTENUATE. This approach is particularly significant because it is the only corpus paper that </w:t>
+        <w:t xml:space="preserve"> address §3.4 directly. [hall2025guiding] trains a Fairness Reward Model that scores </w:t>
       </w:r>
       <w:r>
         <w:rPr>
           <w:i/>
         </w:rPr>
-        <w:t>scores the plan itself</w:t>
-      </w:r>
-      <w:r>
-        <w:t xml:space="preserve"> for fairness rather than scoring the plan's output, which corresponds to D2's Δ\_c measurement at the planning locus rather than the trajectory endpoint.</w:t>
+        <w:t>complete</w:t>
+      </w:r>
+      <w:r>
+        <w:t xml:space="preserve"> reasoning chains against equalized opportunity and equalized odds criteria and reweights those chains during post-generation aggregation, leaving the internal reasoning untouched; this functions as an aggregation-stage ATTENUATE edge on the planning locus's output rather than an in-trace guardrail. The approach is significant because it is the only corpus paper that scores whole reasoning chains for fairness rather than only the final decision, approximating D2's Δ\_c measurement at the planning locus from outside the trace.</w:t>
       </w:r>
     </w:p>
     <w:p>
@@ -11783,7 +12142,7 @@
           </w:tcPr>
           <w:p>
             <w:r>
-              <w:t>PRESERVE → ATTENUATE (plan scoring)</w:t>
+              <w:t>PRESERVE → ATTENUATE (chain reweighting)</w:t>
             </w:r>
           </w:p>
         </w:tc>
@@ -11793,7 +12152,7 @@
           </w:tcPr>
           <w:p>
             <w:r>
-              <w:t>Planning trace</w:t>
+              <w:t>Post-generation aggregation</w:t>
             </w:r>
           </w:p>
         </w:tc>
@@ -11803,7 +12162,7 @@
           </w:tcPr>
           <w:p>
             <w:r>
-              <w:t>Fairness reward model on plan</w:t>
+              <w:t>Fairness Reward Model reweighting complete reasoning chains (equalized opportunity/odds)</w:t>
             </w:r>
           </w:p>
         </w:tc>
@@ -12351,7 +12710,7 @@
           </w:tcPr>
           <w:p>
             <w:r>
-              <w:t>Discriminatory routing via option-order sensitivity, metadata-driven selection skew; PRESERVE or AMPLIFY on zero user-level input [blankenstein2025biasbusters, sneh2025tooltweak]</w:t>
+              <w:t>Discriminatory routing via option-order sensitivity, metadata-driven selection skew; GENERATE on zero user-level input (disparity on zero input is GENERATE by D3) [blankenstein2025biasbusters, sneh2025tooltweak]</w:t>
             </w:r>
           </w:p>
         </w:tc>
@@ -12553,7 +12912,7 @@
           </w:tcPr>
           <w:p>
             <w:r>
-              <w:t>Fairness reward on planning trace [hall2025guiding]; reasoning-guided SFT [kabra2025reasoning]</w:t>
+              <w:t>Fairness-Reward-Model reweighting of complete reasoning chains at post-generation aggregation [hall2025guiding]; reasoning-guided SFT [kabra2025reasoning]</w:t>
             </w:r>
           </w:p>
         </w:tc>
@@ -12569,7 +12928,7 @@
               <w:t>Partial</w:t>
             </w:r>
             <w:r>
-              <w:t xml:space="preserve"> (planning-trace scoring and reasoning-supervised training demonstrated; neither tested in tool-using agentic loop)</w:t>
+              <w:t xml:space="preserve"> (aggregation-stage chain reweighting and reasoning-supervised training demonstrated; neither tested in tool-using agentic loop)</w:t>
             </w:r>
           </w:p>
         </w:tc>
@@ -12780,7 +13139,7 @@
         <w:t>Profiles and perturbation.</w:t>
       </w:r>
       <w:r>
-        <w:t xml:space="preserve"> All profiles are fully synthetic (no IRB required). Base profiles hold qualifications fixed; counterfactual variants substitute only the demographic signal, primarily via candidate names following [nghiem2024you] and [pawar2025presumed], and secondarily via explicit demographic cue labels. Because cue format is a measurement confound [tonneau2026different], the cue channel is varied as a controlled factor.</w:t>
+        <w:t xml:space="preserve"> All profiles are fully synthetic (N = 10 profiles; no IRB required). Base profiles hold qualifications fixed; counterfactual variants substitute only the demographic signal, primarily via candidate names following [nghiem2024you] and [pawar2025presumed], and secondarily via explicit demographic cue labels. Because cue format is a measurement confound [tonneau2026different], the cue channel is varied as a controlled factor.</w:t>
       </w:r>
     </w:p>
     <w:p>
@@ -13097,7 +13456,7 @@
         <w:t>Tool-invocation disparity</w:t>
       </w:r>
       <w:r>
-        <w:t xml:space="preserve"> (Δ_c at tool-selection): differential distribution over invoked tools across counterfactual conditions, operationalizing [blankenstein2025biasbusters] and [xu2026ducx].</w:t>
+        <w:t xml:space="preserve"> (Δ_c at tool-selection): differential distribution over invoked tools across counterfactual conditions, extending the selection-skew measurement of [blankenstein2025biasbusters] to the demographic-conditioned setting studied by [xu2026ducx].</w:t>
       </w:r>
     </w:p>
     <w:p>
@@ -13157,7 +13516,7 @@
         <w:rPr>
           <w:b/>
         </w:rPr>
-        <w:t>H2: P3 Super-additivity is observable.</w:t>
+        <w:t>H2: Amplification ordering (a proxy for P3, since the pilot does not estimate the component sum).</w:t>
       </w:r>
       <w:r>
         <w:t xml:space="preserve"> Total trajectory disparity is non-decreasing along C0 ⪯ C1 ⪯ C2 ⪯ C3, with C3 exhibiting the largest magnitude, consistent with multi-agent amplification [madigan2025emergent, nguyen2025social, cao2026from]. A registered counter-hypothesis: C3 debate can reduce disparity via anonymization [choi2025identity] or ensemble debiasing [owens2024multi]; the sign of the C3 effect is an open empirical question.</w:t>
@@ -13478,7 +13837,7 @@
     </w:p>
     <w:p>
       <w:r>
-        <w:t>Two patterns appear, both consistent with the framework and both heavily qualified below. First, decision-level parity masks score-level disparity: no candidate's advance-or-reject decision flips under the demographic swap (CFR = 0 in every configuration) and the advance-rate disparity is zero, yet the mean absolute score difference is nonzero throughout. This is the configuration P2 (Masking) describes, an endpoint near parity over a disparity that survives in the interior. Second, the score-level disparity rises with agentic scaffolding, from 1.2 (C0) to 3.4 (C2) to 6.4 (C3), the direction predicted by P3 (Super-additivity) and pre-registered as H2, with the two-agent deliberation showing the largest disparity.</w:t>
+        <w:t>Two patterns appear, both consistent with the framework and both heavily qualified below. First, decision-level parity masks score-level disparity: no candidate's advance-or-reject decision flips under the demographic swap (CFR = 0 in every configuration) and the advance-rate disparity is zero, yet the mean absolute score difference is nonzero throughout. This is the configuration P2 (Masking) describes, an endpoint-level analogue of P2: a coarse decision statistic masks a finer score-level disparity at the same output node; demonstrating the interior Δ_c awaits the full study. Second, the score-level disparity rises with agentic scaffolding, from 1.2 (C0) to 3.4 (C2) to 6.4 (C3), the direction predicted by P3 (Super-additivity) and stated in advance in §6.3, with the two-agent deliberation showing the largest disparity.</w:t>
       </w:r>
     </w:p>
     <w:p>
@@ -13489,7 +13848,7 @@
         <w:t>Caveats: this is a directional pilot, not a confirmatory study.</w:t>
       </w:r>
       <w:r>
-        <w:t xml:space="preserve"> It uses N = 10 profiles with a single counterfactual name pair that conflates race and gender; one model at one temperature; and uniformly strong resumes, which produce a ceiling effect on the binary decision (every candidate advances), so CFR cannot register and the whole signal lives in the score. The MASD magnitudes are small in absolute terms (1 to 6 points on a 0-100 scale) and carry no confidence intervals or significance tests. The monotone MASD trend across C0, C2, and C3 is suggestive of the masking-and-amplification mechanism the BCF predicts, but it rests on one small sample and could reflect score-scale noise rather than a stable effect. A confirmatory study is required before H1 or H2 can be claimed as established: larger N; multiple name pairs that decouple race, gender, and other attributes; borderline as well as strong profiles to break the decision-level ceiling; tool-using configurations that expose tool-invocation and escalation disparity; and paired statistical tests with corrected confidence intervals. The harness, synthetic profiles, and raw decisions are released for exact reproduction.</w:t>
+        <w:t xml:space="preserve"> It uses N = 10 profiles with a single counterfactual name pair that conflates race and gender; one model at one temperature; and uniformly strong resumes, which produce a ceiling effect on the binary decision (every candidate advances), so CFR cannot register and the whole signal lives in the score. The MASD magnitudes are small in absolute terms (1 to 6 points on a 0-100 scale) and carry no confidence intervals or significance tests. The monotone MASD trend across C0, C2, and C3 is suggestive of the masking-and-amplification mechanism the BCF predicts, but it rests on one small sample and could reflect score-scale noise rather than a stable effect. A confirmatory study is required before H1 or H2 can be claimed as established: larger N; multiple name pairs that decouple race, gender, and other attributes; borderline as well as strong profiles to break the decision-level ceiling; tool-using configurations that expose tool-invocation and escalation disparity; and paired statistical tests with corrected confidence intervals. The pilot also instantiates only a restricted slice of the protocol's configurations: its C2 covers only the reasoning edge (reason-then-decide with no retrieval or tools), and its C3 is a single-context recruiter-reviewer proxy for delegation rather than a true two-agent edge with a π_ctrl controller; a full two-agent configuration is future work. The harness, synthetic profiles, and raw decisions will be released with the camera-ready.</w:t>
       </w:r>
     </w:p>
     <w:p>
@@ -14234,7 +14593,7 @@
         <w:t>GENERATE</w:t>
       </w:r>
       <w:r>
-        <w:t xml:space="preserve"> operator (disparity arising at a pipeline edge from nominally unbiased inputs, the formal signature of the agentic multiplier in P3) has been documented in only a handful of papers. For multi-agent delegation, [nguyen2025social] and [madigan2025emergent] provide the clearest evidence of generation (bias emerging in interaction among individually measured-to-be-unbiased agents); for memory, [ma2026implicit] documents generation in the accumulation process; for tool selection, [blankenstein2025biasbusters] documents generation from tool-description surface features alone. Outside these, the GENERATE column is largely empty. This is the empirical frontier the audit of §6 is designed to probe.</w:t>
+        <w:t xml:space="preserve"> operator (disparity arising at a pipeline edge from nominally unbiased inputs, the formal signature of the agentic multiplier in P3) has been documented in only a handful of papers. For multi-agent delegation, [nguyen2025social] and [madigan2025emergent] provide the clearest evidence of generation (bias emerging in interaction among individually measured-to-be-unbiased agents); for tool selection, [blankenstein2025biasbusters] documents the selection-skew signature from tool-description surface features alone (the closest single-locus instance, distinct from the amplification [ma2026implicit] documents in the memory accumulation process). Outside these, the GENERATE column is largely empty. This is the empirical frontier the audit of §6 is designed to probe.</w:t>
       </w:r>
     </w:p>
     <w:p>
@@ -14456,7 +14815,7 @@
         <w:t>BCF coordinate.</w:t>
       </w:r>
       <w:r>
-        <w:t xml:space="preserve"> The GENERATE operator (φ applied to nominally zero-Δ_c input) is the signature failure mode of multi-agent systems: disparity arises in the interaction among agents that are individually measured as unbiased. Figure 3 shows the GENERATE column is the least populated in the multi-agent delegation row, despite the strongest theoretical and empirical motivation.</w:t>
+        <w:t xml:space="preserve"> The GENERATE operator (φ applied to nominally zero-Δ_c input) is the signature failure mode of multi-agent systems: disparity arises in the interaction among agents that are individually measured as unbiased. Figure 3 shows GENERATE is thinly populated across every locus; multi-agent delegation is the only locus with more than one GENERATE entry, despite the strongest theoretical and empirical motivation.</w:t>
       </w:r>
     </w:p>
     <w:p>
@@ -15743,6 +16102,30 @@
         <w:ind w:left="360" w:hanging="360"/>
       </w:pPr>
       <w:r>
+        <w:t>Sneh et al.. (2025). ToolTweak: An Attack on Tool Selection in LLM-based Agents.. ArXiv preprint. arXiv:2510.02554</w:t>
+      </w:r>
+    </w:p>
+    <w:p>
+      <w:pPr>
+        <w:ind w:left="360" w:hanging="360"/>
+      </w:pPr>
+      <w:r>
+        <w:t>Hall et al.. (2025). Guiding LLM Decision-Making with Fairness Reward Models.. arXiv preprint. arXiv:2507.11344</w:t>
+      </w:r>
+    </w:p>
+    <w:p>
+      <w:pPr>
+        <w:ind w:left="360" w:hanging="360"/>
+      </w:pPr>
+      <w:r>
+        <w:t>Pawar et al.. (2025). Presumed Cultural Identity: How Names Shape LLM Responses.. arXiv preprint. arXiv:2502.11995</w:t>
+      </w:r>
+    </w:p>
+    <w:p>
+      <w:pPr>
+        <w:ind w:left="360" w:hanging="360"/>
+      </w:pPr>
+      <w:r>
         <w:t>Noble S. U.. (2018). Algorithms of Oppression: How Search Engines Reinforce Racism.. NYU Press. doi:10.2307/j.ctt1pwt9w5</w:t>
       </w:r>
     </w:p>
@@ -15767,7 +16150,7 @@
         <w:ind w:left="360" w:hanging="360"/>
       </w:pPr>
       <w:r>
-        <w:t>Sneh et al.. (2025). ToolTweak: An Attack on Tool Selection in LLM-based Agents.. ArXiv preprint. arXiv:2510.02554</w:t>
+        <w:t>Tang et al.. (2026). Is Your LLM-as-a-Recommender Agent Trustable? LLMs' Recommendation is Easily Hacked by Biases (Preferences).. ArXiv preprint. arXiv:2603.17417</w:t>
       </w:r>
     </w:p>
     <w:p>
@@ -15775,7 +16158,7 @@
         <w:ind w:left="360" w:hanging="360"/>
       </w:pPr>
       <w:r>
-        <w:t>Tang et al.. (2026). Is Your LLM-as-a-Recommender Agent Trustable? LLMs' Recommendation is Easily Hacked by Biases (Preferences).. ArXiv preprint. arXiv:2603.17417</w:t>
+        <w:t>Singh et al.. (2025). Bias-Aware Agent: Enhancing Fairness in AI-Driven Knowledge Retrieval.. Companion Proceedings of the ACM Web Conference 2025 (WWW '25). arXiv:2503.21237</w:t>
       </w:r>
     </w:p>
     <w:p>
@@ -15783,7 +16166,7 @@
         <w:ind w:left="360" w:hanging="360"/>
       </w:pPr>
       <w:r>
-        <w:t>Singh et al.. (2025). Bias-Aware Agent: Enhancing Fairness in AI-Driven Knowledge Retrieval.. Companion Proceedings of the ACM Web Conference 2025 (WWW '25). arXiv:2503.21237</w:t>
+        <w:t>Zhang et al.. (2025). Evaluating the Effect of Retrieval Augmentation on Social Biases.. arXiv preprint. arXiv:2502.17611</w:t>
       </w:r>
     </w:p>
     <w:p>
@@ -15791,7 +16174,7 @@
         <w:ind w:left="360" w:hanging="360"/>
       </w:pPr>
       <w:r>
-        <w:t>Zhang et al.. (2025). Evaluating the Effect of Retrieval Augmentation on Social Biases.. arXiv preprint. arXiv:2502.17611</w:t>
+        <w:t>Geng et al.. (2025). Accumulating Context Changes the Beliefs of Language Models.. arXiv preprint. arXiv:2511.01805</w:t>
       </w:r>
     </w:p>
     <w:p>
@@ -15799,7 +16182,7 @@
         <w:ind w:left="360" w:hanging="360"/>
       </w:pPr>
       <w:r>
-        <w:t>Geng et al.. (2025). Accumulating Context Changes the Beliefs of Language Models.. arXiv preprint. arXiv:2511.01805</w:t>
+        <w:t>Simhi et al.. (2026). Old Habits Die Hard: How Conversational History Geometrically Traps LLMs.. arXiv preprint. arXiv:2603.03308</w:t>
       </w:r>
     </w:p>
     <w:p>
@@ -15807,7 +16190,7 @@
         <w:ind w:left="360" w:hanging="360"/>
       </w:pPr>
       <w:r>
-        <w:t>Simhi et al.. (2026). Old Habits Die Hard: How Conversational History Geometrically Traps LLMs.. arXiv preprint. arXiv:2603.03308</w:t>
+        <w:t>Wang et al.. (2025). Bias Amplification in RAG: Poisoning Knowledge Retrieval to Steer LLMs.. ArXiv preprint. arXiv:2506.11415</w:t>
       </w:r>
     </w:p>
     <w:p>
@@ -15815,7 +16198,7 @@
         <w:ind w:left="360" w:hanging="360"/>
       </w:pPr>
       <w:r>
-        <w:t>Wang et al.. (2025). Bias Amplification in RAG: Poisoning Knowledge Retrieval to Steer LLMs.. ArXiv preprint. arXiv:2506.11415</w:t>
+        <w:t>Coppolillo et al.. (2025). Unmasking Conversational Bias in AI Multiagent Systems.. arXiv preprint. arXiv:2501.14844</w:t>
       </w:r>
     </w:p>
     <w:p>
@@ -15823,7 +16206,7 @@
         <w:ind w:left="360" w:hanging="360"/>
       </w:pPr>
       <w:r>
-        <w:t>Coppolillo et al.. (2025). Unmasking Conversational Bias in AI Multiagent Systems.. arXiv preprint. arXiv:2501.14844</w:t>
+        <w:t>Kim and Diaz. (2024). Towards Fair RAG: On the Impact of Fair Ranking in Retrieval-Augmented Generation.. arXiv preprint (ACM SIGIR ICTIR 2025). arXiv:2409.11598</w:t>
       </w:r>
     </w:p>
     <w:p>
@@ -15831,7 +16214,7 @@
         <w:ind w:left="360" w:hanging="360"/>
       </w:pPr>
       <w:r>
-        <w:t>Kim and Diaz. (2024). Towards Fair RAG: On the Impact of Fair Ranking in Retrieval-Augmented Generation.. arXiv preprint (ACM SIGIR ICTIR 2025). arXiv:2409.11598</w:t>
+        <w:t>Liu et al.. (2023). Lost in the Middle: How Language Models Use Long Contexts.. Transactions of the Association for Computational Linguistics (TACL). arXiv:2307.03172</w:t>
       </w:r>
     </w:p>
     <w:p>
@@ -15839,7 +16222,7 @@
         <w:ind w:left="360" w:hanging="360"/>
       </w:pPr>
       <w:r>
-        <w:t>Liu et al.. (2023). Lost in the Middle: How Language Models Use Long Contexts.. Transactions of the Association for Computational Linguistics (TACL). arXiv:2307.03172</w:t>
+        <w:t>Qian et al.. (2024). ChatDev: Communicative Agents for Software Development.. ACL. arXiv:2307.07924</w:t>
       </w:r>
     </w:p>
     <w:p>
@@ -15847,7 +16230,7 @@
         <w:ind w:left="360" w:hanging="360"/>
       </w:pPr>
       <w:r>
-        <w:t>Qian et al.. (2024). ChatDev: Communicative Agents for Software Development.. ACL. arXiv:2307.07924</w:t>
+        <w:t>Li et al.. (2025). From Single to Societal: Analyzing Persona-Induced Bias in Multi-Agent Interactions.. arXiv preprint. arXiv:2511.11789</w:t>
       </w:r>
     </w:p>
     <w:p>
@@ -15855,7 +16238,7 @@
         <w:ind w:left="360" w:hanging="360"/>
       </w:pPr>
       <w:r>
-        <w:t>Li et al.. (2025). From Single to Societal: Analyzing Persona-Induced Bias in Multi-Agent Interactions.. arXiv preprint. arXiv:2511.11789</w:t>
+        <w:t>Borah and Mihalcea. (2024). Towards Implicit Bias Detection and Mitigation in Multi-Agent LLM Interactions.. arXiv preprint. arXiv:2410.02584</w:t>
       </w:r>
     </w:p>
     <w:p>
@@ -15863,7 +16246,7 @@
         <w:ind w:left="360" w:hanging="360"/>
       </w:pPr>
       <w:r>
-        <w:t>Borah and Mihalcea. (2024). Towards Implicit Bias Detection and Mitigation in Multi-Agent LLM Interactions.. arXiv preprint. arXiv:2410.02584</w:t>
+        <w:t>Campedelli et al.. (2024). I Want to Break Free! Persuasion and Anti-Social Behavior of LLMs in Multi-Agent Settings with Social Hierarchy.. arXiv preprint (EACL 2024 Workshop). arXiv:2410.07109</w:t>
       </w:r>
     </w:p>
     <w:p>
@@ -15871,7 +16254,7 @@
         <w:ind w:left="360" w:hanging="360"/>
       </w:pPr>
       <w:r>
-        <w:t>Campedelli et al.. (2024). I Want to Break Free! Persuasion and Anti-Social Behavior of LLMs in Multi-Agent Settings with Social Hierarchy.. arXiv preprint (EACL 2024 Workshop). arXiv:2410.07109</w:t>
+        <w:t>Mirza et al.. (2025). MALIBU Benchmark: Multi-Agent LLM Implicit Bias Uncovered.. arXiv preprint. arXiv:2507.01019</w:t>
       </w:r>
     </w:p>
     <w:p>
@@ -15879,7 +16262,7 @@
         <w:ind w:left="360" w:hanging="360"/>
       </w:pPr>
       <w:r>
-        <w:t>Mirza et al.. (2025). MALIBU Benchmark: Multi-Agent LLM Implicit Bias Uncovered.. arXiv preprint. arXiv:2507.01019</w:t>
+        <w:t>Ki et al.. (2025). Multiple LLM Agents Debate for Equitable Cultural Alignment.. ACL 2025 (Oral). arXiv:2505.24671</w:t>
       </w:r>
     </w:p>
     <w:p>
@@ -15887,7 +16270,7 @@
         <w:ind w:left="360" w:hanging="360"/>
       </w:pPr>
       <w:r>
-        <w:t>Ki et al.. (2025). Multiple LLM Agents Debate for Equitable Cultural Alignment.. ACL 2025 (Oral). arXiv:2505.24671</w:t>
+        <w:t>Deshpande et al.. (2023). Toxicity in ChatGPT: Analyzing Persona-assigned Language Models.. EMNLP Findings. arXiv:2304.05335</w:t>
       </w:r>
     </w:p>
     <w:p>
@@ -15895,7 +16278,7 @@
         <w:ind w:left="360" w:hanging="360"/>
       </w:pPr>
       <w:r>
-        <w:t>Deshpande et al.. (2023). Toxicity in ChatGPT: Analyzing Persona-assigned Language Models.. EMNLP Findings. arXiv:2304.05335</w:t>
+        <w:t>Kambhampati. (2024). Can Large Language Models Reason and Plan?.. Annals of the New York Academy of Sciences. arXiv:2403.04121. doi:10.1111/nyas.15125</w:t>
       </w:r>
     </w:p>
     <w:p>
@@ -15903,7 +16286,7 @@
         <w:ind w:left="360" w:hanging="360"/>
       </w:pPr>
       <w:r>
-        <w:t>Kambhampati. (2024). Can Large Language Models Reason and Plan?.. Annals of the New York Academy of Sciences. arXiv:2403.04121. doi:10.1111/nyas.15125</w:t>
+        <w:t>Kabra et al.. (2025). Reasoning Towards Fairness: Mitigating Bias in Language Models through Reasoning-Guided Fine-Tuning.. arXiv preprint. arXiv:2504.05632</w:t>
       </w:r>
     </w:p>
     <w:p>
@@ -15911,7 +16294,7 @@
         <w:ind w:left="360" w:hanging="360"/>
       </w:pPr>
       <w:r>
-        <w:t>Kabra et al.. (2025). Reasoning Towards Fairness: Mitigating Bias in Language Models through Reasoning-Guided Fine-Tuning.. arXiv preprint. arXiv:2504.05632</w:t>
+        <w:t>Zhou et al.. (2025). Veracity Bias and Beyond: Uncovering LLMs' Hidden Beliefs in Problem-Solving Reasoning.. ACL 2025 (Main). arXiv:2505.16128</w:t>
       </w:r>
     </w:p>
     <w:p>
@@ -15919,31 +16302,7 @@
         <w:ind w:left="360" w:hanging="360"/>
       </w:pPr>
       <w:r>
-        <w:t>Hall et al.. (2025). Guiding LLM Decision-Making with Fairness Reward Models.. arXiv preprint. arXiv:2507.11344</w:t>
-      </w:r>
-    </w:p>
-    <w:p>
-      <w:pPr>
-        <w:ind w:left="360" w:hanging="360"/>
-      </w:pPr>
-      <w:r>
-        <w:t>Zhou et al.. (2025). Veracity Bias and Beyond: Uncovering LLMs' Hidden Beliefs in Problem-Solving Reasoning.. ACL 2025 (Main). arXiv:2505.16128</w:t>
-      </w:r>
-    </w:p>
-    <w:p>
-      <w:pPr>
-        <w:ind w:left="360" w:hanging="360"/>
-      </w:pPr>
-      <w:r>
         <w:t>Santurkar et al.. (2023). Whose Opinions Do Language Models Reflect?.. ICML. arXiv:2303.17548</w:t>
-      </w:r>
-    </w:p>
-    <w:p>
-      <w:pPr>
-        <w:ind w:left="360" w:hanging="360"/>
-      </w:pPr>
-      <w:r>
-        <w:t>Pawar et al.. (2025). Presumed Cultural Identity: How Names Shape LLM Responses.. arXiv preprint. arXiv:2502.11995</w:t>
       </w:r>
     </w:p>
     <w:p>

</xml_diff>

<commit_message>
Final acceptance pass: humanized + Opus review (minor-revision/accept lean); add worked numerical BCF example + Figure 2 table, trim disclaimers, fix Table 2.2 caption + abstract + venue/PRISMA consistency; refresh PDF/DOCX/acmart
</commit_message>
<xml_diff>
--- a/AGENT_FAIRNESS_SURVEY.docx
+++ b/AGENT_FAIRNESS_SURVEY.docx
@@ -107,7 +107,7 @@
         <w:t>conduction operator</w:t>
       </w:r>
       <w:r>
-        <w:t xml:space="preserve"> (how disparity transforms across each pipeline edge: ATTENUATE, PRESERVE, AMPLIFY, or GENERATE). Together these yield a conduction equation that predicts trajectory-level disparity from component-level measurements. This framework converts a component taxonomy into a testable formal theory: five propositions, stated under the linearized BCF model, characterize locality (P1), masking (P2, the measurement gap), super-additivity (P3, the agentic multiplier), mitigation matching (P4), and measurement adequacy (P5). Grounded in a verified corpus of 202 papers spanning 2012 to 2026, the survey maps the literature onto the BCF locus x operator grid, delivers trajectory-level and action-level disparity metrics (tool-invocation, escalation, and plan-allocation disparity) formalized as instances of the BCF's component counterfactual disparity Δ_c, constructs a mitigation map relating each intervention family to the pipeline component and operator it addresses, and reports a small pilot of an executable cross-framework bias audit whose results illustrate P2 (decision-level parity masking a score-level disparity) and is directionally consistent with the P3 amplification trend (mean absolute score difference rising as agentic scaffolding increases), with a full confirmatory study left to future work. We further characterize a structural </w:t>
+        <w:t xml:space="preserve"> (how disparity transforms across each pipeline edge: ATTENUATE, PRESERVE, AMPLIFY, or GENERATE). Together these yield a conduction equation that predicts trajectory-level disparity from component-level measurements. This framework converts a component taxonomy into a formal organizing framework yielding five falsifiable propositions, stated under the linearized BCF model, four grounded in existing corpus evidence and one (P3's cross-component form) stated as a falsifiable conjecture: locality (P1), masking (P2, the measurement gap), super-additivity (P3, the agentic multiplier), mitigation matching (P4), and measurement adequacy (P5). Grounded in a verified corpus of 202 papers spanning 2012 to 2026, the survey maps the literature onto the BCF locus x operator grid, delivers trajectory-level and action-level disparity metrics (tool-invocation, escalation, and plan-allocation disparity) formalized as instances of the BCF's component counterfactual disparity Δ_c, constructs a mitigation map relating each intervention family to the pipeline component and operator it addresses, and reports a small pilot of an executable cross-framework bias audit whose results illustrate an endpoint-level analogue of P2 (a decision statistic masking a score-level disparity at the same output node) and are directionally consistent with the P3 amplification trend (mean absolute score difference rising as agentic scaffolding increases), with a full confirmatory study left to future work. We further characterize a structural </w:t>
       </w:r>
       <w:r>
         <w:rPr>
@@ -280,7 +280,7 @@
         <w:t>conduction operator</w:t>
       </w:r>
       <w:r>
-        <w:t xml:space="preserve"> (ATTENUATE φ&lt;1 / PRESERVE φ≈1 / AMPLIFY φ&gt;1 / GENERATE φ on zero input). The formal core (§3.0) defines: D1 the agent loop as the tuple ⟨π,T,M,R⟩ (policy, tool registry, memory module, reward/evaluation signal); D2 component counterfactual disparity Δ_c measured via trace-replay; D3 the set of conduction operators. The conduction equation Δ_τ ≈ Σ_c Δ_c · Π φ_e with feedback recurrence Δ^(t+1) = φ_fb · Δ^(t) + Δ_entry predicts trajectory-level disparity from component measurements. Five propositions follow: P1 Locality (a disparity at component c is attributable to that component's locus if it vanishes under a component-level counterfactual), P2 Masking (token-level parity can coexist with action-level disparity, the measurement gap as a theorem), P3 Super-additivity (the agentic multiplier: Δ_τ can exceed the naive sum Σ_c |Δ_c| when at least one AMPLIFY or GENERATE edge lies on a conduction path), P4 Mitigation matching (an intervention reduces Δ_τ only if it targets the locus and operator of the dominant Δ_c), and P5 Measurement adequacy (a fairness metric is adequate for an agent only if it surfaces Δ_c for every component with non-negligible φ, with adequacy graded in the tiers of §3.0.5). Section 3.8 provides a worked hiring-agent example tracing bias from C0 (base model) through C3 (delegation), and a four-step auditor recipe (instrument trace-replay, estimate φ_e per edge, identify dominant locus, match mitigation to operator).</w:t>
+        <w:t xml:space="preserve"> (ATTENUATE φ&lt;1 / PRESERVE φ≈1 / AMPLIFY φ&gt;1 / GENERATE φ on zero input). The formal core (§3.0) defines: D1 the agent loop as the tuple ⟨π,T,M,R⟩ (policy, tool registry, memory module, reward/evaluation signal); D2 component counterfactual disparity Δ_c measured via trace-replay; D3 the set of conduction operators. The conduction equation Δ_τ ≈ Σ_c Δ_c · Π φ_e with feedback recurrence Δ^(t+1) = φ_fb · Δ^(t) + Δ_entry predicts trajectory-level disparity from component measurements. The framework is a formal organizing framework yielding five falsifiable propositions, four grounded in existing corpus evidence and one (P3's cross-component form) stated as a falsifiable conjecture: P1 Locality (a disparity at component c is attributable to that component's locus if it vanishes under a component-level counterfactual), P2 Masking (token-level parity can coexist with action-level disparity, the measurement gap as a theorem), P3 Super-additivity (the agentic multiplier: Δ_τ can exceed the naive sum Σ_c |Δ_c| when at least one AMPLIFY or GENERATE edge lies on a conduction path), P4 Mitigation matching (an intervention reduces Δ_τ only if it targets the locus and operator of the dominant Δ_c), and P5 Measurement adequacy (a fairness metric is adequate for an agent only if it surfaces Δ_c for every component with non-negligible φ, with adequacy graded in the tiers of §3.0.5). Section 3.8 provides a worked hiring-agent example tracing bias from C0 (base model) through C3 (delegation), and a four-step auditor recipe (instrument trace-replay, estimate φ_e per edge, identify dominant locus, match mitigation to operator).</w:t>
       </w:r>
     </w:p>
     <w:p>
@@ -322,7 +322,7 @@
         <w:t>The pilot illustrates the predicted masking-and-amplification pattern but is directional only; a full confirmatory study is future work.</w:t>
       </w:r>
       <w:r>
-        <w:t xml:space="preserve"> The protocol, harness, and raw decisions will be released with the camera-ready.</w:t>
+        <w:t xml:space="preserve"> The protocol, scripts, and raw decisions will be released with the camera-ready.</w:t>
       </w:r>
     </w:p>
     <w:p>
@@ -3598,10 +3598,10 @@
               <w:rPr>
                 <w:b/>
               </w:rPr>
-              <w:t>202</w:t>
-            </w:r>
-            <w:r>
-              <w:t xml:space="preserve"> (unique)</w:t>
+              <w:t>173</w:t>
+            </w:r>
+            <w:r>
+              <w:t xml:space="preserve"> (by primary branch; 202 unique after multi-tag, see note)</w:t>
             </w:r>
           </w:p>
         </w:tc>
@@ -3613,7 +3613,7 @@
         <w:rPr>
           <w:i/>
         </w:rPr>
-        <w:t>Note: rows do not sum to 202 because papers appearing in multiple branches are deduplicated at the final stage; the multi-tag convention is applied after inclusion decisions are finalized. Included counts are by primary branch (each paper's single primary locus); they partition the corpus and sum to 202; cross-cutting papers are additionally counted in secondary branches in the coverage matrix (§7). The corresponding primary-branch partition is: foundational/must-cite 46, related-surveys/prior-art 29, foundations 16, evaluation-metrics-benchmarks 16, mitigation 13, high-stakes-domains 13, llm-agents-general 12, tool/API-selection 12, user-modeling/personalization 11, memory/retrieval 10, multi-agent-delegation 9, long-horizon-drift 9, planning/decomposition 6.</w:t>
+        <w:t>Note: the visible Included column lists each branch's records by primary-branch attribution and sums to 173; it does not sum to 202 because the table omits cross-cutting papers that are counted only in their secondary branches. The full corpus of 202 unique papers is recovered by a separate primary-branch partition (each paper assigned to its single primary locus), which does sum to 202; cross-cutting papers are also counted in secondary branches in the coverage matrix (§7). That primary-branch partition is: foundational/must-cite 46, related-surveys/prior-art 29, foundations 16, evaluation-metrics-benchmarks 16, mitigation 13, high-stakes-domains 13, llm-agents-general 12, tool/API-selection 12, user-modeling/personalization 11, memory/retrieval 10, multi-agent-delegation 9, long-horizon-drift 9, planning/decomposition 6.</w:t>
       </w:r>
     </w:p>
     <w:p>
@@ -3703,7 +3703,7 @@
         <w:rPr>
           <w:b/>
         </w:rPr>
-        <w:t>Table 2.2 (Inclusion and Exclusion Criteria.</w:t>
+        <w:t>Table 2.2: Inclusion and Exclusion Criteria.</w:t>
       </w:r>
       <w:r>
         <w:t xml:space="preserve"> </w:t>
@@ -3712,7 +3712,7 @@
         <w:rPr>
           <w:i/>
         </w:rPr>
-        <w:t>Takeaway: the criteria operationalize a single principle) fairness as a property of agent actions, not merely of model outputs.</w:t>
+        <w:t>Takeaway: the criteria operationalize a single principle: fairness as a property of agent actions, not merely of model outputs.</w:t>
       </w:r>
     </w:p>
     <w:tbl>
@@ -4116,12 +4116,12 @@
     </w:p>
     <w:p>
       <w:r>
-        <w:t>The corpus spans twelve venue categories. The five largest are: arXiv preprints (62 papers, 31%), ACL-family venues (ACL, EMNLP, NAACL, Findings) (41 papers, 20%), NeurIPS/ICML/ICLR (28 papers, 14%), ACM venues (FAccT, SIGKDD, SIGIR, CIKM, DL proceedings) (24 papers, 12%), and domain-specific venues (Nature Medicine, PNAS Nexus, The Lancet Digital Health, AAAI, ICSE) (19 papers, 9%). The remaining 27 papers (14%) appear in IEEE venues, TMLR, Frontiers, and preprint archives (ResearchGate, TechRxiv).</w:t>
-      </w:r>
-    </w:p>
-    <w:p>
-      <w:r>
-        <w:t>Several observations follow. First, the arXiv share is high (31%), reflecting the recency of the field: many 2025 to 2026 papers are under review or in proceedings preparation. Second, the ACM FAccT representation (9 papers) is lower than the field's importance would suggest, indicating that agent fairness has not yet been fully claimed by the accountability community; it currently sits across NLP venues, systems venues, and domain journals. Third, 10 papers appear in CSUR or ACM Computing Surveys directly, indicating that the survey genre has begun to engage this territory, and the differentiation analysis in §1.4 and Table 0 is therefore essential to establishing the present survey's novelty.</w:t>
+        <w:t>The corpus spans twelve venue categories. The five largest are: arXiv preprints (62 papers, 31%), ACL-family venues (ACL, EMNLP, NAACL, Findings) (41 papers, 20%), NeurIPS/ICML/ICLR (28 papers, 14%), ACM venues (FAccT, SIGKDD, SIGIR, CIKM, DL proceedings) (24 papers, 12%), and domain-specific venues (Nature Medicine, PNAS Nexus, The Lancet Digital Health, AAAI, ICSE) (19 papers, 9%). The remaining 28 papers (14%) appear in IEEE venues, TMLR, Frontiers, and preprint archives (ResearchGate, TechRxiv).</w:t>
+      </w:r>
+    </w:p>
+    <w:p>
+      <w:r>
+        <w:t>Several observations follow. The arXiv share is high (31%), reflecting the recency of the field: many 2025 to 2026 papers are under review or in proceedings preparation. The ACM FAccT representation (9 papers) is lower than the field's importance would suggest, indicating that agent fairness has not yet been fully claimed by the accountability community; it currently sits across NLP venues, systems venues, and domain journals. Ten papers appear in CSUR or ACM Computing Surveys directly, indicating that the survey genre has begun to engage this territory, and the differentiation analysis in §1.4 and Table 0 is therefore essential to establishing the present survey's novelty.</w:t>
       </w:r>
     </w:p>
     <w:p>
@@ -4680,7 +4680,7 @@
         <w:t>tool/environment interface</w:t>
       </w:r>
       <w:r>
-        <w:t>: the tool registry, retrieval indices, and external APIs; invoking T returns an observation o_t that is appended to the context. This is the interface formalized by tool-learning and reasoning-acting architectures [schick2023toolformer, yao2023react, qu2024tool].</w:t>
+        <w:t>: the tool registry, retrieval indices, and external APIs; invoking T returns an observation o_t that is appended to the context. Tool-learning and reasoning-acting architectures formalize this interface [schick2023toolformer, yao2023react, qu2024tool].</w:t>
       </w:r>
     </w:p>
     <w:p>
@@ -5316,7 +5316,7 @@
         <w:t>Endpoint metrics can read ≈ 0 while internal disparities are large: whenever a downstream ATTENUATE edge (or sign-opposed entries) cancels an upstream Δ_c, the conduction equation yields Δ_τ ≈ 0 with Σ_c |Δ_c| ≫ 0.</w:t>
       </w:r>
       <w:r>
-        <w:t xml:space="preserve"> This is the survey's measurement gap stated as a structural fact rather than an empirical complaint. Justification: [li2025actions] shows verbally neutral models issuing demographically disparate </w:t>
+        <w:t xml:space="preserve"> The survey's measurement gap here takes the form of a structural fact rather than an empirical complaint. Justification: [li2025actions] shows verbally neutral models issuing demographically disparate </w:t>
       </w:r>
       <w:r>
         <w:rPr>
@@ -6448,7 +6448,7 @@
         <w:t>user or subject</w:t>
       </w:r>
       <w:r>
-        <w:t xml:space="preserve"> under a counterfactual swap holding the query fixed. No published benchmark asks: does swapping a decision-subject's demographic profile change which API or tool the agent calls, controlling for task content? This is the Δ_tool instance of D2 that §4.3 formalizes as tool-invocation disparity. Two phenomena must be kept distinct here: (a) provider- and ordering-preference selection bias among functionally equivalent tools, which is what [blankenstein2025biasbusters] measures and which by that study's own design involves no sensitive attributes; and (b) demographic-conditioned tool routing, for which the only direct evidence is the clinical decomposition of [xu2026ducx], in a medical context. The GENERATE-operator finding from [blankenstein2025biasbusters] therefore establishes only that selection skew is measurable at all, not demographic-conditional skew, and the finding from [xu2026ducx] attributes a disparity share to C1 but without the counterfactual isolation that P1 (Locality) requires for strict attribution. No direct demographic-swap measurement of tool selection yet exists. Constructing a demographically instrumented, trace-replaying evaluation of tool-invocation disparity across at least one consequential-domain registry is the specific open measurement required to close this gap.</w:t>
+        <w:t xml:space="preserve"> under a counterfactual swap holding the query fixed. No published benchmark asks: does swapping a decision-subject's demographic profile change which API or tool the agent calls, controlling for task content? That gap is the Δ_tool instance of D2 that §4.3 formalizes as tool-invocation disparity. Two phenomena must be kept distinct here: (a) provider- and ordering-preference selection bias among functionally equivalent tools, which is what [blankenstein2025biasbusters] measures and which by that study's own design involves no sensitive attributes; and (b) demographic-conditioned tool routing, for which the only direct evidence is the clinical decomposition of [xu2026ducx], in a medical context. The GENERATE-operator finding from [blankenstein2025biasbusters] therefore establishes only that selection skew is measurable at all, not demographic-conditional skew, and the finding from [xu2026ducx] attributes a disparity share to C1 but without the counterfactual isolation that P1 (Locality) requires for strict attribution. No direct demographic-swap measurement of tool selection yet exists. Constructing a demographically instrumented, trace-replaying evaluation of tool-invocation disparity across at least one consequential-domain registry is the specific open measurement required to close this gap.</w:t>
       </w:r>
     </w:p>
     <w:p>
@@ -6572,7 +6572,7 @@
         <w:t>What is known.</w:t>
       </w:r>
       <w:r>
-        <w:t xml:space="preserve"> The most robust finding at this locus is that retrieval augmentation can </w:t>
+        <w:t xml:space="preserve"> The most reliable finding at this locus is that retrieval augmentation can </w:t>
       </w:r>
       <w:r>
         <w:rPr>
@@ -6581,7 +6581,7 @@
         <w:t>generate</w:t>
       </w:r>
       <w:r>
-        <w:t xml:space="preserve"> demographic disparity from a generator that exhibits none in closed-book mode, a GENERATE conduction signature that now has three converging lines of evidence. [hu2024free] establish the mechanism in its strongest form: the disparity appears even when retrieved documents are individually innocuous and even when the user explicitly prompts for fairness, establishing that the GENERATE edge is neither an artifact of adversarial content nor correctable by instruction. [wu2024rag] replicate the finding by holding the generator fixed and varying the retrieval corpus and ranking, isolating the retrieval step as the active locus. [zhang2025evaluating] confirm that augmentation measurably shifts social-bias levels relative to the identical closed-book baseline. Taken together, these three studies constitute the field's best-replicated C2 result: RAG is a GENERATE edge for demographic disparity, not merely a conduit for pre-existing model bias.</w:t>
+        <w:t xml:space="preserve"> demographic disparity from a generator that exhibits none in closed-book mode, a GENERATE conduction signature that now has three converging lines of evidence. [hu2024free] establish the mechanism in its strongest form: the disparity appears even when retrieved documents are individually innocuous and even when the user explicitly prompts for fairness, establishing that the GENERATE edge is neither an artifact of adversarial content nor correctable by instruction. [wu2024rag] replicate the finding by holding the generator fixed and varying the retrieval corpus and ranking, isolating the retrieval step as the active locus. [zhang2025evaluating] confirm that augmentation measurably shifts social-bias levels relative to the identical closed-book baseline. Taken together, these three studies constitute the field's best-replicated C2 result: RAG is a GENERATE edge for demographic disparity, introducing skew that the closed-book model never carried.</w:t>
       </w:r>
     </w:p>
     <w:p>
@@ -6616,7 +6616,7 @@
     </w:p>
     <w:p>
       <w:r>
-        <w:t xml:space="preserve">The accumulation evidence carries a parallel ambiguity. [fan2024fairmt], [geng2025accumulating], and [simhi2026old] all measure degradation over turns, but they differ in whether they attribute the effect primarily to the growing size of the context, to the semantic content of accumulated history, or to the positional structure of how retrieved and remembered facts are arranged in the window. These attributions have different mitigation implications: a context-size account implies that truncation or summarization policies would attenuate accumulation, while a positional account implies that reordering the memory state would suffice, and a semantic account implies that neither would be adequate without content-level filtering. The studies are mutually consistent but do not adjudicate among these accounts, so the AMPLIFY operator is evidenced at this locus without a stable mechanism model for </w:t>
+        <w:t xml:space="preserve">A parallel ambiguity runs through the accumulation evidence. [fan2024fairmt], [geng2025accumulating], and [simhi2026old] all measure degradation over turns, but they differ in whether they attribute the effect primarily to the growing size of the context, to the semantic content of accumulated history, or to the positional structure of how retrieved and remembered facts are arranged in the window. These attributions have different mitigation implications: a context-size account implies that truncation or summarization policies would attenuate accumulation, while a positional account implies that reordering the memory state would suffice, and a semantic account implies that neither would be adequate without content-level filtering. The studies are mutually consistent but do not adjudicate among these accounts, so the AMPLIFY operator is evidenced at this locus without a stable mechanism model for </w:t>
       </w:r>
       <w:r>
         <w:rPr>
@@ -6636,7 +6636,7 @@
         <w:t>What transfers only by analogy.</w:t>
       </w:r>
       <w:r>
-        <w:t xml:space="preserve"> One important input to the accumulation mechanism is evidenced only in settings that are not yet measured in instrumented agents. Long-context models are known to privilege the head and tail of their input window, the "lost in the middle" effect [liu2023lost][†], meaning that which retrieved or remembered facts about a person receive effective attention is a function of position in the context, not only of content. This implies that demographic disparity in memory can arise or be suppressed by the </w:t>
+        <w:t xml:space="preserve"> One important input to the accumulation mechanism is evidenced only in settings that are not yet measured in instrumented agents. Long-context models are known to privilege the head and tail of their input window, the "lost in the middle" effect [liu2023lost][†], meaning that which retrieved or remembered facts about a person receive effective attention is a function of position in the context as much as of content. This implies that demographic disparity in memory can arise or be suppressed by the </w:t>
       </w:r>
       <w:r>
         <w:rPr>
@@ -6645,7 +6645,7 @@
         <w:t>write order</w:t>
       </w:r>
       <w:r>
-        <w:t xml:space="preserve"> of the memory store independent of the content written, a structurally important point that the agentic memory literature has not yet measured. The positional-attention result is robust in non-agentic reading-comprehension and summarization settings; its transfer to the retrieval-augmented agent loop (where memory writes are interleaved with actions and where the agent both reads and appends to its own context) is mechanistically plausible but empirically unconfirmed as of the corpus cutoff.</w:t>
+        <w:t xml:space="preserve"> of the memory store independent of the content written, a structurally important point that the agentic memory literature has not yet measured. The positional-attention result is well-established in non-agentic reading-comprehension and summarization settings; its transfer to the retrieval-augmented agent loop (where memory writes are interleaved with actions and where the agent both reads and appends to its own context) is mechanistically plausible but empirically unconfirmed as of the corpus cutoff.</w:t>
       </w:r>
     </w:p>
     <w:p>
@@ -6887,7 +6887,7 @@
         <w:t>Dominant outbound operators:</w:t>
       </w:r>
       <w:r>
-        <w:t xml:space="preserve"> GENERATE (persona injection) followed by AMPLIFY (interaction). This is the only locus where both agentic operators are corpus-evidenced together. </w:t>
+        <w:t xml:space="preserve"> GENERATE (persona injection) followed by AMPLIFY (interaction). C3 is the only locus where both agentic operators are corpus-evidenced together. </w:t>
       </w:r>
       <w:r>
         <w:rPr>
@@ -7183,7 +7183,7 @@
         <w:t>What is known.</w:t>
       </w:r>
       <w:r>
-        <w:t xml:space="preserve"> The most robustly replicated finding at this locus is that demographic cues supplied at query time cause a system's adaptive behavior to track stereotypical group profiles rather than individually indicated preferences, collapsing the personalization-fidelity goal into stereotype instantiation. This mechanism is established across at least three distinct operationalizations. Identity signaling via explicit group labels biases chatbot recommendations toward stereotype rather than stated preference [kantharuban2024stereotype][†]. The trigger requires no explicit declaration: a name alone activates a presumed cultural identity that reshapes response content [pawar2025presumed]. And the inference can precede any signal from the user, because LLMs recover protected attributes (location, income, sex) from innocuous conversational text without any demographic prompt [staab2023memorization], meaning the agent has already modeled the user demographically before any adaptation begins. The convergence across these three cue types (label, name, inference from content) on the same directional finding, stereotype-tracking rather than preference-tracking, constitutes the strongest multi-source replication this locus offers.</w:t>
+        <w:t xml:space="preserve"> The most consistently replicated finding at this locus is that demographic cues supplied at query time cause a system's adaptive behavior to track stereotypical group profiles rather than individually indicated preferences, collapsing the personalization-fidelity goal into stereotype instantiation. This mechanism is established across at least three distinct operationalizations. Identity signaling via explicit group labels biases chatbot recommendations toward stereotype rather than stated preference [kantharuban2024stereotype][†]. The trigger requires no explicit declaration: a name alone activates a presumed cultural identity that reshapes response content [pawar2025presumed]. And the inference can precede any signal from the user, because LLMs recover protected attributes (location, income, sex) from innocuous conversational text without any demographic prompt [staab2023memorization], meaning the agent has already modeled the user demographically before any adaptation begins. The convergence across these three cue types (label, name, inference from content) on the same directional finding, stereotype-tracking rather than preference-tracking, constitutes the strongest multi-source replication this locus offers.</w:t>
       </w:r>
     </w:p>
     <w:p>
@@ -7199,7 +7199,7 @@
         <w:t>What conflicts or is contested.</w:t>
       </w:r>
       <w:r>
-        <w:t xml:space="preserve"> The field's principal empirical tension at this locus concerns cue-channel consistency. A systematic study of demographic cue modalities finds that name-based, explicit-label-based, and dialect-based probes of the same models yield inconsistent and sometimes contradictory conclusions about the presence and direction of personalization bias [tonneau2026different]. This result does more than caution against single-cue audits; it implies that papers in this locus are not measuring the same underlying quantity, so the apparent convergence noted above is partly artifactual. Studies using name cues may detect bias that label-based studies of the same model do not, or vice versa, and without multi-cue replication, the directional finding (stereotype over preference) is robust only within cue modality. A further contested point concerns the cost of mitigation: debiasing personalized models trades off against recommendation utility [vijjini2024exploring], which means that ATTENUATE interventions at this locus are not free in the way that, for example, filtering a retrieval set might be. The tradeoff magnitude has not been quantified across deployment contexts, and different utility definitions yield different tradeoff profiles, so no consensus on acceptable mitigation cost exists. Finally, the boundary between C5 and adjacent loci is contested by the inference result [staab2023memorization]: if the protected attribute is constructed by the model from non-demographic text, the operative locus may be the language model's latent representation (C0 baseline) rather than any explicit user-modeling step, and counterfactual swaps at the input surface may leave the inferred user model unchanged, making the standard D2 protocol inapplicable without modification.</w:t>
+        <w:t xml:space="preserve"> The field's principal empirical tension at this locus concerns cue-channel consistency. A systematic study of demographic cue modalities finds that name-based, explicit-label-based, and dialect-based probes of the same models yield inconsistent and sometimes contradictory conclusions about the presence and direction of personalization bias [tonneau2026different]. This result does more than caution against single-cue audits; it implies that papers in this locus are not measuring the same underlying quantity, so the apparent convergence noted above is partly artifactual. Studies using name cues may detect bias that label-based studies of the same model do not, or vice versa, and without multi-cue replication, the directional finding (stereotype over preference) holds only within cue modality. A further contested point concerns the cost of mitigation: debiasing personalized models trades off against recommendation utility [vijjini2024exploring], which means that ATTENUATE interventions at this locus are not free in the way that, for example, filtering a retrieval set might be. The tradeoff magnitude has not been quantified across deployment contexts, and different utility definitions yield different tradeoff profiles, so no consensus on acceptable mitigation cost exists. Finally, the boundary between C5 and adjacent loci is contested by the inference result [staab2023memorization]: if the protected attribute is constructed by the model from non-demographic text, the operative locus may be the language model's latent representation (C0 baseline) rather than any explicit user-modeling step, and counterfactual swaps at the input surface may leave the inferred user model unchanged, making the standard D2 protocol inapplicable without modification.</w:t>
       </w:r>
     </w:p>
     <w:p>
@@ -7221,7 +7221,7 @@
         <w:t>What is unmeasured.</w:t>
       </w:r>
       <w:r>
-        <w:t xml:space="preserve"> The most consequential open gap at this locus is the persistent user model: all available evidence concerns the disparity elicited within a single response or single turn, not the disparity accumulated and locked into the user representation an agent maintains and updates across sessions. An agent that interacts with a user repeatedly will form, update, and act on a profile that encodes earlier stereotype-triggered inferences, creating a form of within-agent institutionalized bias that single-response probing cannot detect. This is the object that bridges C5 to §3.6's recurrence, and it is unmeasured. No agentic benchmark in Table 2 instruments the user model as a persistent state object, varies the cue channel as a controlled factor across sessions, or measures how demographic inferences made early in an interaction propagate to consequential decisions made later. The inference channel [staab2023memorization] introduces a further measurement-theory problem: if the protected attribute is inferred from content rather than supplied as a cue, the standard D2 counterfactual swap (alter the cue at input, observe behavior change) fails to intervene on the operative variable. Defining a valid counterfactual for this case requires either a structural causal model of the inference process, which does not exist for any deployed agent, or a cue-channel-controlled experiment design of the kind that [tonneau2026different] recommends but that no agentic benchmark has yet implemented. C5 is therefore the locus where the BCF's D2 measurement procedure is hardest to operationalize, and the gap is tied directly to the GENERATE signature: bias that is internally constructed cannot be removed by swapping an external label.</w:t>
+        <w:t xml:space="preserve"> The most consequential open gap at this locus is the persistent user model: all available evidence concerns the disparity elicited within a single response or single turn, not the disparity accumulated and locked into the user representation an agent maintains and updates across sessions. An agent that interacts with a user repeatedly will form, update, and act on a profile that encodes earlier stereotype-triggered inferences, creating a form of within-agent institutionalized bias that single-response probing cannot detect. That persistent user model bridges C5 to §3.6's recurrence, and it remains unmeasured. No agentic benchmark in Table 2 instruments the user model as a persistent state object, varies the cue channel as a controlled factor across sessions, or measures how demographic inferences made early in an interaction propagate to consequential decisions made later. The inference channel [staab2023memorization] introduces a further measurement-theory problem: if the protected attribute is inferred from content rather than supplied as a cue, the standard D2 counterfactual swap (alter the cue at input, observe behavior change) fails to intervene on the operative variable. Defining a valid counterfactual for this case requires either a structural causal model of the inference process, which does not exist for any deployed agent, or a cue-channel-controlled experiment design of the kind that [tonneau2026different] recommends but that no agentic benchmark has yet implemented. C5 is therefore the locus where the BCF's D2 measurement procedure is hardest to operationalize, and the gap is tied directly to the GENERATE signature: bias that is internally constructed cannot be removed by swapping an external label.</w:t>
       </w:r>
     </w:p>
     <w:p>
@@ -7394,7 +7394,7 @@
         <w:t>long-term memory</w:t>
       </w:r>
       <w:r>
-        <w:t>, making the agent more biased the longer it persists state [ma2026implicit] (the C2 × t cell). These two results together identify the locus (C2) and the operator (AMPLIFY) for the intra-trajectory loop: the state written to memory at turn t conditions the Δ_entry injected at turn t+1, so the recurrence is not merely metaphorical but traceable to a specific architectural feature. Sycophancy, the proximate mechanism, is also the mechanism with the most consistent cross-paper support at the intra-trajectory timescale. Multi-turn measurements document progressive conformity, labeled "truth decay," across turns [liu2025truth] and growth of sycophancy over extended dialogues [hong2025measuring]: both operationalize φ_fb &gt; 1 as a directly observable drift slope rather than an inferred parameter. At the deployment-loop timescale, the mechanism is self-consumption: training on a model's own synthetic outputs amplifies bias across generations [wyllie2024fairness], and the self-consuming performative loop has been characterized with proposed remedies for the LLM case specifically [wang2026observations]. The recommender-systems literature supplies the canonical prior result this work inherits: feedback-loop amplification in collaborative filtering is a documented, quantified phenomenon [mansoury2020feedback], and it establishes the theoretical plausibility of the same mechanism in any system that uses its own output distribution to shape future input.</w:t>
+        <w:t>, making the agent more biased the longer it persists state [ma2026implicit] (the C2 × t cell). These two results together identify the locus (C2) and the operator (AMPLIFY) for the intra-trajectory loop: the state written to memory at turn t conditions the Δ_entry injected at turn t+1, so the recurrence is not merely metaphorical but traceable to a specific architectural feature. Sycophancy is the proximate mechanism, and it has the most consistent cross-paper support at the intra-trajectory timescale. Multi-turn measurements document progressive conformity, labeled "truth decay," across turns [liu2025truth] and growth of sycophancy over extended dialogues [hong2025measuring]: both operationalize φ_fb &gt; 1 as a directly observable drift slope rather than an inferred parameter. At the deployment-loop timescale, the mechanism is self-consumption: training on a model's own synthetic outputs amplifies bias across generations [wyllie2024fairness], and the self-consuming performative loop has been characterized with proposed remedies for the LLM case specifically [wang2026observations]. The recommender-systems literature supplies the canonical prior result this work inherits: feedback-loop amplification in collaborative filtering is a documented, quantified phenomenon [mansoury2020feedback], and it establishes the theoretical plausibility of the same mechanism in any system that uses its own output distribution to shape future input.</w:t>
       </w:r>
     </w:p>
     <w:p>
@@ -7496,7 +7496,7 @@
         <w:t>Δ_τ can exceed the naive sum Σ_c |Δ_c| when at least one AMPLIFY or GENERATE edge lies on a conduction path.</w:t>
       </w:r>
       <w:r>
-        <w:t xml:space="preserve"> This is the formal content of what we call the </w:t>
+        <w:t xml:space="preserve"> P3 constitutes the formal content of what we call the </w:t>
       </w:r>
       <w:r>
         <w:rPr>
@@ -7505,7 +7505,7 @@
         <w:t>agentic multiplier</w:t>
       </w:r>
       <w:r>
-        <w:t xml:space="preserve">, and it converts a rhetorical worry ("agents make bias worse") into a checkable property of a logged trace: estimate the φ_e's; under the linearized magnitude model, some φ_e &gt; 1 or a fresh entry mid-path is necessary for super-additivity (not sufficient, since it can be offset downstream). Conversely (and this direction is just as consequential for auditors), if every edge in a pipeline is PRESERVE or ATTENUATE and no interaction term is present, component-level audits compose into a </w:t>
+        <w:t xml:space="preserve">, converting a rhetorical worry ("agents make bias worse") into a checkable property of a logged trace: estimate the φ_e's; under the linearized magnitude model, some φ_e &gt; 1 or a fresh entry mid-path is necessary for super-additivity (not sufficient, since it can be offset downstream). Conversely (and this direction is just as consequential for auditors), if every edge in a pipeline is PRESERVE or ATTENUATE and no interaction term is present, component-level audits compose into a </w:t>
       </w:r>
       <w:r>
         <w:rPr>
@@ -7663,12 +7663,12 @@
     </w:p>
     <w:p>
       <w:r>
-        <w:t>The conjecture is falsifiable with existing instruments: D2's trace-replay applied at two consecutive interfaces of the same logged trajectory estimates the cross-boundary φ directly, and the audit protocol of §6 is designed to produce exactly such paired estimates (the §6.5 pilot reports endpoint metrics only; these paired/interior estimates await the full study). Until such measurements exist, claims that "agentic bias compounds across the pipeline" (including informal versions in prior drafts of this survey) should be read as hypotheses licensed by P3's mechanism, not as established findings.</w:t>
-      </w:r>
-    </w:p>
-    <w:p>
-      <w:r>
-        <w:t>The compounding question is also the structural reason this survey is organized by component rather than by metric, and the conceptual core of the measurement gap of §4: by P2, a token-level probe at any single hand-off can read clean while the consequential action is sharply disparate [li2025actions, xu2025quantifying]; by P5, only trace-level counterfactual instrumentation can adjudicate Conjecture 1; and the coverage analysis of §7 shows the cells P3 most implicates (action-level, counterfactual, long-horizon) are precisely where the field is emptiest.</w:t>
+        <w:t>The conjecture is falsifiable with existing instruments: D2's trace-replay applied at two consecutive interfaces of the same logged trajectory estimates the cross-boundary φ directly, and the audit protocol of §6 is designed to produce exactly such paired estimates (not estimated in the pilot; see §6.5). Until such measurements exist, claims that "agentic bias compounds across the pipeline" (including informal versions in prior drafts of this survey) should be read as hypotheses licensed by P3's mechanism, not as established findings.</w:t>
+      </w:r>
+    </w:p>
+    <w:p>
+      <w:r>
+        <w:t>That compounding question is also the structural reason this survey is organized by component rather than by metric, and the conceptual core of the measurement gap of §4: by P2, a token-level probe at any single hand-off can read clean while the consequential action is sharply disparate [li2025actions, xu2025quantifying]; by P5, only trace-level counterfactual instrumentation can adjudicate Conjecture 1; and the coverage analysis of §7 shows the cells P3 most implicates (action-level, counterfactual, long-horizon) are precisely where the field is emptiest.</w:t>
       </w:r>
     </w:p>
     <w:p>
@@ -7772,7 +7772,7 @@
         <w:t>A four-step auditor recipe.</w:t>
       </w:r>
       <w:r>
-        <w:t xml:space="preserve"> The BCF reading of the ladder compresses into a procedure any team deploying an agent can execute, and which the §6 protocol instantiates on a hiring-style task (the §6.5 pilot reports endpoint metrics only; these paired/interior estimates await the full study):</w:t>
+        <w:t xml:space="preserve"> The BCF reading of the ladder compresses into a procedure any team deploying an agent can execute, and which the §6 protocol instantiates on a hiring-style task (not estimated in the pilot; see §6.5):</w:t>
       </w:r>
     </w:p>
     <w:p>
@@ -7786,7 +7786,7 @@
         <w:t>Instrument the trace.</w:t>
       </w:r>
       <w:r>
-        <w:t xml:space="preserve"> Log every component interface of D1 (tool calls and registry state, retrieved sets, memory reads/writes, inter-agent messages, plan objects, final action), not just the output. (The agent-benchmark infrastructure already does this much [zhou2024webarena, liu2024agentbench]; what it lacks is step 2.)</w:t>
+        <w:t xml:space="preserve"> Log every component interface of D1 (tool calls and registry state, retrieved sets, memory reads/writes, inter-agent messages, plan objects, final action), including all intermediate states beyond the final output. (The agent-benchmark infrastructure already does this much [zhou2024webarena, liu2024agentbench]; what it lacks is step 2.)</w:t>
       </w:r>
     </w:p>
     <w:p>
@@ -7855,6 +7855,467 @@
       </w:r>
     </w:p>
     <w:p>
+      <w:r>
+        <w:rPr>
+          <w:b/>
+        </w:rPr>
+        <w:t>A worked numerical micro-example (illustrative, not measured).</w:t>
+      </w:r>
+      <w:r>
+        <w:t xml:space="preserve"> To make the conduction machinery concrete, we run two small hiring-ladder configurations through the conduction equation Δ_τ ≈ Σ_c (signed Δ_c) · Π_{e ∈ path(c → O)} φ_e. The magnitudes below are illustrative placeholders, not measurements; they are chosen only to make the operators visible, and any real numbers would come from the trace-replay of steps 1 to 2.</w:t>
+      </w:r>
+    </w:p>
+    <w:p>
+      <w:r>
+        <w:rPr>
+          <w:i/>
+        </w:rPr>
+        <w:t>Configuration (a): masking (P2).</w:t>
+      </w:r>
+      <w:r>
+        <w:t xml:space="preserve"> Two loci feed the output node. The screening-prompt locus carries a signed component disparity Δ_prompt = +0.20 along a PRESERVE edge (φ = 1.0); the retrieval locus carries a sign-opposed disparity Δ_ret = −0.24 along an ATTENUATE edge (φ ≈ 0.83). The endpoint contributions are (+0.20)(1.0) = +0.20 and (−0.24)(0.83) ≈ −0.20, so the endpoint trajectory disparity is Δ_τ ≈ +0.20 − 0.20 ≈ 0.00, even though the summed magnitude of interior disparity is Σ_c |Δ_c| = |+0.20| + |−0.24| = 0.44.</w:t>
+      </w:r>
+    </w:p>
+    <w:tbl>
+      <w:tblPr>
+        <w:tblStyle w:val="LightGrid-Accent1"/>
+        <w:tblW w:type="auto" w:w="0"/>
+        <w:tblLook w:firstColumn="1" w:firstRow="1" w:lastColumn="0" w:lastRow="0" w:noHBand="0" w:noVBand="1" w:val="04A0"/>
+      </w:tblPr>
+      <w:tblGrid>
+        <w:gridCol w:w="1728"/>
+        <w:gridCol w:w="1728"/>
+        <w:gridCol w:w="1728"/>
+        <w:gridCol w:w="1728"/>
+        <w:gridCol w:w="1728"/>
+      </w:tblGrid>
+      <w:tr>
+        <w:tc>
+          <w:tcPr>
+            <w:tcW w:type="dxa" w:w="1728"/>
+          </w:tcPr>
+          <w:p>
+            <w:r>
+              <w:rPr>
+                <w:b/>
+              </w:rPr>
+              <w:t>Locus</w:t>
+            </w:r>
+          </w:p>
+        </w:tc>
+        <w:tc>
+          <w:tcPr>
+            <w:tcW w:type="dxa" w:w="1728"/>
+          </w:tcPr>
+          <w:p>
+            <w:r>
+              <w:rPr>
+                <w:b/>
+              </w:rPr>
+              <w:t>signed Δ_c</w:t>
+            </w:r>
+          </w:p>
+        </w:tc>
+        <w:tc>
+          <w:tcPr>
+            <w:tcW w:type="dxa" w:w="1728"/>
+          </w:tcPr>
+          <w:p>
+            <w:r>
+              <w:rPr>
+                <w:b/>
+              </w:rPr>
+              <w:t>edge operator</w:t>
+            </w:r>
+          </w:p>
+        </w:tc>
+        <w:tc>
+          <w:tcPr>
+            <w:tcW w:type="dxa" w:w="1728"/>
+          </w:tcPr>
+          <w:p>
+            <w:r>
+              <w:rPr>
+                <w:b/>
+              </w:rPr>
+              <w:t>φ_e</w:t>
+            </w:r>
+          </w:p>
+        </w:tc>
+        <w:tc>
+          <w:tcPr>
+            <w:tcW w:type="dxa" w:w="1728"/>
+          </w:tcPr>
+          <w:p>
+            <w:r>
+              <w:rPr>
+                <w:b/>
+              </w:rPr>
+              <w:t>endpoint contribution</w:t>
+            </w:r>
+          </w:p>
+        </w:tc>
+      </w:tr>
+      <w:tr>
+        <w:tc>
+          <w:tcPr>
+            <w:tcW w:type="dxa" w:w="1728"/>
+          </w:tcPr>
+          <w:p>
+            <w:r>
+              <w:t>Screening prompt</w:t>
+            </w:r>
+          </w:p>
+        </w:tc>
+        <w:tc>
+          <w:tcPr>
+            <w:tcW w:type="dxa" w:w="1728"/>
+          </w:tcPr>
+          <w:p>
+            <w:r>
+              <w:t>+0.20</w:t>
+            </w:r>
+          </w:p>
+        </w:tc>
+        <w:tc>
+          <w:tcPr>
+            <w:tcW w:type="dxa" w:w="1728"/>
+          </w:tcPr>
+          <w:p>
+            <w:r>
+              <w:t>PRESERVE</w:t>
+            </w:r>
+          </w:p>
+        </w:tc>
+        <w:tc>
+          <w:tcPr>
+            <w:tcW w:type="dxa" w:w="1728"/>
+          </w:tcPr>
+          <w:p>
+            <w:r>
+              <w:t>1.0</w:t>
+            </w:r>
+          </w:p>
+        </w:tc>
+        <w:tc>
+          <w:tcPr>
+            <w:tcW w:type="dxa" w:w="1728"/>
+          </w:tcPr>
+          <w:p>
+            <w:r>
+              <w:t>+0.20</w:t>
+            </w:r>
+          </w:p>
+        </w:tc>
+      </w:tr>
+      <w:tr>
+        <w:tc>
+          <w:tcPr>
+            <w:tcW w:type="dxa" w:w="1728"/>
+          </w:tcPr>
+          <w:p>
+            <w:r>
+              <w:t>Retrieval</w:t>
+            </w:r>
+          </w:p>
+        </w:tc>
+        <w:tc>
+          <w:tcPr>
+            <w:tcW w:type="dxa" w:w="1728"/>
+          </w:tcPr>
+          <w:p>
+            <w:r>
+              <w:t>−0.24</w:t>
+            </w:r>
+          </w:p>
+        </w:tc>
+        <w:tc>
+          <w:tcPr>
+            <w:tcW w:type="dxa" w:w="1728"/>
+          </w:tcPr>
+          <w:p>
+            <w:r>
+              <w:t>ATTENUATE</w:t>
+            </w:r>
+          </w:p>
+        </w:tc>
+        <w:tc>
+          <w:tcPr>
+            <w:tcW w:type="dxa" w:w="1728"/>
+          </w:tcPr>
+          <w:p>
+            <w:r>
+              <w:t>0.83</w:t>
+            </w:r>
+          </w:p>
+        </w:tc>
+        <w:tc>
+          <w:tcPr>
+            <w:tcW w:type="dxa" w:w="1728"/>
+          </w:tcPr>
+          <w:p>
+            <w:r>
+              <w:t>−0.20</w:t>
+            </w:r>
+          </w:p>
+        </w:tc>
+      </w:tr>
+      <w:tr>
+        <w:tc>
+          <w:tcPr>
+            <w:tcW w:type="dxa" w:w="1728"/>
+          </w:tcPr>
+          <w:p>
+            <w:r>
+              <w:rPr>
+                <w:b/>
+              </w:rPr>
+              <w:t>Endpoint Δ_τ</w:t>
+            </w:r>
+          </w:p>
+        </w:tc>
+        <w:tc>
+          <w:tcPr>
+            <w:tcW w:type="dxa" w:w="1728"/>
+          </w:tcPr>
+          <w:p/>
+        </w:tc>
+        <w:tc>
+          <w:tcPr>
+            <w:tcW w:type="dxa" w:w="1728"/>
+          </w:tcPr>
+          <w:p/>
+        </w:tc>
+        <w:tc>
+          <w:tcPr>
+            <w:tcW w:type="dxa" w:w="1728"/>
+          </w:tcPr>
+          <w:p/>
+        </w:tc>
+        <w:tc>
+          <w:tcPr>
+            <w:tcW w:type="dxa" w:w="1728"/>
+          </w:tcPr>
+          <w:p>
+            <w:r>
+              <w:rPr>
+                <w:b/>
+              </w:rPr>
+              <w:t>≈ 0.00</w:t>
+            </w:r>
+            <w:r>
+              <w:t xml:space="preserve"> (with Σ\</w:t>
+            </w:r>
+          </w:p>
+        </w:tc>
+      </w:tr>
+    </w:tbl>
+    <w:p/>
+    <w:p>
+      <w:r>
+        <w:t>Here an endpoint-only audit reads Δ_τ ≈ 0 and certifies parity, yet two loci each carry a disparity near 0.2 that sign-opposition and attenuation have hidden from the output node. This is exactly the masking P2 describes: an endpoint near zero masks a large summed interior disparity, reachable only by ATTENUATE φ &lt; 1 and sign-opposed entries.</w:t>
+      </w:r>
+    </w:p>
+    <w:p>
+      <w:r>
+        <w:rPr>
+          <w:i/>
+        </w:rPr>
+        <w:t>Configuration (b): super-additivity (P3).</w:t>
+      </w:r>
+      <w:r>
+        <w:t xml:space="preserve"> A single locus carries Δ_assign = +0.15 at the delegation interface, but its path to the output crosses an AMPLIFY edge with φ = 1.6. Its endpoint contribution is (+0.15)(1.6) = 0.24, so Δ_τ ≈ 0.24 exceeds the naive interior sum Σ_c |Δ_c| = 0.15.</w:t>
+      </w:r>
+    </w:p>
+    <w:tbl>
+      <w:tblPr>
+        <w:tblStyle w:val="LightGrid-Accent1"/>
+        <w:tblW w:type="auto" w:w="0"/>
+        <w:tblLook w:firstColumn="1" w:firstRow="1" w:lastColumn="0" w:lastRow="0" w:noHBand="0" w:noVBand="1" w:val="04A0"/>
+      </w:tblPr>
+      <w:tblGrid>
+        <w:gridCol w:w="1728"/>
+        <w:gridCol w:w="1728"/>
+        <w:gridCol w:w="1728"/>
+        <w:gridCol w:w="1728"/>
+        <w:gridCol w:w="1728"/>
+      </w:tblGrid>
+      <w:tr>
+        <w:tc>
+          <w:tcPr>
+            <w:tcW w:type="dxa" w:w="1728"/>
+          </w:tcPr>
+          <w:p>
+            <w:r>
+              <w:rPr>
+                <w:b/>
+              </w:rPr>
+              <w:t>Locus</w:t>
+            </w:r>
+          </w:p>
+        </w:tc>
+        <w:tc>
+          <w:tcPr>
+            <w:tcW w:type="dxa" w:w="1728"/>
+          </w:tcPr>
+          <w:p>
+            <w:r>
+              <w:rPr>
+                <w:b/>
+              </w:rPr>
+              <w:t>signed Δ_c</w:t>
+            </w:r>
+          </w:p>
+        </w:tc>
+        <w:tc>
+          <w:tcPr>
+            <w:tcW w:type="dxa" w:w="1728"/>
+          </w:tcPr>
+          <w:p>
+            <w:r>
+              <w:rPr>
+                <w:b/>
+              </w:rPr>
+              <w:t>edge operator</w:t>
+            </w:r>
+          </w:p>
+        </w:tc>
+        <w:tc>
+          <w:tcPr>
+            <w:tcW w:type="dxa" w:w="1728"/>
+          </w:tcPr>
+          <w:p>
+            <w:r>
+              <w:rPr>
+                <w:b/>
+              </w:rPr>
+              <w:t>φ_e</w:t>
+            </w:r>
+          </w:p>
+        </w:tc>
+        <w:tc>
+          <w:tcPr>
+            <w:tcW w:type="dxa" w:w="1728"/>
+          </w:tcPr>
+          <w:p>
+            <w:r>
+              <w:rPr>
+                <w:b/>
+              </w:rPr>
+              <w:t>endpoint contribution</w:t>
+            </w:r>
+          </w:p>
+        </w:tc>
+      </w:tr>
+      <w:tr>
+        <w:tc>
+          <w:tcPr>
+            <w:tcW w:type="dxa" w:w="1728"/>
+          </w:tcPr>
+          <w:p>
+            <w:r>
+              <w:t>Delegation/assignment</w:t>
+            </w:r>
+          </w:p>
+        </w:tc>
+        <w:tc>
+          <w:tcPr>
+            <w:tcW w:type="dxa" w:w="1728"/>
+          </w:tcPr>
+          <w:p>
+            <w:r>
+              <w:t>+0.15</w:t>
+            </w:r>
+          </w:p>
+        </w:tc>
+        <w:tc>
+          <w:tcPr>
+            <w:tcW w:type="dxa" w:w="1728"/>
+          </w:tcPr>
+          <w:p>
+            <w:r>
+              <w:t>AMPLIFY</w:t>
+            </w:r>
+          </w:p>
+        </w:tc>
+        <w:tc>
+          <w:tcPr>
+            <w:tcW w:type="dxa" w:w="1728"/>
+          </w:tcPr>
+          <w:p>
+            <w:r>
+              <w:t>1.6</w:t>
+            </w:r>
+          </w:p>
+        </w:tc>
+        <w:tc>
+          <w:tcPr>
+            <w:tcW w:type="dxa" w:w="1728"/>
+          </w:tcPr>
+          <w:p>
+            <w:r>
+              <w:t>0.24</w:t>
+            </w:r>
+          </w:p>
+        </w:tc>
+      </w:tr>
+      <w:tr>
+        <w:tc>
+          <w:tcPr>
+            <w:tcW w:type="dxa" w:w="1728"/>
+          </w:tcPr>
+          <w:p>
+            <w:r>
+              <w:rPr>
+                <w:b/>
+              </w:rPr>
+              <w:t>Endpoint Δ_τ</w:t>
+            </w:r>
+          </w:p>
+        </w:tc>
+        <w:tc>
+          <w:tcPr>
+            <w:tcW w:type="dxa" w:w="1728"/>
+          </w:tcPr>
+          <w:p/>
+        </w:tc>
+        <w:tc>
+          <w:tcPr>
+            <w:tcW w:type="dxa" w:w="1728"/>
+          </w:tcPr>
+          <w:p/>
+        </w:tc>
+        <w:tc>
+          <w:tcPr>
+            <w:tcW w:type="dxa" w:w="1728"/>
+          </w:tcPr>
+          <w:p/>
+        </w:tc>
+        <w:tc>
+          <w:tcPr>
+            <w:tcW w:type="dxa" w:w="1728"/>
+          </w:tcPr>
+          <w:p>
+            <w:r>
+              <w:rPr>
+                <w:b/>
+              </w:rPr>
+              <w:t>≈ 0.24</w:t>
+            </w:r>
+            <w:r>
+              <w:t xml:space="preserve"> (&gt; Σ\</w:t>
+            </w:r>
+          </w:p>
+        </w:tc>
+      </w:tr>
+    </w:tbl>
+    <w:p/>
+    <w:p>
+      <w:r>
+        <w:t>Here the trajectory disparity is larger than anything visible by summing component magnitudes, because an AMPLIFY (or GENERATE) edge on the conduction path multiplies the locus's contribution: the agentic multiplier of P3. We stress again that the 0.20, 0.24, 0.15, and φ values are illustrative placeholders chosen to expose the operators, not estimates from any run.</w:t>
+      </w:r>
+    </w:p>
+    <w:p>
       <w:pPr>
         <w:pStyle w:val="Heading1"/>
       </w:pPr>
@@ -8062,7 +8523,7 @@
         <w:t>Tension T1 (non-compositionality: per-step fairness does not compose).</w:t>
       </w:r>
       <w:r>
-        <w:t xml:space="preserve"> An agent trajectory is a sequence of decision points, each formally subject to the classical impossibility. But satisfying a chosen criterion at every step does not deliver that criterion at the terminal decision, because each intermediate action reshapes the population reaching subsequent steps: the "base rates" at step $k$ are endogenous to the policy at steps $1, \dots, k-1$. This is the sequential-screening analogue of the fair-sequential-decision results: [hu2022achieving] show static per-step constraints fail to deliver long-term fairness, and [xu2024adapting] show naive transfer of one-shot criteria can </w:t>
+        <w:t xml:space="preserve"> An agent trajectory is a sequence of decision points, each formally subject to the classical impossibility. But satisfying a chosen criterion at every step does not deliver that criterion at the terminal decision, because each intermediate action reshapes the population reaching subsequent steps: the "base rates" at step $k$ are endogenous to the policy at steps $1, \dots, k-1$. The sequential-screening analogue of the fair-sequential-decision results is instructive here: [hu2022achieving] show static per-step constraints fail to deliver long-term fairness, and [xu2024adapting] show naive transfer of one-shot criteria can </w:t>
       </w:r>
       <w:r>
         <w:rPr>
@@ -8280,7 +8741,7 @@
     </w:p>
     <w:p>
       <w:r>
-        <w:t>classifying the edge as attenuating ($\hat{\varphi}_e &lt; 1$), preserving ($\hat{\varphi}_e \approx 1$), or amplifying ($\hat{\varphi}_e &gt; 1$); the GENERATE case is diagnosed when $\Delta_c \approx 0$ at every upstream locus yet $\Delta_{c'} &gt; 0$. This turns the BCF's operator taxonomy from a descriptive vocabulary into a measurable quantity, and it is the estimator the audit protocol of §6 is designed to compute (the §6.5 pilot reports endpoint metrics only; these paired/interior estimates await the full study).</w:t>
+        <w:t>classifying the edge as attenuating ($\hat{\varphi}_e &lt; 1$), preserving ($\hat{\varphi}_e \approx 1$), or amplifying ($\hat{\varphi}_e &gt; 1$); the GENERATE case is diagnosed when $\Delta_c \approx 0$ at every upstream locus yet $\Delta_{c'} &gt; 0$. This turns the BCF's operator taxonomy from a descriptive vocabulary into a measurable quantity, and it is the estimator the audit protocol of §6 is designed to compute (not estimated in the pilot; see §6.5).</w:t>
       </w:r>
     </w:p>
     <w:p>
@@ -10868,7 +11329,7 @@
     </w:p>
     <w:p>
       <w:r>
-        <w:t>The shared limitation of all training-time methods under P4 is that they act on the model's weight distribution, not on the agent's action-selection architecture. Once the aligned base model is embedded in a tool-using or multi-agent pipeline, the alignment signal does not propagate to: (a) the tool-selection policy, which is a discrete routing choice conditioning on tool metadata that the reward model never observed; (b) the retrieval-stage embedding that ranks candidate documents; or (c) the role-assignment protocol in a multi-agent orchestrator. The aggregate reward signal, summed across a full trajectory, cannot distinguish between a bias introduced at the planning step and one introduced at tool invocation; targeted correction of specific pipeline loci is invisible at training time. This is the BCF's component-locality principle (P1): a weight-level intervention has Δ\_c = 0 at every non-model locus.</w:t>
+        <w:t>The shared limitation of all training-time methods under P4 is that they act on the model's weight distribution, not on the agent's action-selection architecture. Once the aligned base model is embedded in a tool-using or multi-agent pipeline, the alignment signal does not propagate to: (a) the tool-selection policy, which is a discrete routing choice conditioning on tool metadata that the reward model never observed; (b) the retrieval-stage embedding that ranks candidate documents; or (c) the role-assignment protocol in a multi-agent orchestrator. The aggregate reward signal, summed across a full trajectory, cannot distinguish between a bias introduced at the planning step and one introduced at tool invocation; targeted correction of specific pipeline loci is invisible at training time. P1's component-locality principle captures this precisely: a weight-level intervention has Δ\_c = 0 at every non-model locus.</w:t>
       </w:r>
     </w:p>
     <w:p>
@@ -13150,7 +13611,7 @@
         <w:t>Agent configurations.</w:t>
       </w:r>
       <w:r>
-        <w:t xml:space="preserve"> The independent variable is architecture; base model, prompt scaffold, and decision rubric are held constant across all four conditions. Models are version-pinned and temperature is fixed at zero.</w:t>
+        <w:t xml:space="preserve"> The independent variable is architecture; base model, prompt scaffold, and decision rubric are held constant across all four conditions. Models are version-pinned and temperature is fixed at zero. These configurations C0 to C3 are the audit's independent variable and are distinct from the §3.8 worked-example capability rungs of the same name.</w:t>
       </w:r>
     </w:p>
     <w:tbl>
@@ -13837,7 +14298,7 @@
     </w:p>
     <w:p>
       <w:r>
-        <w:t>Two patterns appear, both consistent with the framework and both heavily qualified below. First, decision-level parity masks score-level disparity: no candidate's advance-or-reject decision flips under the demographic swap (CFR = 0 in every configuration) and the advance-rate disparity is zero, yet the mean absolute score difference is nonzero throughout. This is the configuration P2 (Masking) describes, an endpoint-level analogue of P2: a coarse decision statistic masks a finer score-level disparity at the same output node; demonstrating the interior Δ_c awaits the full study. Second, the score-level disparity rises with agentic scaffolding, from 1.2 (C0) to 3.4 (C2) to 6.4 (C3), the direction predicted by P3 (Super-additivity) and stated in advance in §6.3, with the two-agent deliberation showing the largest disparity.</w:t>
+        <w:t>Two patterns appear, both consistent with the framework and both heavily qualified below. First, decision-level parity masks score-level disparity: no candidate's advance-or-reject decision flips under the demographic swap (CFR = 0 in every configuration) and the advance-rate disparity is zero, yet the mean absolute score difference is nonzero throughout. P2 (Masking) describes exactly this configuration, an endpoint-level analogue of P2: a coarse decision statistic masks a finer score-level disparity at the same output node; demonstrating the interior Δ_c awaits the full study. Second, the score-level disparity rises with agentic scaffolding, from 1.2 (C0) to 3.4 (C2) to 6.4 (C3), the direction predicted by P3 (Super-additivity) and stated in advance in §6.3, with the two-agent deliberation showing the largest disparity.</w:t>
       </w:r>
     </w:p>
     <w:p>
@@ -13945,6 +14406,416 @@
     </w:p>
     <w:p>
       <w:r>
+        <w:rPr>
+          <w:b/>
+        </w:rPr>
+        <w:t>Figure 2: Coverage matrix (agent component × fairness dimension).</w:t>
+      </w:r>
+    </w:p>
+    <w:tbl>
+      <w:tblPr>
+        <w:tblStyle w:val="LightGrid-Accent1"/>
+        <w:tblW w:type="auto" w:w="0"/>
+        <w:tblLook w:firstColumn="1" w:firstRow="1" w:lastColumn="0" w:lastRow="0" w:noHBand="0" w:noVBand="1" w:val="04A0"/>
+      </w:tblPr>
+      <w:tblGrid>
+        <w:gridCol w:w="1728"/>
+        <w:gridCol w:w="1728"/>
+        <w:gridCol w:w="1728"/>
+        <w:gridCol w:w="1728"/>
+        <w:gridCol w:w="1728"/>
+      </w:tblGrid>
+      <w:tr>
+        <w:tc>
+          <w:tcPr>
+            <w:tcW w:type="dxa" w:w="1728"/>
+          </w:tcPr>
+          <w:p>
+            <w:r>
+              <w:rPr>
+                <w:b/>
+              </w:rPr>
+              <w:t>Component</w:t>
+            </w:r>
+          </w:p>
+        </w:tc>
+        <w:tc>
+          <w:tcPr>
+            <w:tcW w:type="dxa" w:w="1728"/>
+          </w:tcPr>
+          <w:p>
+            <w:r>
+              <w:rPr>
+                <w:b/>
+              </w:rPr>
+              <w:t>group</w:t>
+            </w:r>
+          </w:p>
+        </w:tc>
+        <w:tc>
+          <w:tcPr>
+            <w:tcW w:type="dxa" w:w="1728"/>
+          </w:tcPr>
+          <w:p>
+            <w:r>
+              <w:rPr>
+                <w:b/>
+              </w:rPr>
+              <w:t>individual</w:t>
+            </w:r>
+          </w:p>
+        </w:tc>
+        <w:tc>
+          <w:tcPr>
+            <w:tcW w:type="dxa" w:w="1728"/>
+          </w:tcPr>
+          <w:p>
+            <w:r>
+              <w:rPr>
+                <w:b/>
+              </w:rPr>
+              <w:t>counterfactual</w:t>
+            </w:r>
+          </w:p>
+        </w:tc>
+        <w:tc>
+          <w:tcPr>
+            <w:tcW w:type="dxa" w:w="1728"/>
+          </w:tcPr>
+          <w:p>
+            <w:r>
+              <w:rPr>
+                <w:b/>
+              </w:rPr>
+              <w:t>unspecified</w:t>
+            </w:r>
+          </w:p>
+        </w:tc>
+      </w:tr>
+      <w:tr>
+        <w:tc>
+          <w:tcPr>
+            <w:tcW w:type="dxa" w:w="1728"/>
+          </w:tcPr>
+          <w:p>
+            <w:r>
+              <w:t>Tool / API selection</w:t>
+            </w:r>
+          </w:p>
+        </w:tc>
+        <w:tc>
+          <w:tcPr>
+            <w:tcW w:type="dxa" w:w="1728"/>
+          </w:tcPr>
+          <w:p>
+            <w:r>
+              <w:t>1</w:t>
+            </w:r>
+          </w:p>
+        </w:tc>
+        <w:tc>
+          <w:tcPr>
+            <w:tcW w:type="dxa" w:w="1728"/>
+          </w:tcPr>
+          <w:p>
+            <w:r>
+              <w:t>0</w:t>
+            </w:r>
+          </w:p>
+        </w:tc>
+        <w:tc>
+          <w:tcPr>
+            <w:tcW w:type="dxa" w:w="1728"/>
+          </w:tcPr>
+          <w:p>
+            <w:r>
+              <w:t>0</w:t>
+            </w:r>
+          </w:p>
+        </w:tc>
+        <w:tc>
+          <w:tcPr>
+            <w:tcW w:type="dxa" w:w="1728"/>
+          </w:tcPr>
+          <w:p>
+            <w:r>
+              <w:t>11</w:t>
+            </w:r>
+          </w:p>
+        </w:tc>
+      </w:tr>
+      <w:tr>
+        <w:tc>
+          <w:tcPr>
+            <w:tcW w:type="dxa" w:w="1728"/>
+          </w:tcPr>
+          <w:p>
+            <w:r>
+              <w:t>Memory &amp; retrieval</w:t>
+            </w:r>
+          </w:p>
+        </w:tc>
+        <w:tc>
+          <w:tcPr>
+            <w:tcW w:type="dxa" w:w="1728"/>
+          </w:tcPr>
+          <w:p>
+            <w:r>
+              <w:t>0</w:t>
+            </w:r>
+          </w:p>
+        </w:tc>
+        <w:tc>
+          <w:tcPr>
+            <w:tcW w:type="dxa" w:w="1728"/>
+          </w:tcPr>
+          <w:p>
+            <w:r>
+              <w:t>0</w:t>
+            </w:r>
+          </w:p>
+        </w:tc>
+        <w:tc>
+          <w:tcPr>
+            <w:tcW w:type="dxa" w:w="1728"/>
+          </w:tcPr>
+          <w:p>
+            <w:r>
+              <w:t>0</w:t>
+            </w:r>
+          </w:p>
+        </w:tc>
+        <w:tc>
+          <w:tcPr>
+            <w:tcW w:type="dxa" w:w="1728"/>
+          </w:tcPr>
+          <w:p>
+            <w:r>
+              <w:t>12</w:t>
+            </w:r>
+          </w:p>
+        </w:tc>
+      </w:tr>
+      <w:tr>
+        <w:tc>
+          <w:tcPr>
+            <w:tcW w:type="dxa" w:w="1728"/>
+          </w:tcPr>
+          <w:p>
+            <w:r>
+              <w:t>Multi-agent delegation</w:t>
+            </w:r>
+          </w:p>
+        </w:tc>
+        <w:tc>
+          <w:tcPr>
+            <w:tcW w:type="dxa" w:w="1728"/>
+          </w:tcPr>
+          <w:p>
+            <w:r>
+              <w:t>5</w:t>
+            </w:r>
+          </w:p>
+        </w:tc>
+        <w:tc>
+          <w:tcPr>
+            <w:tcW w:type="dxa" w:w="1728"/>
+          </w:tcPr>
+          <w:p>
+            <w:r>
+              <w:t>1</w:t>
+            </w:r>
+          </w:p>
+        </w:tc>
+        <w:tc>
+          <w:tcPr>
+            <w:tcW w:type="dxa" w:w="1728"/>
+          </w:tcPr>
+          <w:p>
+            <w:r>
+              <w:t>0</w:t>
+            </w:r>
+          </w:p>
+        </w:tc>
+        <w:tc>
+          <w:tcPr>
+            <w:tcW w:type="dxa" w:w="1728"/>
+          </w:tcPr>
+          <w:p>
+            <w:r>
+              <w:t>6</w:t>
+            </w:r>
+          </w:p>
+        </w:tc>
+      </w:tr>
+      <w:tr>
+        <w:tc>
+          <w:tcPr>
+            <w:tcW w:type="dxa" w:w="1728"/>
+          </w:tcPr>
+          <w:p>
+            <w:r>
+              <w:t>Planning / decomposition</w:t>
+            </w:r>
+          </w:p>
+        </w:tc>
+        <w:tc>
+          <w:tcPr>
+            <w:tcW w:type="dxa" w:w="1728"/>
+          </w:tcPr>
+          <w:p>
+            <w:r>
+              <w:t>4</w:t>
+            </w:r>
+          </w:p>
+        </w:tc>
+        <w:tc>
+          <w:tcPr>
+            <w:tcW w:type="dxa" w:w="1728"/>
+          </w:tcPr>
+          <w:p>
+            <w:r>
+              <w:t>1</w:t>
+            </w:r>
+          </w:p>
+        </w:tc>
+        <w:tc>
+          <w:tcPr>
+            <w:tcW w:type="dxa" w:w="1728"/>
+          </w:tcPr>
+          <w:p>
+            <w:r>
+              <w:t>0</w:t>
+            </w:r>
+          </w:p>
+        </w:tc>
+        <w:tc>
+          <w:tcPr>
+            <w:tcW w:type="dxa" w:w="1728"/>
+          </w:tcPr>
+          <w:p>
+            <w:r>
+              <w:t>5</w:t>
+            </w:r>
+          </w:p>
+        </w:tc>
+      </w:tr>
+      <w:tr>
+        <w:tc>
+          <w:tcPr>
+            <w:tcW w:type="dxa" w:w="1728"/>
+          </w:tcPr>
+          <w:p>
+            <w:r>
+              <w:t>User modeling / personalization</w:t>
+            </w:r>
+          </w:p>
+        </w:tc>
+        <w:tc>
+          <w:tcPr>
+            <w:tcW w:type="dxa" w:w="1728"/>
+          </w:tcPr>
+          <w:p>
+            <w:r>
+              <w:t>1</w:t>
+            </w:r>
+          </w:p>
+        </w:tc>
+        <w:tc>
+          <w:tcPr>
+            <w:tcW w:type="dxa" w:w="1728"/>
+          </w:tcPr>
+          <w:p>
+            <w:r>
+              <w:t>0</w:t>
+            </w:r>
+          </w:p>
+        </w:tc>
+        <w:tc>
+          <w:tcPr>
+            <w:tcW w:type="dxa" w:w="1728"/>
+          </w:tcPr>
+          <w:p>
+            <w:r>
+              <w:t>0</w:t>
+            </w:r>
+          </w:p>
+        </w:tc>
+        <w:tc>
+          <w:tcPr>
+            <w:tcW w:type="dxa" w:w="1728"/>
+          </w:tcPr>
+          <w:p>
+            <w:r>
+              <w:t>11</w:t>
+            </w:r>
+          </w:p>
+        </w:tc>
+      </w:tr>
+      <w:tr>
+        <w:tc>
+          <w:tcPr>
+            <w:tcW w:type="dxa" w:w="1728"/>
+          </w:tcPr>
+          <w:p>
+            <w:r>
+              <w:t>Long-horizon drift</w:t>
+            </w:r>
+          </w:p>
+        </w:tc>
+        <w:tc>
+          <w:tcPr>
+            <w:tcW w:type="dxa" w:w="1728"/>
+          </w:tcPr>
+          <w:p>
+            <w:r>
+              <w:t>2</w:t>
+            </w:r>
+          </w:p>
+        </w:tc>
+        <w:tc>
+          <w:tcPr>
+            <w:tcW w:type="dxa" w:w="1728"/>
+          </w:tcPr>
+          <w:p>
+            <w:r>
+              <w:t>0</w:t>
+            </w:r>
+          </w:p>
+        </w:tc>
+        <w:tc>
+          <w:tcPr>
+            <w:tcW w:type="dxa" w:w="1728"/>
+          </w:tcPr>
+          <w:p>
+            <w:r>
+              <w:t>1</w:t>
+            </w:r>
+          </w:p>
+        </w:tc>
+        <w:tc>
+          <w:tcPr>
+            <w:tcW w:type="dxa" w:w="1728"/>
+          </w:tcPr>
+          <w:p>
+            <w:r>
+              <w:t>7</w:t>
+            </w:r>
+          </w:p>
+        </w:tc>
+      </w:tr>
+    </w:tbl>
+    <w:p/>
+    <w:p>
+      <w:r>
+        <w:rPr>
+          <w:i/>
+        </w:rPr>
+        <w:t>Takeaway: the counterfactual column is near-empty, holding exactly one entry (she2025fairsense) across all six components, while 52 of the 68 component-branch entries fall in the unspecified column.</w:t>
+      </w:r>
+    </w:p>
+    <w:p>
+      <w:r>
         <w:t xml:space="preserve">This is a structural inversion of need. The counterfactual flip (re-running the same agent on a profile altered only in a protected attribute and asking whether the trajectory changed) is the natural operationalization of the agentic fairness question: "would the agent have </w:t>
       </w:r>
       <w:r>
@@ -13954,7 +14825,7 @@
         <w:t>acted</w:t>
       </w:r>
       <w:r>
-        <w:t xml:space="preserve"> differently for another demographic?" Group-level metrics, computed over output distributions, cannot directly answer this. Counterfactual flip can. In BCF terms, the counterfactual swap is the procedure that produces D2's Δ_c, the component counterfactual disparity that enters the conduction equation. The dimension that BCF-based auditing most requires is precisely the dimension the field has least applied.</w:t>
+        <w:t xml:space="preserve"> differently for another demographic?" Group-level metrics, computed over output distributions, cannot directly answer this. Counterfactual flip can. In BCF terms, the counterfactual swap is the procedure that produces D2's Δ_c, the component counterfactual disparity that enters the conduction equation. The dimension that BCF-based auditing most requires is precisely the dimension the field has least applied. The point is not weakened by the lone exemplar: even that single counterfactual entry, [she2025fairsense], is itself adjacent and non-agentic (marked [†] in §3.6, a generic ML-system drift simulator never applied to an instrumented LLM-agent trajectory), so the counterfactual column is empty of properly agentic counterfactual auditing rather than holding a genuine exception.</w:t>
       </w:r>
     </w:p>
     <w:p>
@@ -14593,7 +15464,7 @@
         <w:t>GENERATE</w:t>
       </w:r>
       <w:r>
-        <w:t xml:space="preserve"> operator (disparity arising at a pipeline edge from nominally unbiased inputs, the formal signature of the agentic multiplier in P3) has been documented in only a handful of papers. For multi-agent delegation, [nguyen2025social] and [madigan2025emergent] provide the clearest evidence of generation (bias emerging in interaction among individually measured-to-be-unbiased agents); for tool selection, [blankenstein2025biasbusters] documents the selection-skew signature from tool-description surface features alone (the closest single-locus instance, distinct from the amplification [ma2026implicit] documents in the memory accumulation process). Outside these, the GENERATE column is largely empty. This is the empirical frontier the audit of §6 is designed to probe.</w:t>
+        <w:t xml:space="preserve"> operator (disparity arising at a pipeline edge from nominally unbiased inputs, the formal signature of the agentic multiplier in P3) has been documented in only a handful of papers. For multi-agent delegation, [nguyen2025social] and [madigan2025emergent] provide the clearest evidence of generation (bias emerging in interaction among individually measured-to-be-unbiased agents); for tool selection, [blankenstein2025biasbusters] documents the selection-skew signature from tool-description surface features alone (the closest single-locus instance, distinct from the amplification [ma2026implicit] documents in the memory accumulation process). Outside these, the GENERATE column is largely empty. The audit of §6 is designed to probe this empirical frontier.</w:t>
       </w:r>
     </w:p>
     <w:p>
@@ -14874,7 +15745,7 @@
         <w:t>BCF coordinate.</w:t>
       </w:r>
       <w:r>
-        <w:t xml:space="preserve"> BCF D2 defines Δ_c as a counterfactual disparity over a single protected attribute; real deployment harms are intersectional (jointly over multiple attributes) and sociotechnical (conditioned on deployment context, not just model parameters). This is a D2 extension problem: the current formalization is a first-order approximation.</w:t>
+        <w:t xml:space="preserve"> BCF D2 defines Δ_c as a counterfactual disparity over a single protected attribute; real deployment harms are intersectional (jointly over multiple attributes) and sociotechnical (conditioned on deployment context and model parameters together). This is a D2 extension problem: the current formalization is a first-order approximation.</w:t>
       </w:r>
     </w:p>
     <w:p>
@@ -15090,7 +15961,7 @@
     </w:p>
     <w:p>
       <w:r>
-        <w:t>The BCF's conduction-operator vocabulary (identifying which pipeline edges are AMPLIFY or GENERATE loci, and which mitigation interventions reduce φ_e at each edge) is designed as an auditor's instrument. The same information can be used adversarially: knowing that tool-description metadata is a GENERATE locus [sneh2025tooltweak] could guide an actor who wishes to steer an agent's routing by manipulating tool descriptions rather than inputs. By the same logic, the fact that memory-accumulation is an AMPLIFY locus could inform the design of retrieval-store poisoning attacks [wang2025bias] calibrated to exploit that amplification. The survey discloses these mechanisms because responsible auditing requires understanding them; the disclosure is not an operational guide for exploitation. We recommend that practitioners who use the BCF framework as an audit template also consult it as an adversarial-risk checklist, evaluating deployed agents not only for inadvertent bias but also for susceptibility to targeted disparity injection at the loci this taxonomy identifies.</w:t>
+        <w:t>The BCF's conduction-operator vocabulary (identifying which pipeline edges are AMPLIFY or GENERATE loci, and which mitigation interventions reduce φ_e at each edge) is designed as an auditor's instrument. The same information can be used adversarially: knowing that tool-description metadata is a GENERATE locus [sneh2025tooltweak] could guide an actor who wishes to steer an agent's routing by manipulating tool descriptions rather than inputs. By the same logic, the fact that memory-accumulation is an AMPLIFY locus could inform the design of retrieval-store poisoning attacks [wang2025bias] calibrated to exploit that amplification. The survey discloses these mechanisms because responsible auditing requires understanding them; the disclosure is not an operational guide for exploitation. We recommend that practitioners who use the BCF framework as an audit template also consult it as an adversarial-risk checklist, evaluating deployed agents for inadvertent bias and for susceptibility to targeted disparity injection at the loci this taxonomy identifies.</w:t>
       </w:r>
     </w:p>
     <w:p>

</xml_diff>